<commit_message>
Kit de venta v2: portada sin \n literal, seccion 1 compactada en 2 hojas (sin pagina medio vacia)
Co-Authored-By: Claude Fable 5 <noreply@anthropic.com>
Claude-Session: https://claude.ai/code/session_018H7C5dx3NvDfXiv3CfhPMa
</commit_message>
<xml_diff>
--- a/recursos/comercial/INDUCCION_COMERCIAL/KIT_DE_VENTA_ASESORAS.docx
+++ b/recursos/comercial/INDUCCION_COMERCIAL/KIT_DE_VENTA_ASESORAS.docx
@@ -42,7 +42,19 @@
           <w:color w:val="222222"/>
           <w:sz w:val="26"/>
         </w:rPr>
-        <w:t>Manual de la Asesora Comercial · Septiembre 2026\nTodo lo que necesitas para una cita completa está en este documento.</w:t>
+        <w:t>Manual de la Asesora Comercial · Septiembre 2026</w:t>
+      </w:r>
+    </w:p>
+    <w:p>
+      <w:pPr>
+        <w:jc w:val="center"/>
+      </w:pPr>
+      <w:r>
+        <w:rPr>
+          <w:color w:val="222222"/>
+          <w:sz w:val="26"/>
+        </w:rPr>
+        <w:t>Todo lo que necesitas para una cita completa está en este documento.</w:t>
       </w:r>
     </w:p>
     <w:p>
@@ -65,20 +77,20 @@
     </w:p>
     <w:p>
       <w:pPr>
-        <w:spacing w:before="200" w:after="80"/>
+        <w:spacing w:before="140" w:after="60"/>
       </w:pPr>
       <w:r>
         <w:rPr>
           <w:b/>
           <w:color w:val="222222"/>
-          <w:sz w:val="28"/>
+          <w:sz w:val="27"/>
         </w:rPr>
         <w:t>La regla de oro</w:t>
       </w:r>
     </w:p>
     <w:p>
       <w:pPr>
-        <w:spacing w:after="120"/>
+        <w:spacing w:after="60"/>
       </w:pPr>
       <w:r>
         <w:rPr>
@@ -90,7 +102,7 @@
     </w:p>
     <w:p>
       <w:pPr>
-        <w:spacing w:after="120"/>
+        <w:spacing w:after="60"/>
       </w:pPr>
       <w:r>
         <w:rPr>
@@ -102,7 +114,7 @@
     </w:p>
     <w:p>
       <w:pPr>
-        <w:spacing w:after="120"/>
+        <w:spacing w:after="60"/>
       </w:pPr>
       <w:r>
         <w:rPr>
@@ -114,7 +126,7 @@
     </w:p>
     <w:p>
       <w:pPr>
-        <w:spacing w:after="120"/>
+        <w:spacing w:after="60"/>
       </w:pPr>
       <w:r>
         <w:rPr>
@@ -143,7 +155,7 @@
             <w:r>
               <w:rPr>
                 <w:i/>
-                <w:sz w:val="26"/>
+                <w:sz w:val="25"/>
               </w:rPr>
               <w:t>"Lo voy a pensar" NO es una salida. El que sale a pensarlo, casi nunca vuelve.</w:t>
             </w:r>
@@ -153,18 +165,23 @@
     </w:tbl>
     <w:p>
       <w:pPr>
-        <w:spacing w:after="40"/>
+        <w:spacing w:after="0" w:before="0"/>
       </w:pPr>
+      <w:r>
+        <w:rPr>
+          <w:sz w:val="8"/>
+        </w:rPr>
+      </w:r>
     </w:p>
     <w:p>
       <w:pPr>
-        <w:spacing w:before="200" w:after="80"/>
+        <w:spacing w:before="140" w:after="60"/>
       </w:pPr>
       <w:r>
         <w:rPr>
           <w:b/>
           <w:color w:val="222222"/>
-          <w:sz w:val="28"/>
+          <w:sz w:val="27"/>
         </w:rPr>
         <w:t>La primera pregunta (siempre)</w:t>
       </w:r>
@@ -188,7 +205,7 @@
             <w:r>
               <w:rPr>
                 <w:i/>
-                <w:sz w:val="26"/>
+                <w:sz w:val="25"/>
               </w:rPr>
               <w:t>"¿Has estudiado inglés antes? ¿Puedes tener una conversación básica?"</w:t>
             </w:r>
@@ -198,8 +215,13 @@
     </w:tbl>
     <w:p>
       <w:pPr>
-        <w:spacing w:after="40"/>
+        <w:spacing w:after="0" w:before="0"/>
       </w:pPr>
+      <w:r>
+        <w:rPr>
+          <w:sz w:val="8"/>
+        </w:rPr>
+      </w:r>
     </w:p>
     <w:tbl>
       <w:tblPr>
@@ -304,18 +326,23 @@
     </w:tbl>
     <w:p>
       <w:pPr>
-        <w:spacing w:after="40"/>
+        <w:spacing w:after="0"/>
       </w:pPr>
+      <w:r>
+        <w:rPr>
+          <w:sz w:val="8"/>
+        </w:rPr>
+      </w:r>
     </w:p>
     <w:p>
       <w:pPr>
-        <w:spacing w:before="200" w:after="80"/>
+        <w:spacing w:before="140" w:after="60"/>
       </w:pPr>
       <w:r>
         <w:rPr>
           <w:b/>
           <w:color w:val="222222"/>
-          <w:sz w:val="28"/>
+          <w:sz w:val="27"/>
         </w:rPr>
         <w:t>Los dos productos (solo muestras DOS números por cliente)</w:t>
       </w:r>
@@ -423,18 +450,23 @@
     </w:tbl>
     <w:p>
       <w:pPr>
-        <w:spacing w:after="40"/>
+        <w:spacing w:after="0"/>
       </w:pPr>
+      <w:r>
+        <w:rPr>
+          <w:sz w:val="8"/>
+        </w:rPr>
+      </w:r>
     </w:p>
     <w:p>
       <w:pPr>
-        <w:spacing w:before="200" w:after="80"/>
+        <w:spacing w:before="140" w:after="60"/>
       </w:pPr>
       <w:r>
         <w:rPr>
           <w:b/>
           <w:color w:val="222222"/>
-          <w:sz w:val="28"/>
+          <w:sz w:val="27"/>
         </w:rPr>
         <w:t>El cierre doble (tu mejor jugada — las dos respuestas son SÍ)</w:t>
       </w:r>
@@ -458,7 +490,7 @@
             <w:r>
               <w:rPr>
                 <w:i/>
-                <w:sz w:val="26"/>
+                <w:sz w:val="25"/>
               </w:rPr>
               <w:t>"Tienes dos caminos: arrancas con A1+A2 por $2.990.000 y decides después — o te comprometes hoy con el programa completo: con tu beca queda en [tarjeta], sales con B2 y te ahorras más de un millón. ¿Cuál te hago?"</w:t>
             </w:r>
@@ -468,8 +500,13 @@
     </w:tbl>
     <w:p>
       <w:pPr>
-        <w:spacing w:after="40"/>
+        <w:spacing w:after="0" w:before="0"/>
       </w:pPr>
+      <w:r>
+        <w:rPr>
+          <w:sz w:val="8"/>
+        </w:rPr>
+      </w:r>
     </w:p>
     <w:tbl>
       <w:tblPr>
@@ -490,7 +527,7 @@
             <w:r>
               <w:rPr>
                 <w:i/>
-                <w:sz w:val="26"/>
+                <w:sz w:val="25"/>
               </w:rPr>
               <w:t>"El Arranque monta tu negocio; el programa completo te enseña a DEFENDERLO en inglés."</w:t>
             </w:r>
@@ -500,30 +537,30 @@
     </w:tbl>
     <w:p>
       <w:pPr>
-        <w:spacing w:after="40"/>
+        <w:spacing w:after="0" w:before="0"/>
       </w:pPr>
-    </w:p>
-    <w:p>
       <w:r>
-        <w:br w:type="page"/>
+        <w:rPr>
+          <w:sz w:val="8"/>
+        </w:rPr>
       </w:r>
     </w:p>
     <w:p>
       <w:pPr>
-        <w:spacing w:before="200" w:after="80"/>
+        <w:spacing w:before="140" w:after="60"/>
       </w:pPr>
       <w:r>
         <w:rPr>
           <w:b/>
           <w:color w:val="222222"/>
-          <w:sz w:val="28"/>
+          <w:sz w:val="27"/>
         </w:rPr>
         <w:t>Las 3 anclas (úsalas en TODA cita)</w:t>
       </w:r>
     </w:p>
     <w:p>
       <w:pPr>
-        <w:spacing w:after="120"/>
+        <w:spacing w:after="60"/>
       </w:pPr>
       <w:r>
         <w:rPr>
@@ -535,7 +572,7 @@
     </w:p>
     <w:p>
       <w:pPr>
-        <w:spacing w:after="120"/>
+        <w:spacing w:after="60"/>
       </w:pPr>
       <w:r>
         <w:rPr>
@@ -547,7 +584,7 @@
     </w:p>
     <w:p>
       <w:pPr>
-        <w:spacing w:after="120"/>
+        <w:spacing w:after="60"/>
       </w:pPr>
       <w:r>
         <w:rPr>
@@ -559,20 +596,20 @@
     </w:p>
     <w:p>
       <w:pPr>
-        <w:spacing w:before="200" w:after="80"/>
+        <w:spacing w:before="140" w:after="60"/>
       </w:pPr>
       <w:r>
         <w:rPr>
           <w:b/>
           <w:color w:val="222222"/>
-          <w:sz w:val="28"/>
+          <w:sz w:val="27"/>
         </w:rPr>
         <w:t>Para cerrar (elige UNA frase y guarda silencio)</w:t>
       </w:r>
     </w:p>
     <w:p>
       <w:pPr>
-        <w:spacing w:after="120"/>
+        <w:spacing w:after="60"/>
       </w:pPr>
       <w:r>
         <w:rPr>
@@ -584,7 +621,7 @@
     </w:p>
     <w:p>
       <w:pPr>
-        <w:spacing w:after="120"/>
+        <w:spacing w:after="60"/>
       </w:pPr>
       <w:r>
         <w:rPr>
@@ -596,7 +633,7 @@
     </w:p>
     <w:p>
       <w:pPr>
-        <w:spacing w:after="120"/>
+        <w:spacing w:after="60"/>
       </w:pPr>
       <w:r>
         <w:rPr>
@@ -608,7 +645,7 @@
     </w:p>
     <w:p>
       <w:pPr>
-        <w:spacing w:after="120"/>
+        <w:spacing w:after="60"/>
       </w:pPr>
       <w:r>
         <w:rPr>
@@ -637,7 +674,7 @@
             <w:r>
               <w:rPr>
                 <w:i/>
-                <w:sz w:val="26"/>
+                <w:sz w:val="25"/>
               </w:rPr>
               <w:t>Después de la frase de cierre: SILENCIO. El primero que habla, concede.</w:t>
             </w:r>
@@ -647,18 +684,23 @@
     </w:tbl>
     <w:p>
       <w:pPr>
-        <w:spacing w:after="40"/>
+        <w:spacing w:after="0" w:before="0"/>
       </w:pPr>
+      <w:r>
+        <w:rPr>
+          <w:sz w:val="8"/>
+        </w:rPr>
+      </w:r>
     </w:p>
     <w:p>
       <w:pPr>
-        <w:spacing w:before="200" w:after="80"/>
+        <w:spacing w:before="140" w:after="60"/>
       </w:pPr>
       <w:r>
         <w:rPr>
           <w:b/>
           <w:color w:val="222222"/>
-          <w:sz w:val="28"/>
+          <w:sz w:val="27"/>
         </w:rPr>
         <w:t>Respuestas a objeciones</w:t>
       </w:r>
@@ -878,25 +920,30 @@
     </w:tbl>
     <w:p>
       <w:pPr>
-        <w:spacing w:after="40"/>
+        <w:spacing w:after="0"/>
       </w:pPr>
+      <w:r>
+        <w:rPr>
+          <w:sz w:val="8"/>
+        </w:rPr>
+      </w:r>
     </w:p>
     <w:p>
       <w:pPr>
-        <w:spacing w:before="200" w:after="80"/>
+        <w:spacing w:before="140" w:after="60"/>
       </w:pPr>
       <w:r>
         <w:rPr>
           <w:b/>
           <w:color w:val="222222"/>
-          <w:sz w:val="28"/>
+          <w:sz w:val="27"/>
         </w:rPr>
         <w:t>Lo que JAMÁS se hace</w:t>
       </w:r>
     </w:p>
     <w:p>
       <w:pPr>
-        <w:spacing w:after="120"/>
+        <w:spacing w:after="60"/>
       </w:pPr>
       <w:r>
         <w:rPr>
@@ -908,7 +955,7 @@
     </w:p>
     <w:p>
       <w:pPr>
-        <w:spacing w:after="120"/>
+        <w:spacing w:after="60"/>
       </w:pPr>
       <w:r>
         <w:rPr>
@@ -920,7 +967,7 @@
     </w:p>
     <w:p>
       <w:pPr>
-        <w:spacing w:after="120"/>
+        <w:spacing w:after="60"/>
       </w:pPr>
       <w:r>
         <w:rPr>
@@ -932,7 +979,7 @@
     </w:p>
     <w:p>
       <w:pPr>
-        <w:spacing w:after="120"/>
+        <w:spacing w:after="60"/>
       </w:pPr>
       <w:r>
         <w:rPr>
@@ -944,7 +991,7 @@
     </w:p>
     <w:p>
       <w:pPr>
-        <w:spacing w:after="120"/>
+        <w:spacing w:after="60"/>
       </w:pPr>
       <w:r>
         <w:rPr>
@@ -991,7 +1038,7 @@
             <w:r>
               <w:rPr>
                 <w:i/>
-                <w:sz w:val="26"/>
+                <w:sz w:val="25"/>
               </w:rPr>
               <w:t>Se le dice así: "Esta prueba NO se aprueba ni se pierde — solo nos dice tu punto de partida, para que no pagues ni una clase de más ni de menos."</w:t>
             </w:r>
@@ -1001,25 +1048,30 @@
     </w:tbl>
     <w:p>
       <w:pPr>
-        <w:spacing w:after="40"/>
+        <w:spacing w:after="0" w:before="0"/>
       </w:pPr>
+      <w:r>
+        <w:rPr>
+          <w:sz w:val="8"/>
+        </w:rPr>
+      </w:r>
     </w:p>
     <w:p>
       <w:pPr>
-        <w:spacing w:before="200" w:after="80"/>
+        <w:spacing w:before="140" w:after="60"/>
       </w:pPr>
       <w:r>
         <w:rPr>
           <w:b/>
           <w:color w:val="222222"/>
-          <w:sz w:val="28"/>
+          <w:sz w:val="27"/>
         </w:rPr>
         <w:t>Parte 1 — Prueba escrita (15 minutos · LA APLICAS TÚ, no necesitas saber inglés)</w:t>
       </w:r>
     </w:p>
     <w:p>
       <w:pPr>
-        <w:spacing w:after="120"/>
+        <w:spacing w:after="60"/>
       </w:pPr>
       <w:r>
         <w:rPr>
@@ -1031,7 +1083,7 @@
     </w:p>
     <w:p>
       <w:pPr>
-        <w:spacing w:after="120"/>
+        <w:spacing w:after="60"/>
       </w:pPr>
       <w:r>
         <w:rPr>
@@ -1060,7 +1112,7 @@
     </w:p>
     <w:p>
       <w:pPr>
-        <w:spacing w:after="120"/>
+        <w:spacing w:after="60"/>
       </w:pPr>
       <w:r>
         <w:rPr>
@@ -1072,20 +1124,20 @@
     </w:p>
     <w:p>
       <w:pPr>
-        <w:spacing w:before="200" w:after="80"/>
+        <w:spacing w:before="140" w:after="60"/>
       </w:pPr>
       <w:r>
         <w:rPr>
           <w:b/>
           <w:color w:val="222222"/>
-          <w:sz w:val="28"/>
+          <w:sz w:val="27"/>
         </w:rPr>
         <w:t>Parte 2 — Mini-oral de 5 minutos (la aplica UN PROFE, presencial o por videollamada)</w:t>
       </w:r>
     </w:p>
     <w:p>
       <w:pPr>
-        <w:spacing w:after="120"/>
+        <w:spacing w:after="60"/>
       </w:pPr>
       <w:r>
         <w:rPr>
@@ -1323,8 +1375,13 @@
     </w:tbl>
     <w:p>
       <w:pPr>
-        <w:spacing w:after="40"/>
+        <w:spacing w:after="0"/>
       </w:pPr>
+      <w:r>
+        <w:rPr>
+          <w:sz w:val="8"/>
+        </w:rPr>
+      </w:r>
     </w:p>
     <w:tbl>
       <w:tblPr>
@@ -1345,7 +1402,7 @@
             <w:r>
               <w:rPr>
                 <w:i/>
-                <w:sz w:val="26"/>
+                <w:sz w:val="25"/>
               </w:rPr>
               <w:t>REGLA CLAVE: entre la prueba escrita y la oral, MANDA LA MENOR. El que lee B2 pero habla A2, se ubica por lo que habla.</w:t>
             </w:r>
@@ -1355,25 +1412,30 @@
     </w:tbl>
     <w:p>
       <w:pPr>
-        <w:spacing w:after="40"/>
+        <w:spacing w:after="0" w:before="0"/>
       </w:pPr>
+      <w:r>
+        <w:rPr>
+          <w:sz w:val="8"/>
+        </w:rPr>
+      </w:r>
     </w:p>
     <w:p>
       <w:pPr>
-        <w:spacing w:before="200" w:after="80"/>
+        <w:spacing w:before="140" w:after="60"/>
       </w:pPr>
       <w:r>
         <w:rPr>
           <w:b/>
           <w:color w:val="222222"/>
-          <w:sz w:val="28"/>
+          <w:sz w:val="27"/>
         </w:rPr>
         <w:t>¿Y si no hay profe disponible en la cita? (regla de plata)</w:t>
       </w:r>
     </w:p>
     <w:p>
       <w:pPr>
-        <w:spacing w:after="120"/>
+        <w:spacing w:after="60"/>
       </w:pPr>
       <w:r>
         <w:rPr>
@@ -1385,7 +1447,7 @@
     </w:p>
     <w:p>
       <w:pPr>
-        <w:spacing w:after="120"/>
+        <w:spacing w:after="60"/>
       </w:pPr>
       <w:r>
         <w:rPr>
@@ -1397,7 +1459,7 @@
     </w:p>
     <w:p>
       <w:pPr>
-        <w:spacing w:after="120"/>
+        <w:spacing w:after="60"/>
       </w:pPr>
       <w:r>
         <w:rPr>
@@ -1409,7 +1471,7 @@
     </w:p>
     <w:p>
       <w:pPr>
-        <w:spacing w:after="120"/>
+        <w:spacing w:after="60"/>
       </w:pPr>
       <w:r>
         <w:rPr>
@@ -1421,7 +1483,7 @@
     </w:p>
     <w:p>
       <w:pPr>
-        <w:spacing w:after="120"/>
+        <w:spacing w:after="60"/>
       </w:pPr>
       <w:r>
         <w:rPr>
@@ -1433,13 +1495,13 @@
     </w:p>
     <w:p>
       <w:pPr>
-        <w:spacing w:before="200" w:after="80"/>
+        <w:spacing w:before="140" w:after="60"/>
       </w:pPr>
       <w:r>
         <w:rPr>
           <w:b/>
           <w:color w:val="222222"/>
-          <w:sz w:val="28"/>
+          <w:sz w:val="27"/>
         </w:rPr>
         <w:t>Con el resultado, qué se ofrece</w:t>
       </w:r>
@@ -1603,8 +1665,13 @@
     </w:tbl>
     <w:p>
       <w:pPr>
-        <w:spacing w:after="40"/>
+        <w:spacing w:after="0"/>
       </w:pPr>
+      <w:r>
+        <w:rPr>
+          <w:sz w:val="8"/>
+        </w:rPr>
+      </w:r>
     </w:p>
     <w:p>
       <w:r>
@@ -1643,7 +1710,7 @@
             <w:r>
               <w:rPr>
                 <w:i/>
-                <w:sz w:val="26"/>
+                <w:sz w:val="25"/>
               </w:rPr>
               <w:t>Esta tabla es INTERNA: nunca se muestra ni se fotografía. Al cliente se le dice SU resultado.</w:t>
             </w:r>
@@ -1653,25 +1720,30 @@
     </w:tbl>
     <w:p>
       <w:pPr>
-        <w:spacing w:after="40"/>
+        <w:spacing w:after="0" w:before="0"/>
       </w:pPr>
+      <w:r>
+        <w:rPr>
+          <w:sz w:val="8"/>
+        </w:rPr>
+      </w:r>
     </w:p>
     <w:p>
       <w:pPr>
-        <w:spacing w:before="200" w:after="80"/>
+        <w:spacing w:before="140" w:after="60"/>
       </w:pPr>
       <w:r>
         <w:rPr>
           <w:b/>
           <w:color w:val="222222"/>
-          <w:sz w:val="28"/>
+          <w:sz w:val="27"/>
         </w:rPr>
         <w:t>Las 2 preguntas (en este orden)</w:t>
       </w:r>
     </w:p>
     <w:p>
       <w:pPr>
-        <w:spacing w:after="120"/>
+        <w:spacing w:after="60"/>
       </w:pPr>
       <w:r>
         <w:rPr>
@@ -1683,7 +1755,7 @@
     </w:p>
     <w:p>
       <w:pPr>
-        <w:spacing w:after="120"/>
+        <w:spacing w:after="60"/>
       </w:pPr>
       <w:r>
         <w:rPr>
@@ -1695,7 +1767,7 @@
     </w:p>
     <w:p>
       <w:pPr>
-        <w:spacing w:after="120"/>
+        <w:spacing w:after="60"/>
       </w:pPr>
       <w:r>
         <w:rPr>
@@ -1707,7 +1779,7 @@
     </w:p>
     <w:p>
       <w:pPr>
-        <w:spacing w:after="120"/>
+        <w:spacing w:after="60"/>
       </w:pPr>
       <w:r>
         <w:rPr>
@@ -1719,7 +1791,7 @@
     </w:p>
     <w:p>
       <w:pPr>
-        <w:spacing w:after="120"/>
+        <w:spacing w:after="60"/>
       </w:pPr>
       <w:r>
         <w:rPr>
@@ -1731,13 +1803,13 @@
     </w:p>
     <w:p>
       <w:pPr>
-        <w:spacing w:before="200" w:after="80"/>
+        <w:spacing w:before="140" w:after="60"/>
       </w:pPr>
       <w:r>
         <w:rPr>
           <w:b/>
           <w:color w:val="222222"/>
-          <w:sz w:val="28"/>
+          <w:sz w:val="27"/>
         </w:rPr>
         <w:t>La matriz (beca sobre el precio del paquete — solo buscar, no calcular)</w:t>
       </w:r>
@@ -2093,12 +2165,17 @@
     </w:tbl>
     <w:p>
       <w:pPr>
-        <w:spacing w:after="40"/>
+        <w:spacing w:after="0"/>
       </w:pPr>
+      <w:r>
+        <w:rPr>
+          <w:sz w:val="8"/>
+        </w:rPr>
+      </w:r>
     </w:p>
     <w:p>
       <w:pPr>
-        <w:spacing w:after="120"/>
+        <w:spacing w:after="60"/>
       </w:pPr>
       <w:r>
         <w:rPr>
@@ -2110,13 +2187,13 @@
     </w:p>
     <w:p>
       <w:pPr>
-        <w:spacing w:before="200" w:after="80"/>
+        <w:spacing w:before="140" w:after="60"/>
       </w:pPr>
       <w:r>
         <w:rPr>
           <w:b/>
           <w:color w:val="222222"/>
-          <w:sz w:val="28"/>
+          <w:sz w:val="27"/>
         </w:rPr>
         <w:t>El guion del Fondo (tal cual)</w:t>
       </w:r>
@@ -2140,7 +2217,7 @@
             <w:r>
               <w:rPr>
                 <w:i/>
-                <w:sz w:val="26"/>
+                <w:sz w:val="25"/>
               </w:rPr>
               <w:t>"Heiiu tiene un Fondo de Becas institucional, administrado por contaduría. Yo no decido las becas — yo presento tu solicitud y el Fondo la evalúa."</w:t>
             </w:r>
@@ -2150,8 +2227,13 @@
     </w:tbl>
     <w:p>
       <w:pPr>
-        <w:spacing w:after="40"/>
+        <w:spacing w:after="0" w:before="0"/>
       </w:pPr>
+      <w:r>
+        <w:rPr>
+          <w:sz w:val="8"/>
+        </w:rPr>
+      </w:r>
     </w:p>
     <w:tbl>
       <w:tblPr>
@@ -2172,7 +2254,7 @@
             <w:r>
               <w:rPr>
                 <w:i/>
-                <w:sz w:val="26"/>
+                <w:sz w:val="25"/>
               </w:rPr>
               <w:t>Si regatea: "No puedo tocar el porcentaje — el Fondo se audita y una excepción lo tumba para todas las familias. Lo que sí puedo hacer es presentar bien tu caso."</w:t>
             </w:r>
@@ -2182,12 +2264,17 @@
     </w:tbl>
     <w:p>
       <w:pPr>
-        <w:spacing w:after="40"/>
+        <w:spacing w:after="0" w:before="0"/>
       </w:pPr>
+      <w:r>
+        <w:rPr>
+          <w:sz w:val="8"/>
+        </w:rPr>
+      </w:r>
     </w:p>
     <w:p>
       <w:pPr>
-        <w:spacing w:after="120"/>
+        <w:spacing w:after="60"/>
       </w:pPr>
       <w:r>
         <w:rPr>
@@ -2216,7 +2303,7 @@
             <w:r>
               <w:rPr>
                 <w:i/>
-                <w:sz w:val="26"/>
+                <w:sz w:val="25"/>
               </w:rPr>
               <w:t>La lógica, por si preguntan: "Entre más necesitas, más alto tu techo. Entre más te comprometes, más del techo te ganas."</w:t>
             </w:r>
@@ -2226,8 +2313,13 @@
     </w:tbl>
     <w:p>
       <w:pPr>
-        <w:spacing w:after="40"/>
+        <w:spacing w:after="0" w:before="0"/>
       </w:pPr>
+      <w:r>
+        <w:rPr>
+          <w:sz w:val="8"/>
+        </w:rPr>
+      </w:r>
     </w:p>
     <w:p/>
     <w:p>

</xml_diff>

<commit_message>
Kit + guia ubicacion: paso a paso de pantallas del EF SET Quick Check (botones traducidos, prueba de sonido) y resultado real Beginner/Intermediate/Advanced como rango; nivel exacto lo define la mini-oral
Co-Authored-By: Claude Fable 5 <noreply@anthropic.com>
Claude-Session: https://claude.ai/code/session_018H7C5dx3NvDfXiv3CfhPMa
</commit_message>
<xml_diff>
--- a/recursos/comercial/INDUCCION_COMERCIAL/KIT_DE_VENTA_ASESORAS.docx
+++ b/recursos/comercial/INDUCCION_COMERCIAL/KIT_DE_VENTA_ASESORAS.docx
@@ -1075,10 +1075,10 @@
       </w:pPr>
       <w:r>
         <w:rPr>
-          <w:b w:val="0"/>
+          <w:b/>
           <w:sz w:val="24"/>
         </w:rPr>
-        <w:t>1. Sienta al cliente en el computador (o mándale el link en la cita virtual).</w:t>
+        <w:t>La página está en inglés — aquí va cada pantalla con su traducción:</w:t>
       </w:r>
     </w:p>
     <w:p>
@@ -1090,7 +1090,7 @@
           <w:b w:val="0"/>
           <w:sz w:val="24"/>
         </w:rPr>
-        <w:t xml:space="preserve">2. Abre este enlace (clic directo): </w:t>
+        <w:t xml:space="preserve">1. Abre este enlace (clic directo): </w:t>
       </w:r>
       <w:hyperlink r:id="rId9">
         <w:r>
@@ -1119,7 +1119,250 @@
           <w:b w:val="0"/>
           <w:sz w:val="24"/>
         </w:rPr>
-        <w:t>3. Al terminar, la pantalla muestra su nivel (A1, A2, B1, B2). Anótalo. Esto mide lectura y escucha — falta el habla.</w:t>
+        <w:t>2. Clic en el botón "Start practice test" (= empezar el test).</w:t>
+      </w:r>
+    </w:p>
+    <w:p>
+      <w:pPr>
+        <w:spacing w:after="60"/>
+      </w:pPr>
+      <w:r>
+        <w:rPr>
+          <w:b w:val="0"/>
+          <w:sz w:val="24"/>
+        </w:rPr>
+        <w:t>3. Sale una prueba de SONIDO: un audio pregunta si se escucha bien. Sube el volumen, verifica que el cliente escuche, y dale "Continue" (= continuar).</w:t>
+      </w:r>
+    </w:p>
+    <w:p>
+      <w:pPr>
+        <w:spacing w:after="60"/>
+      </w:pPr>
+      <w:r>
+        <w:rPr>
+          <w:b w:val="0"/>
+          <w:sz w:val="24"/>
+        </w:rPr>
+        <w:t>4. De ahí el cliente responde SOLO: 20 preguntas, unos 15 minutos, en dos partes (escuchar y leer). Si entre partes sale otro botón, es "Start" o "Continue" — siempre se le da al botón grande.</w:t>
+      </w:r>
+    </w:p>
+    <w:p>
+      <w:pPr>
+        <w:spacing w:after="60"/>
+      </w:pPr>
+      <w:r>
+        <w:rPr>
+          <w:b w:val="0"/>
+          <w:sz w:val="24"/>
+        </w:rPr>
+        <w:t>5. Al final la pantalla muestra el resultado. Tradúcelo y anótalo:</w:t>
+      </w:r>
+    </w:p>
+    <w:tbl>
+      <w:tblPr>
+        <w:tblStyle w:val="TableGrid"/>
+        <w:tblW w:type="auto" w:w="0"/>
+        <w:tblLook w:firstColumn="1" w:firstRow="1" w:lastColumn="0" w:lastRow="0" w:noHBand="0" w:noVBand="1" w:val="04A0"/>
+      </w:tblPr>
+      <w:tblGrid>
+        <w:gridCol w:w="3324"/>
+        <w:gridCol w:w="3324"/>
+        <w:gridCol w:w="3324"/>
+      </w:tblGrid>
+      <w:tr>
+        <w:tc>
+          <w:tcPr>
+            <w:tcW w:type="dxa" w:w="3324"/>
+            <w:shd w:val="clear" w:fill="E54C09"/>
+          </w:tcPr>
+          <w:p>
+            <w:r>
+              <w:rPr>
+                <w:b/>
+                <w:color w:val="FFFFFF"/>
+                <w:sz w:val="23"/>
+              </w:rPr>
+              <w:t>Dice en pantalla</w:t>
+            </w:r>
+          </w:p>
+        </w:tc>
+        <w:tc>
+          <w:tcPr>
+            <w:tcW w:type="dxa" w:w="3324"/>
+            <w:shd w:val="clear" w:fill="E54C09"/>
+          </w:tcPr>
+          <w:p>
+            <w:r>
+              <w:rPr>
+                <w:b/>
+                <w:color w:val="FFFFFF"/>
+                <w:sz w:val="23"/>
+              </w:rPr>
+              <w:t>Significa</w:t>
+            </w:r>
+          </w:p>
+        </w:tc>
+        <w:tc>
+          <w:tcPr>
+            <w:tcW w:type="dxa" w:w="3324"/>
+            <w:shd w:val="clear" w:fill="E54C09"/>
+          </w:tcPr>
+          <w:p>
+            <w:r>
+              <w:rPr>
+                <w:b/>
+                <w:color w:val="FFFFFF"/>
+                <w:sz w:val="23"/>
+              </w:rPr>
+              <w:t>Rango probable</w:t>
+            </w:r>
+          </w:p>
+        </w:tc>
+      </w:tr>
+      <w:tr>
+        <w:tc>
+          <w:tcPr>
+            <w:tcW w:type="dxa" w:w="3324"/>
+          </w:tcPr>
+          <w:p>
+            <w:r>
+              <w:rPr>
+                <w:sz w:val="23"/>
+              </w:rPr>
+              <w:t>Beginner</w:t>
+            </w:r>
+          </w:p>
+        </w:tc>
+        <w:tc>
+          <w:tcPr>
+            <w:tcW w:type="dxa" w:w="3324"/>
+          </w:tcPr>
+          <w:p>
+            <w:r>
+              <w:rPr>
+                <w:sz w:val="23"/>
+              </w:rPr>
+              <w:t>Principiante</w:t>
+            </w:r>
+          </w:p>
+        </w:tc>
+        <w:tc>
+          <w:tcPr>
+            <w:tcW w:type="dxa" w:w="3324"/>
+          </w:tcPr>
+          <w:p>
+            <w:r>
+              <w:rPr>
+                <w:sz w:val="23"/>
+              </w:rPr>
+              <w:t>A1</w:t>
+            </w:r>
+          </w:p>
+        </w:tc>
+      </w:tr>
+      <w:tr>
+        <w:tc>
+          <w:tcPr>
+            <w:tcW w:type="dxa" w:w="3324"/>
+          </w:tcPr>
+          <w:p>
+            <w:r>
+              <w:rPr>
+                <w:sz w:val="23"/>
+              </w:rPr>
+              <w:t>Intermediate</w:t>
+            </w:r>
+          </w:p>
+        </w:tc>
+        <w:tc>
+          <w:tcPr>
+            <w:tcW w:type="dxa" w:w="3324"/>
+          </w:tcPr>
+          <w:p>
+            <w:r>
+              <w:rPr>
+                <w:sz w:val="23"/>
+              </w:rPr>
+              <w:t>Intermedio</w:t>
+            </w:r>
+          </w:p>
+        </w:tc>
+        <w:tc>
+          <w:tcPr>
+            <w:tcW w:type="dxa" w:w="3324"/>
+          </w:tcPr>
+          <w:p>
+            <w:r>
+              <w:rPr>
+                <w:sz w:val="23"/>
+              </w:rPr>
+              <w:t>A2 o B1</w:t>
+            </w:r>
+          </w:p>
+        </w:tc>
+      </w:tr>
+      <w:tr>
+        <w:tc>
+          <w:tcPr>
+            <w:tcW w:type="dxa" w:w="3324"/>
+          </w:tcPr>
+          <w:p>
+            <w:r>
+              <w:rPr>
+                <w:sz w:val="23"/>
+              </w:rPr>
+              <w:t>Advanced</w:t>
+            </w:r>
+          </w:p>
+        </w:tc>
+        <w:tc>
+          <w:tcPr>
+            <w:tcW w:type="dxa" w:w="3324"/>
+          </w:tcPr>
+          <w:p>
+            <w:r>
+              <w:rPr>
+                <w:sz w:val="23"/>
+              </w:rPr>
+              <w:t>Avanzado</w:t>
+            </w:r>
+          </w:p>
+        </w:tc>
+        <w:tc>
+          <w:tcPr>
+            <w:tcW w:type="dxa" w:w="3324"/>
+          </w:tcPr>
+          <w:p>
+            <w:r>
+              <w:rPr>
+                <w:sz w:val="23"/>
+              </w:rPr>
+              <w:t>B1 o B2</w:t>
+            </w:r>
+          </w:p>
+        </w:tc>
+      </w:tr>
+    </w:tbl>
+    <w:p>
+      <w:pPr>
+        <w:spacing w:after="0"/>
+      </w:pPr>
+      <w:r>
+        <w:rPr>
+          <w:sz w:val="8"/>
+        </w:rPr>
+      </w:r>
+    </w:p>
+    <w:p>
+      <w:pPr>
+        <w:spacing w:after="60"/>
+      </w:pPr>
+      <w:r>
+        <w:rPr>
+          <w:b/>
+          <w:sz w:val="24"/>
+        </w:rPr>
+        <w:t>Si aparece una pantalla distinta a estas: el botón grande siempre es el que avanza. Tú no ayudas con las respuestas — solo con los botones.</w:t>
       </w:r>
     </w:p>
     <w:p>
@@ -1404,7 +1647,7 @@
                 <w:i/>
                 <w:sz w:val="25"/>
               </w:rPr>
-              <w:t>REGLA CLAVE: entre la prueba escrita y la oral, MANDA LA MENOR. El que lee B2 pero habla A2, se ubica por lo que habla.</w:t>
+              <w:t>REGLA CLAVE: la escrita da el RANGO; el nivel exacto lo define la mini-oral. Y entre las dos, MANDA LA MENOR: el que lee "Advanced" pero habla A2, se ubica por lo que habla.</w:t>
             </w:r>
           </w:p>
         </w:tc>

</xml_diff>

<commit_message>
Prueba ubicacion paso 5: la pagina pide datos al final (nombre, tel, correo, nacimiento) y se llenan RAPIDO o se cierra la sesion — asesora los tiene anotados antes de empezar
Co-Authored-By: Claude Fable 5 <noreply@anthropic.com>
Claude-Session: https://claude.ai/code/session_018H7C5dx3NvDfXiv3CfhPMa
</commit_message>
<xml_diff>
--- a/recursos/comercial/INDUCCION_COMERCIAL/KIT_DE_VENTA_ASESORAS.docx
+++ b/recursos/comercial/INDUCCION_COMERCIAL/KIT_DE_VENTA_ASESORAS.docx
@@ -1155,7 +1155,19 @@
           <w:b w:val="0"/>
           <w:sz w:val="24"/>
         </w:rPr>
-        <w:t>5. Al final la pantalla muestra el resultado. Tradúcelo y anótalo:</w:t>
+        <w:t>5. Al terminar las preguntas, la página pide DATOS: nombre, apellido, teléfono, correo, año de nacimiento y confirmar. OJO: hay que llenarlos RÁPIDO o la sesión se cierra y se pierde el resultado. Por eso: ANTES de empezar el test, ten esos datos ya anotados (los pediste en la cita) y llénalos tú de una.</w:t>
+      </w:r>
+    </w:p>
+    <w:p>
+      <w:pPr>
+        <w:spacing w:after="60"/>
+      </w:pPr>
+      <w:r>
+        <w:rPr>
+          <w:b w:val="0"/>
+          <w:sz w:val="24"/>
+        </w:rPr>
+        <w:t>6. Después de confirmar, la pantalla muestra el resultado. Tradúcelo y anótalo:</w:t>
       </w:r>
     </w:p>
     <w:tbl>

</xml_diff>

<commit_message>
Paso datos del test con dos casos: en sede los llena la asesora; en virtual los llena el cliente con aviso previo de que se cierra si demora
Co-Authored-By: Claude Fable 5 <noreply@anthropic.com>
Claude-Session: https://claude.ai/code/session_018H7C5dx3NvDfXiv3CfhPMa
</commit_message>
<xml_diff>
--- a/recursos/comercial/INDUCCION_COMERCIAL/KIT_DE_VENTA_ASESORAS.docx
+++ b/recursos/comercial/INDUCCION_COMERCIAL/KIT_DE_VENTA_ASESORAS.docx
@@ -1155,7 +1155,31 @@
           <w:b w:val="0"/>
           <w:sz w:val="24"/>
         </w:rPr>
-        <w:t>5. Al terminar las preguntas, la página pide DATOS: nombre, apellido, teléfono, correo, año de nacimiento y confirmar. OJO: hay que llenarlos RÁPIDO o la sesión se cierra y se pierde el resultado. Por eso: ANTES de empezar el test, ten esos datos ya anotados (los pediste en la cita) y llénalos tú de una.</w:t>
+        <w:t>5. Al terminar las preguntas, la página pide DATOS: nombre, apellido, teléfono, correo, año de nacimiento y confirmar. OJO: hay que llenarlos RÁPIDO o la sesión se cierra y se pierde el resultado.</w:t>
+      </w:r>
+    </w:p>
+    <w:p>
+      <w:pPr>
+        <w:spacing w:after="60"/>
+      </w:pPr>
+      <w:r>
+        <w:rPr>
+          <w:b w:val="0"/>
+          <w:sz w:val="24"/>
+        </w:rPr>
+        <w:t xml:space="preserve">   · En la SEDE: llénalos TÚ de una — tenlos anotados antes de empezar (los pediste en la cita).</w:t>
+      </w:r>
+    </w:p>
+    <w:p>
+      <w:pPr>
+        <w:spacing w:after="60"/>
+      </w:pPr>
+      <w:r>
+        <w:rPr>
+          <w:b w:val="0"/>
+          <w:sz w:val="24"/>
+        </w:rPr>
+        <w:t xml:space="preserve">   · En cita VIRTUAL: los llena el cliente. Avísale ANTES de arrancar: "al final te va a pedir nombre, teléfono, correo y año de nacimiento — llénalos de una, sin pausa, porque si te demoras se cierra y toca repetir todo".</w:t>
       </w:r>
     </w:p>
     <w:p>

</xml_diff>

<commit_message>
Rediseno ubicacion: Quick Check ELIMINADO de la cita (no adaptativo, aplasta al principiante — Diana lo probo); cita = solo mini-oral 5 min; evaluacion de ingreso = EF SET 50 min adaptativo desde casa, camara prendida + pantalla compartida, antes de la primera clase (sin PCs en sede)
Co-Authored-By: Claude Fable 5 <noreply@anthropic.com>
Claude-Session: https://claude.ai/code/session_018H7C5dx3NvDfXiv3CfhPMa
</commit_message>
<xml_diff>
--- a/recursos/comercial/INDUCCION_COMERCIAL/KIT_DE_VENTA_ASESORAS.docx
+++ b/recursos/comercial/INDUCCION_COMERCIAL/KIT_DE_VENTA_ASESORAS.docx
@@ -290,7 +290,7 @@
               <w:rPr>
                 <w:sz w:val="23"/>
               </w:rPr>
-              <w:t>Cierre directo: ofrécele el ARRANQUE. Su prueba será su primer día de clase.</w:t>
+              <w:t>Cierre directo: ofrécele el ARRANQUE. Sin prueba en la cita — su evaluación de ingreso se agenda al matricular.</w:t>
             </w:r>
           </w:p>
         </w:tc>
@@ -1066,7 +1066,7 @@
           <w:color w:val="222222"/>
           <w:sz w:val="27"/>
         </w:rPr>
-        <w:t>Parte 1 — Prueba escrita (15 minutos · LA APLICAS TÚ, no necesitas saber inglés)</w:t>
+        <w:t>En la cita: SOLO la mini-oral de 5 minutos (la aplica UN PROFE, presencial o por videollamada)</w:t>
       </w:r>
     </w:p>
     <w:p>
@@ -1078,340 +1078,7 @@
           <w:b/>
           <w:sz w:val="24"/>
         </w:rPr>
-        <w:t>La página está en inglés — aquí va cada pantalla con su traducción:</w:t>
-      </w:r>
-    </w:p>
-    <w:p>
-      <w:pPr>
-        <w:spacing w:after="60"/>
-      </w:pPr>
-      <w:r>
-        <w:rPr>
-          <w:b w:val="0"/>
-          <w:sz w:val="24"/>
-        </w:rPr>
-        <w:t xml:space="preserve">1. Abre este enlace (clic directo): </w:t>
-      </w:r>
-      <w:hyperlink r:id="rId9">
-        <w:r>
-          <w:rPr>
-            <w:color w:val="0563C1"/>
-            <w:u w:val="single"/>
-            <w:b/>
-            <w:sz w:val="26"/>
-          </w:rPr>
-          <w:t>efset.org/quick-check</w:t>
-        </w:r>
-      </w:hyperlink>
-      <w:r>
-        <w:rPr>
-          <w:sz w:val="24"/>
-        </w:rPr>
-        <w:t xml:space="preserve"> — es gratis. En cita virtual, copia y pega ese mismo enlace por WhatsApp.</w:t>
-      </w:r>
-    </w:p>
-    <w:p>
-      <w:pPr>
-        <w:spacing w:after="60"/>
-      </w:pPr>
-      <w:r>
-        <w:rPr>
-          <w:b w:val="0"/>
-          <w:sz w:val="24"/>
-        </w:rPr>
-        <w:t>2. Clic en el botón "Start practice test" (= empezar el test).</w:t>
-      </w:r>
-    </w:p>
-    <w:p>
-      <w:pPr>
-        <w:spacing w:after="60"/>
-      </w:pPr>
-      <w:r>
-        <w:rPr>
-          <w:b w:val="0"/>
-          <w:sz w:val="24"/>
-        </w:rPr>
-        <w:t>3. Sale una prueba de SONIDO: un audio pregunta si se escucha bien. Sube el volumen, verifica que el cliente escuche, y dale "Continue" (= continuar).</w:t>
-      </w:r>
-    </w:p>
-    <w:p>
-      <w:pPr>
-        <w:spacing w:after="60"/>
-      </w:pPr>
-      <w:r>
-        <w:rPr>
-          <w:b w:val="0"/>
-          <w:sz w:val="24"/>
-        </w:rPr>
-        <w:t>4. De ahí el cliente responde SOLO: 20 preguntas, unos 15 minutos, en dos partes (escuchar y leer). Si entre partes sale otro botón, es "Start" o "Continue" — siempre se le da al botón grande.</w:t>
-      </w:r>
-    </w:p>
-    <w:p>
-      <w:pPr>
-        <w:spacing w:after="60"/>
-      </w:pPr>
-      <w:r>
-        <w:rPr>
-          <w:b w:val="0"/>
-          <w:sz w:val="24"/>
-        </w:rPr>
-        <w:t>5. Al terminar las preguntas, la página pide DATOS: nombre, apellido, teléfono, correo, año de nacimiento y confirmar. OJO: hay que llenarlos RÁPIDO o la sesión se cierra y se pierde el resultado.</w:t>
-      </w:r>
-    </w:p>
-    <w:p>
-      <w:pPr>
-        <w:spacing w:after="60"/>
-      </w:pPr>
-      <w:r>
-        <w:rPr>
-          <w:b w:val="0"/>
-          <w:sz w:val="24"/>
-        </w:rPr>
-        <w:t xml:space="preserve">   · En la SEDE: llénalos TÚ de una — tenlos anotados antes de empezar (los pediste en la cita).</w:t>
-      </w:r>
-    </w:p>
-    <w:p>
-      <w:pPr>
-        <w:spacing w:after="60"/>
-      </w:pPr>
-      <w:r>
-        <w:rPr>
-          <w:b w:val="0"/>
-          <w:sz w:val="24"/>
-        </w:rPr>
-        <w:t xml:space="preserve">   · En cita VIRTUAL: los llena el cliente. Avísale ANTES de arrancar: "al final te va a pedir nombre, teléfono, correo y año de nacimiento — llénalos de una, sin pausa, porque si te demoras se cierra y toca repetir todo".</w:t>
-      </w:r>
-    </w:p>
-    <w:p>
-      <w:pPr>
-        <w:spacing w:after="60"/>
-      </w:pPr>
-      <w:r>
-        <w:rPr>
-          <w:b w:val="0"/>
-          <w:sz w:val="24"/>
-        </w:rPr>
-        <w:t>6. Después de confirmar, la pantalla muestra el resultado. Tradúcelo y anótalo:</w:t>
-      </w:r>
-    </w:p>
-    <w:tbl>
-      <w:tblPr>
-        <w:tblStyle w:val="TableGrid"/>
-        <w:tblW w:type="auto" w:w="0"/>
-        <w:tblLook w:firstColumn="1" w:firstRow="1" w:lastColumn="0" w:lastRow="0" w:noHBand="0" w:noVBand="1" w:val="04A0"/>
-      </w:tblPr>
-      <w:tblGrid>
-        <w:gridCol w:w="3324"/>
-        <w:gridCol w:w="3324"/>
-        <w:gridCol w:w="3324"/>
-      </w:tblGrid>
-      <w:tr>
-        <w:tc>
-          <w:tcPr>
-            <w:tcW w:type="dxa" w:w="3324"/>
-            <w:shd w:val="clear" w:fill="E54C09"/>
-          </w:tcPr>
-          <w:p>
-            <w:r>
-              <w:rPr>
-                <w:b/>
-                <w:color w:val="FFFFFF"/>
-                <w:sz w:val="23"/>
-              </w:rPr>
-              <w:t>Dice en pantalla</w:t>
-            </w:r>
-          </w:p>
-        </w:tc>
-        <w:tc>
-          <w:tcPr>
-            <w:tcW w:type="dxa" w:w="3324"/>
-            <w:shd w:val="clear" w:fill="E54C09"/>
-          </w:tcPr>
-          <w:p>
-            <w:r>
-              <w:rPr>
-                <w:b/>
-                <w:color w:val="FFFFFF"/>
-                <w:sz w:val="23"/>
-              </w:rPr>
-              <w:t>Significa</w:t>
-            </w:r>
-          </w:p>
-        </w:tc>
-        <w:tc>
-          <w:tcPr>
-            <w:tcW w:type="dxa" w:w="3324"/>
-            <w:shd w:val="clear" w:fill="E54C09"/>
-          </w:tcPr>
-          <w:p>
-            <w:r>
-              <w:rPr>
-                <w:b/>
-                <w:color w:val="FFFFFF"/>
-                <w:sz w:val="23"/>
-              </w:rPr>
-              <w:t>Rango probable</w:t>
-            </w:r>
-          </w:p>
-        </w:tc>
-      </w:tr>
-      <w:tr>
-        <w:tc>
-          <w:tcPr>
-            <w:tcW w:type="dxa" w:w="3324"/>
-          </w:tcPr>
-          <w:p>
-            <w:r>
-              <w:rPr>
-                <w:sz w:val="23"/>
-              </w:rPr>
-              <w:t>Beginner</w:t>
-            </w:r>
-          </w:p>
-        </w:tc>
-        <w:tc>
-          <w:tcPr>
-            <w:tcW w:type="dxa" w:w="3324"/>
-          </w:tcPr>
-          <w:p>
-            <w:r>
-              <w:rPr>
-                <w:sz w:val="23"/>
-              </w:rPr>
-              <w:t>Principiante</w:t>
-            </w:r>
-          </w:p>
-        </w:tc>
-        <w:tc>
-          <w:tcPr>
-            <w:tcW w:type="dxa" w:w="3324"/>
-          </w:tcPr>
-          <w:p>
-            <w:r>
-              <w:rPr>
-                <w:sz w:val="23"/>
-              </w:rPr>
-              <w:t>A1</w:t>
-            </w:r>
-          </w:p>
-        </w:tc>
-      </w:tr>
-      <w:tr>
-        <w:tc>
-          <w:tcPr>
-            <w:tcW w:type="dxa" w:w="3324"/>
-          </w:tcPr>
-          <w:p>
-            <w:r>
-              <w:rPr>
-                <w:sz w:val="23"/>
-              </w:rPr>
-              <w:t>Intermediate</w:t>
-            </w:r>
-          </w:p>
-        </w:tc>
-        <w:tc>
-          <w:tcPr>
-            <w:tcW w:type="dxa" w:w="3324"/>
-          </w:tcPr>
-          <w:p>
-            <w:r>
-              <w:rPr>
-                <w:sz w:val="23"/>
-              </w:rPr>
-              <w:t>Intermedio</w:t>
-            </w:r>
-          </w:p>
-        </w:tc>
-        <w:tc>
-          <w:tcPr>
-            <w:tcW w:type="dxa" w:w="3324"/>
-          </w:tcPr>
-          <w:p>
-            <w:r>
-              <w:rPr>
-                <w:sz w:val="23"/>
-              </w:rPr>
-              <w:t>A2 o B1</w:t>
-            </w:r>
-          </w:p>
-        </w:tc>
-      </w:tr>
-      <w:tr>
-        <w:tc>
-          <w:tcPr>
-            <w:tcW w:type="dxa" w:w="3324"/>
-          </w:tcPr>
-          <w:p>
-            <w:r>
-              <w:rPr>
-                <w:sz w:val="23"/>
-              </w:rPr>
-              <w:t>Advanced</w:t>
-            </w:r>
-          </w:p>
-        </w:tc>
-        <w:tc>
-          <w:tcPr>
-            <w:tcW w:type="dxa" w:w="3324"/>
-          </w:tcPr>
-          <w:p>
-            <w:r>
-              <w:rPr>
-                <w:sz w:val="23"/>
-              </w:rPr>
-              <w:t>Avanzado</w:t>
-            </w:r>
-          </w:p>
-        </w:tc>
-        <w:tc>
-          <w:tcPr>
-            <w:tcW w:type="dxa" w:w="3324"/>
-          </w:tcPr>
-          <w:p>
-            <w:r>
-              <w:rPr>
-                <w:sz w:val="23"/>
-              </w:rPr>
-              <w:t>B1 o B2</w:t>
-            </w:r>
-          </w:p>
-        </w:tc>
-      </w:tr>
-    </w:tbl>
-    <w:p>
-      <w:pPr>
-        <w:spacing w:after="0"/>
-      </w:pPr>
-      <w:r>
-        <w:rPr>
-          <w:sz w:val="8"/>
-        </w:rPr>
-      </w:r>
-    </w:p>
-    <w:p>
-      <w:pPr>
-        <w:spacing w:after="60"/>
-      </w:pPr>
-      <w:r>
-        <w:rPr>
-          <w:b/>
-          <w:sz w:val="24"/>
-        </w:rPr>
-        <w:t>Si aparece una pantalla distinta a estas: el botón grande siempre es el que avanza. Tú no ayudas con las respuestas — solo con los botones.</w:t>
-      </w:r>
-    </w:p>
-    <w:p>
-      <w:pPr>
-        <w:spacing w:before="140" w:after="60"/>
-      </w:pPr>
-      <w:r>
-        <w:rPr>
-          <w:b/>
-          <w:color w:val="222222"/>
-          <w:sz w:val="27"/>
-        </w:rPr>
-        <w:t>Parte 2 — Mini-oral de 5 minutos (la aplica UN PROFE, presencial o por videollamada)</w:t>
+        <w:t>En la cita NO se hace examen escrito — un test largo y difícil golpea al prospecto justo antes de decidir. La mini-oral se siente como una conversación, y es la que define el nivel.</w:t>
       </w:r>
     </w:p>
     <w:p>
@@ -1683,7 +1350,7 @@
                 <w:i/>
                 <w:sz w:val="25"/>
               </w:rPr>
-              <w:t>REGLA CLAVE: la escrita da el RANGO; el nivel exacto lo define la mini-oral. Y entre las dos, MANDA LA MENOR: el que lee "Advanced" pero habla A2, se ubica por lo que habla.</w:t>
+              <w:t>REGLA CLAVE: el nivel = el último donde respondió cómodo. Si hay duda entre dos niveles, se ubica en el MENOR: "vamos a asegurar tu base — subir de grupo siempre se puede, y la reubicación no te cuesta nada".</w:t>
             </w:r>
           </w:p>
         </w:tc>
@@ -1782,7 +1449,103 @@
           <w:color w:val="222222"/>
           <w:sz w:val="27"/>
         </w:rPr>
-        <w:t>Con el resultado, qué se ofrece</w:t>
+        <w:t>Después de matricular: la evaluación de ingreso oficial (la de la garantía)</w:t>
+      </w:r>
+    </w:p>
+    <w:p>
+      <w:pPr>
+        <w:spacing w:after="60"/>
+      </w:pPr>
+      <w:r>
+        <w:rPr>
+          <w:b w:val="0"/>
+          <w:sz w:val="24"/>
+        </w:rPr>
+        <w:t xml:space="preserve">Es el examen internacional EF SET de 50 minutos (gratis y ADAPTATIVO: ajusta la dificultad al nivel de la persona, no maltrata al principiante). Se hace ANTES de la primera clase, desde la casa del estudiante — no se necesitan computadores en la sede. Enlace: </w:t>
+      </w:r>
+      <w:hyperlink r:id="rId9">
+        <w:r>
+          <w:rPr>
+            <w:color w:val="0563C1"/>
+            <w:u w:val="single"/>
+            <w:b/>
+            <w:sz w:val="26"/>
+          </w:rPr>
+          <w:t>efset.org/ef-set-50</w:t>
+        </w:r>
+      </w:hyperlink>
+    </w:p>
+    <w:p>
+      <w:pPr>
+        <w:spacing w:after="60"/>
+      </w:pPr>
+      <w:r>
+        <w:rPr>
+          <w:b w:val="0"/>
+          <w:sz w:val="24"/>
+        </w:rPr>
+        <w:t>1. Al matricular, se le dice: "Tu evaluación de ingreso toma 50 minutos. ¿Los tienes ahora, o la agendamos hoy o mañana?"</w:t>
+      </w:r>
+    </w:p>
+    <w:p>
+      <w:pPr>
+        <w:spacing w:after="60"/>
+      </w:pPr>
+      <w:r>
+        <w:rPr>
+          <w:b w:val="0"/>
+          <w:sz w:val="24"/>
+        </w:rPr>
+        <w:t>2. Se hace en VIDEOLLAMADA supervisada: CÁMARA PRENDIDA y PANTALLA COMPARTIDA durante todo el examen. Varios estudiantes pueden hacerlo a la vez en una misma videollamada (cámaras prendidas, micrófonos apagados) — una sola persona supervisa.</w:t>
+      </w:r>
+    </w:p>
+    <w:p>
+      <w:pPr>
+        <w:spacing w:after="60"/>
+      </w:pPr>
+      <w:r>
+        <w:rPr>
+          <w:b w:val="0"/>
+          <w:sz w:val="24"/>
+        </w:rPr>
+        <w:t>3. Reglas de pantalla: la página está en inglés — el botón grande siempre avanza; al inicio hay prueba de sonido ("Continue" = continuar); y AVISA ANTES de arrancar: "al final te pide nombre, teléfono, correo y año de nacimiento — llénalos de una, sin pausa, o se cierra la sesión".</w:t>
+      </w:r>
+    </w:p>
+    <w:p>
+      <w:pPr>
+        <w:spacing w:after="60"/>
+      </w:pPr>
+      <w:r>
+        <w:rPr>
+          <w:b w:val="0"/>
+          <w:sz w:val="24"/>
+        </w:rPr>
+        <w:t>4. El resultado da nivel exacto y certificado: se guarda en la carpeta del estudiante — es la línea base FIRMADA de la garantía.</w:t>
+      </w:r>
+    </w:p>
+    <w:p>
+      <w:pPr>
+        <w:spacing w:after="60"/>
+      </w:pPr>
+      <w:r>
+        <w:rPr>
+          <w:b w:val="0"/>
+          <w:sz w:val="24"/>
+        </w:rPr>
+        <w:t>5. Si el estudiante no tiene equipo en casa: se le agenda el computador de la sede.</w:t>
+      </w:r>
+    </w:p>
+    <w:p>
+      <w:pPr>
+        <w:spacing w:before="140" w:after="60"/>
+      </w:pPr>
+      <w:r>
+        <w:rPr>
+          <w:b/>
+          <w:color w:val="222222"/>
+          <w:sz w:val="27"/>
+        </w:rPr>
+        <w:t>Con el resultado de la mini-oral, qué se ofrece</w:t>
       </w:r>
     </w:p>
     <w:tbl>

</xml_diff>

<commit_message>
Sesion de ubicacion ANTES de decidir (ya-se-algo): EF SET 50 min supervisado + mini-oral con profe apenas termina, misma videollamada, cierre mismo dia con nivel exacto; el EF SET dobla como linea base de garantia (no se repite); cero = cierre directo, su EF SET al matricular
Co-Authored-By: Claude Fable 5 <noreply@anthropic.com>
Claude-Session: https://claude.ai/code/session_018H7C5dx3NvDfXiv3CfhPMa
</commit_message>
<xml_diff>
--- a/recursos/comercial/INDUCCION_COMERCIAL/KIT_DE_VENTA_ASESORAS.docx
+++ b/recursos/comercial/INDUCCION_COMERCIAL/KIT_DE_VENTA_ASESORAS.docx
@@ -318,7 +318,7 @@
               <w:rPr>
                 <w:sz w:val="23"/>
               </w:rPr>
-              <w:t>Se hace la PRUEBA DE UBICACIÓN (ver sección 2) y se cierra en su nivel.</w:t>
+              <w:t>Se agenda la SESIÓN DE UBICACIÓN (ver sección 2) — ideal el mismo día — y se cierra con el nivel exacto en la mano. Cupo congelado con abono.</w:t>
             </w:r>
           </w:p>
         </w:tc>
@@ -1058,6 +1058,18 @@
     </w:p>
     <w:p>
       <w:pPr>
+        <w:spacing w:after="60"/>
+      </w:pPr>
+      <w:r>
+        <w:rPr>
+          <w:b/>
+          <w:sz w:val="24"/>
+        </w:rPr>
+        <w:t>Regla nueva: el que "ya sabe algo" tiene su resultado COMPLETO antes de matricularse o decidir — así el contrato nace con el nivel exacto y nunca hay devoluciones ni cobros sorpresa.</w:t>
+      </w:r>
+    </w:p>
+    <w:p>
+      <w:pPr>
         <w:spacing w:before="140" w:after="60"/>
       </w:pPr>
       <w:r>
@@ -1066,7 +1078,7 @@
           <w:color w:val="222222"/>
           <w:sz w:val="27"/>
         </w:rPr>
-        <w:t>En la cita: SOLO la mini-oral de 5 minutos (la aplica UN PROFE, presencial o por videollamada)</w:t>
+        <w:t>LA SESIÓN DE UBICACIÓN (~1 hora, por videollamada, ANTES de decidir)</w:t>
       </w:r>
     </w:p>
     <w:p>
@@ -1075,10 +1087,94 @@
       </w:pPr>
       <w:r>
         <w:rPr>
-          <w:b/>
+          <w:b w:val="0"/>
           <w:sz w:val="24"/>
         </w:rPr>
-        <w:t>En la cita NO se hace examen escrito — un test largo y difícil golpea al prospecto justo antes de decidir. La mini-oral se siente como una conversación, y es la que define el nivel.</w:t>
+        <w:t>Se agenda desde la cita, lo antes posible — ideal el mismo día: "¿Tienes 50 minutos ahora saliendo de aquí, o esta tarde?". Para congelar el cupo y el precio de lanzamiento mientras tanto: abono de separación (ej. $300.000, se cruza con la matrícula).</w:t>
+      </w:r>
+    </w:p>
+    <w:p>
+      <w:pPr>
+        <w:spacing w:after="60"/>
+      </w:pPr>
+      <w:r>
+        <w:rPr>
+          <w:b w:val="0"/>
+          <w:sz w:val="24"/>
+        </w:rPr>
+        <w:t xml:space="preserve">1. El prospecto hace el examen internacional EF SET de 50 minutos (gratis y ADAPTATIVO: ajusta la dificultad al nivel — no maltrata a nadie), desde su casa. Enlace: </w:t>
+      </w:r>
+      <w:hyperlink r:id="rId9">
+        <w:r>
+          <w:rPr>
+            <w:color w:val="0563C1"/>
+            <w:u w:val="single"/>
+            <w:b/>
+            <w:sz w:val="26"/>
+          </w:rPr>
+          <w:t>efset.org/ef-set-50</w:t>
+        </w:r>
+      </w:hyperlink>
+    </w:p>
+    <w:p>
+      <w:pPr>
+        <w:spacing w:after="60"/>
+      </w:pPr>
+      <w:r>
+        <w:rPr>
+          <w:b w:val="0"/>
+          <w:sz w:val="24"/>
+        </w:rPr>
+        <w:t>2. TODO el examen en videollamada supervisada: CÁMARA PRENDIDA y PANTALLA COMPARTIDA. (Varios prospectos pueden hacerlo a la vez en una misma videollamada, cámaras prendidas, micrófonos apagados.)</w:t>
+      </w:r>
+    </w:p>
+    <w:p>
+      <w:pPr>
+        <w:spacing w:after="60"/>
+      </w:pPr>
+      <w:r>
+        <w:rPr>
+          <w:b w:val="0"/>
+          <w:sz w:val="24"/>
+        </w:rPr>
+        <w:t>3. Reglas de pantalla (la página está en inglés): el botón grande siempre avanza; al inicio hay prueba de sonido ("Continue" = continuar); y AVISA ANTES de arrancar: "al final te pide nombre, teléfono, correo y año de nacimiento — llénalos de una, sin pausa, o se cierra la sesión".</w:t>
+      </w:r>
+    </w:p>
+    <w:p>
+      <w:pPr>
+        <w:spacing w:after="60"/>
+      </w:pPr>
+      <w:r>
+        <w:rPr>
+          <w:b w:val="0"/>
+          <w:sz w:val="24"/>
+        </w:rPr>
+        <w:t>4. COORDINA CON EL PROFE DESDE ANTES: apenas termina el test, el profe entra a la MISMA videollamada y hace la mini-oral de 5 minutos (abajo). Todo queda resuelto en una sola sesión.</w:t>
+      </w:r>
+    </w:p>
+    <w:p>
+      <w:pPr>
+        <w:spacing w:after="60"/>
+      </w:pPr>
+      <w:r>
+        <w:rPr>
+          <w:b w:val="0"/>
+          <w:sz w:val="24"/>
+        </w:rPr>
+        <w:t>5. Con los dos resultados, la asesora llama a cerrar EL MISMO DÍA: "ya tienes tu nivel exacto — tu programa queda en $X. ¿Firmamos?".</w:t>
+      </w:r>
+    </w:p>
+    <w:p>
+      <w:pPr>
+        <w:spacing w:before="140" w:after="60"/>
+      </w:pPr>
+      <w:r>
+        <w:rPr>
+          <w:b/>
+          <w:color w:val="222222"/>
+          <w:sz w:val="27"/>
+        </w:rPr>
+        <w:t>La mini-oral de 5 minutos (la aplica UN PROFE, apenas termina el test)</w:t>
       </w:r>
     </w:p>
     <w:p>
@@ -1350,7 +1446,7 @@
                 <w:i/>
                 <w:sz w:val="25"/>
               </w:rPr>
-              <w:t>REGLA CLAVE: el nivel = el último donde respondió cómodo. Si hay duda entre dos niveles, se ubica en el MENOR: "vamos a asegurar tu base — subir de grupo siempre se puede, y la reubicación no te cuesta nada".</w:t>
+              <w:t>REGLA CLAVE: entre el test de 50 minutos y la oral, MANDA LA MENOR. El que lee bien pero habla A2, se ubica por lo que HABLA: "vamos a asegurar tu base — subir de grupo siempre se puede, y la reubicación no te cuesta nada".</w:t>
             </w:r>
           </w:p>
         </w:tc>
@@ -1368,19 +1464,6 @@
     </w:p>
     <w:p>
       <w:pPr>
-        <w:spacing w:before="140" w:after="60"/>
-      </w:pPr>
-      <w:r>
-        <w:rPr>
-          <w:b/>
-          <w:color w:val="222222"/>
-          <w:sz w:val="27"/>
-        </w:rPr>
-        <w:t>¿Y si no hay profe disponible en la cita? (regla de plata)</w:t>
-      </w:r>
-    </w:p>
-    <w:p>
-      <w:pPr>
         <w:spacing w:after="60"/>
       </w:pPr>
       <w:r>
@@ -1388,55 +1471,7 @@
           <w:b/>
           <w:sz w:val="24"/>
         </w:rPr>
-        <w:t>NO se firma contrato de nivel todavía. Se hace esto:</w:t>
-      </w:r>
-    </w:p>
-    <w:p>
-      <w:pPr>
-        <w:spacing w:after="60"/>
-      </w:pPr>
-      <w:r>
-        <w:rPr>
-          <w:b w:val="0"/>
-          <w:sz w:val="24"/>
-        </w:rPr>
-        <w:t>1. Se SEPARA EL CUPO con un abono (ej. $300.000, que se cruza con la matrícula).</w:t>
-      </w:r>
-    </w:p>
-    <w:p>
-      <w:pPr>
-        <w:spacing w:after="60"/>
-      </w:pPr>
-      <w:r>
-        <w:rPr>
-          <w:b w:val="0"/>
-          <w:sz w:val="24"/>
-        </w:rPr>
-        <w:t>2. Le muestras los DOS precios posibles: "si confirmas B1 queda en $X; si confirmas B2, en $Y — no pierdes en ningún caso".</w:t>
-      </w:r>
-    </w:p>
-    <w:p>
-      <w:pPr>
-        <w:spacing w:after="60"/>
-      </w:pPr>
-      <w:r>
-        <w:rPr>
-          <w:b w:val="0"/>
-          <w:sz w:val="24"/>
-        </w:rPr>
-        <w:t>3. La mini-oral se hace el día 1 (o por videollamada de 5 minutos en 48 horas) y AHÍ se firma el paquete correcto.</w:t>
-      </w:r>
-    </w:p>
-    <w:p>
-      <w:pPr>
-        <w:spacing w:after="60"/>
-      </w:pPr>
-      <w:r>
-        <w:rPr>
-          <w:b/>
-          <w:sz w:val="24"/>
-        </w:rPr>
-        <w:t>Así nunca hay devoluciones ni cobros sorpresa. Los ajustes, si los hay, siempre en servicios — nunca en dinero.</w:t>
+        <w:t>El EF SET de la sesión queda guardado en la carpeta del prospecto: cuando se matricula, ese MISMO resultado es la línea base FIRMADA de su garantía — no se repite. Si el prospecto no tiene equipo en casa: se le agenda el computador de la sede.</w:t>
       </w:r>
     </w:p>
     <w:p>
@@ -1449,7 +1484,7 @@
           <w:color w:val="222222"/>
           <w:sz w:val="27"/>
         </w:rPr>
-        <w:t>Después de matricular: la evaluación de ingreso oficial (la de la garantía)</w:t>
+        <w:t>¿Y el que empieza de cero?</w:t>
       </w:r>
     </w:p>
     <w:p>
@@ -1461,78 +1496,7 @@
           <w:b w:val="0"/>
           <w:sz w:val="24"/>
         </w:rPr>
-        <w:t xml:space="preserve">Es el examen internacional EF SET de 50 minutos (gratis y ADAPTATIVO: ajusta la dificultad al nivel de la persona, no maltrata al principiante). Se hace ANTES de la primera clase, desde la casa del estudiante — no se necesitan computadores en la sede. Enlace: </w:t>
-      </w:r>
-      <w:hyperlink r:id="rId9">
-        <w:r>
-          <w:rPr>
-            <w:color w:val="0563C1"/>
-            <w:u w:val="single"/>
-            <w:b/>
-            <w:sz w:val="26"/>
-          </w:rPr>
-          <w:t>efset.org/ef-set-50</w:t>
-        </w:r>
-      </w:hyperlink>
-    </w:p>
-    <w:p>
-      <w:pPr>
-        <w:spacing w:after="60"/>
-      </w:pPr>
-      <w:r>
-        <w:rPr>
-          <w:b w:val="0"/>
-          <w:sz w:val="24"/>
-        </w:rPr>
-        <w:t>1. Al matricular, se le dice: "Tu evaluación de ingreso toma 50 minutos. ¿Los tienes ahora, o la agendamos hoy o mañana?"</w:t>
-      </w:r>
-    </w:p>
-    <w:p>
-      <w:pPr>
-        <w:spacing w:after="60"/>
-      </w:pPr>
-      <w:r>
-        <w:rPr>
-          <w:b w:val="0"/>
-          <w:sz w:val="24"/>
-        </w:rPr>
-        <w:t>2. Se hace en VIDEOLLAMADA supervisada: CÁMARA PRENDIDA y PANTALLA COMPARTIDA durante todo el examen. Varios estudiantes pueden hacerlo a la vez en una misma videollamada (cámaras prendidas, micrófonos apagados) — una sola persona supervisa.</w:t>
-      </w:r>
-    </w:p>
-    <w:p>
-      <w:pPr>
-        <w:spacing w:after="60"/>
-      </w:pPr>
-      <w:r>
-        <w:rPr>
-          <w:b w:val="0"/>
-          <w:sz w:val="24"/>
-        </w:rPr>
-        <w:t>3. Reglas de pantalla: la página está en inglés — el botón grande siempre avanza; al inicio hay prueba de sonido ("Continue" = continuar); y AVISA ANTES de arrancar: "al final te pide nombre, teléfono, correo y año de nacimiento — llénalos de una, sin pausa, o se cierra la sesión".</w:t>
-      </w:r>
-    </w:p>
-    <w:p>
-      <w:pPr>
-        <w:spacing w:after="60"/>
-      </w:pPr>
-      <w:r>
-        <w:rPr>
-          <w:b w:val="0"/>
-          <w:sz w:val="24"/>
-        </w:rPr>
-        <w:t>4. El resultado da nivel exacto y certificado: se guarda en la carpeta del estudiante — es la línea base FIRMADA de la garantía.</w:t>
-      </w:r>
-    </w:p>
-    <w:p>
-      <w:pPr>
-        <w:spacing w:after="60"/>
-      </w:pPr>
-      <w:r>
-        <w:rPr>
-          <w:b w:val="0"/>
-          <w:sz w:val="24"/>
-        </w:rPr>
-        <w:t>5. Si el estudiante no tiene equipo en casa: se le agenda el computador de la sede.</w:t>
+        <w:t>Cierre directo en la cita, sin ninguna prueba antes (no hay riesgo de paquete equivocado: arranca en A1). Su EF SET de 50 minutos lo hace AL MATRICULAR, antes de la primera clase, con el mismo protocolo de videollamada supervisada — esa es su línea base de la garantía. También sirve la sesión grupal.</w:t>
       </w:r>
     </w:p>
     <w:p>
@@ -1545,7 +1509,7 @@
           <w:color w:val="222222"/>
           <w:sz w:val="27"/>
         </w:rPr>
-        <w:t>Con el resultado de la mini-oral, qué se ofrece</w:t>
+        <w:t>Con la ubicación, qué se ofrece</w:t>
       </w:r>
     </w:p>
     <w:tbl>
@@ -1671,7 +1635,7 @@
               <w:rPr>
                 <w:sz w:val="23"/>
               </w:rPr>
-              <w:t>Solo B2 con Fondo — SIEMPRE con la mini-oral hecha antes de firmar</w:t>
+              <w:t>Solo B2 con Fondo — SIEMPRE con la sesión de ubicación completa antes de firmar</w:t>
             </w:r>
           </w:p>
         </w:tc>

</xml_diff>

<commit_message>
Becas en pesos (matriz hibrida sobre precios del Excel de Diana, verificado): tabla contado/cuotas por paquete x perfil, escalera de pago anti-financiacion directa (contado>Cajasan>tarjeta>credito 1.9pct con pagare), cuota tipo inicial 20pct, vigencia 72h / 7 dias con abono; kit + tarjeta actualizados; Excel de precios como motor interno de cuotas
Co-Authored-By: Claude Fable 5 <noreply@anthropic.com>
Claude-Session: https://claude.ai/code/session_018H7C5dx3NvDfXiv3CfhPMa
</commit_message>
<xml_diff>
--- a/recursos/comercial/INDUCCION_COMERCIAL/KIT_DE_VENTA_ASESORAS.docx
+++ b/recursos/comercial/INDUCCION_COMERCIAL/KIT_DE_VENTA_ASESORAS.docx
@@ -2193,6 +2193,1098 @@
     </w:p>
     <w:p>
       <w:pPr>
+        <w:spacing w:after="60"/>
+      </w:pPr>
+      <w:r>
+        <w:rPr>
+          <w:b w:val="0"/>
+          <w:sz w:val="24"/>
+        </w:rPr>
+        <w:t>Niveles sueltos: SIN beca del Fondo — aplican descuento por forma de pago (contado 20% · cuotas 10% + interés · Cajasan 30%). El sabatino solo se vende por nivel suelto.</w:t>
+      </w:r>
+    </w:p>
+    <w:p>
+      <w:r>
+        <w:br w:type="page"/>
+      </w:r>
+    </w:p>
+    <w:p>
+      <w:pPr>
+        <w:spacing w:before="140" w:after="60"/>
+      </w:pPr>
+      <w:r>
+        <w:rPr>
+          <w:b/>
+          <w:color w:val="222222"/>
+          <w:sz w:val="27"/>
+        </w:rPr>
+        <w:t>La tabla en PESOS (buscar la celda y decir el número — NO calcular)</w:t>
+      </w:r>
+    </w:p>
+    <w:tbl>
+      <w:tblPr>
+        <w:tblStyle w:val="TableGrid"/>
+        <w:tblW w:type="auto" w:w="0"/>
+        <w:tblLook w:firstColumn="1" w:firstRow="1" w:lastColumn="0" w:lastRow="0" w:noHBand="0" w:noVBand="1" w:val="04A0"/>
+      </w:tblPr>
+      <w:tblGrid>
+        <w:gridCol w:w="2493"/>
+        <w:gridCol w:w="2493"/>
+        <w:gridCol w:w="2493"/>
+        <w:gridCol w:w="2493"/>
+      </w:tblGrid>
+      <w:tr>
+        <w:tc>
+          <w:tcPr>
+            <w:tcW w:type="dxa" w:w="2493"/>
+            <w:shd w:val="clear" w:fill="E54C09"/>
+          </w:tcPr>
+          <w:p>
+            <w:r>
+              <w:rPr>
+                <w:b/>
+                <w:color w:val="FFFFFF"/>
+                <w:sz w:val="23"/>
+              </w:rPr>
+              <w:t>Compra (precio full)</w:t>
+            </w:r>
+          </w:p>
+        </w:tc>
+        <w:tc>
+          <w:tcPr>
+            <w:tcW w:type="dxa" w:w="2493"/>
+            <w:shd w:val="clear" w:fill="E54C09"/>
+          </w:tcPr>
+          <w:p>
+            <w:r>
+              <w:rPr>
+                <w:b/>
+                <w:color w:val="FFFFFF"/>
+                <w:sz w:val="23"/>
+              </w:rPr>
+              <w:t>TRANSFORMACIÓN</w:t>
+            </w:r>
+          </w:p>
+        </w:tc>
+        <w:tc>
+          <w:tcPr>
+            <w:tcW w:type="dxa" w:w="2493"/>
+            <w:shd w:val="clear" w:fill="E54C09"/>
+          </w:tcPr>
+          <w:p>
+            <w:r>
+              <w:rPr>
+                <w:b/>
+                <w:color w:val="FFFFFF"/>
+                <w:sz w:val="23"/>
+              </w:rPr>
+              <w:t>GENERAL</w:t>
+            </w:r>
+          </w:p>
+        </w:tc>
+        <w:tc>
+          <w:tcPr>
+            <w:tcW w:type="dxa" w:w="2493"/>
+            <w:shd w:val="clear" w:fill="E54C09"/>
+          </w:tcPr>
+          <w:p>
+            <w:r>
+              <w:rPr>
+                <w:b/>
+                <w:color w:val="FFFFFF"/>
+                <w:sz w:val="23"/>
+              </w:rPr>
+              <w:t>EJECUTIVO</w:t>
+            </w:r>
+          </w:p>
+        </w:tc>
+      </w:tr>
+      <w:tr>
+        <w:tc>
+          <w:tcPr>
+            <w:tcW w:type="dxa" w:w="2493"/>
+          </w:tcPr>
+          <w:p>
+            <w:r>
+              <w:rPr>
+                <w:sz w:val="23"/>
+              </w:rPr>
+              <w:t>A1 a B2 completo</w:t>
+            </w:r>
+          </w:p>
+          <w:p>
+            <w:r>
+              <w:rPr>
+                <w:sz w:val="23"/>
+              </w:rPr>
+              <w:t>full $8.696.000</w:t>
+            </w:r>
+          </w:p>
+        </w:tc>
+        <w:tc>
+          <w:tcPr>
+            <w:tcW w:type="dxa" w:w="2493"/>
+          </w:tcPr>
+          <w:p>
+            <w:r>
+              <w:rPr>
+                <w:sz w:val="23"/>
+              </w:rPr>
+              <w:t>Contado $4.782.800</w:t>
+            </w:r>
+          </w:p>
+          <w:p>
+            <w:r>
+              <w:rPr>
+                <w:sz w:val="23"/>
+              </w:rPr>
+              <w:t>Cuotas $5.565.440</w:t>
+            </w:r>
+          </w:p>
+        </w:tc>
+        <w:tc>
+          <w:tcPr>
+            <w:tcW w:type="dxa" w:w="2493"/>
+          </w:tcPr>
+          <w:p>
+            <w:r>
+              <w:rPr>
+                <w:sz w:val="23"/>
+              </w:rPr>
+              <w:t>Contado $5.913.280</w:t>
+            </w:r>
+          </w:p>
+          <w:p>
+            <w:r>
+              <w:rPr>
+                <w:sz w:val="23"/>
+              </w:rPr>
+              <w:t>Cuotas $6.469.824</w:t>
+            </w:r>
+          </w:p>
+        </w:tc>
+        <w:tc>
+          <w:tcPr>
+            <w:tcW w:type="dxa" w:w="2493"/>
+          </w:tcPr>
+          <w:p>
+            <w:r>
+              <w:rPr>
+                <w:sz w:val="23"/>
+              </w:rPr>
+              <w:t>Contado $7.391.600</w:t>
+            </w:r>
+          </w:p>
+          <w:p>
+            <w:r>
+              <w:rPr>
+                <w:sz w:val="23"/>
+              </w:rPr>
+              <w:t>Cuotas $7.652.480</w:t>
+            </w:r>
+          </w:p>
+        </w:tc>
+      </w:tr>
+      <w:tr>
+        <w:tc>
+          <w:tcPr>
+            <w:tcW w:type="dxa" w:w="2493"/>
+          </w:tcPr>
+          <w:p>
+            <w:r>
+              <w:rPr>
+                <w:sz w:val="23"/>
+              </w:rPr>
+              <w:t>A2 a B2</w:t>
+            </w:r>
+          </w:p>
+          <w:p>
+            <w:r>
+              <w:rPr>
+                <w:sz w:val="23"/>
+              </w:rPr>
+              <w:t>full $7.100.000</w:t>
+            </w:r>
+          </w:p>
+        </w:tc>
+        <w:tc>
+          <w:tcPr>
+            <w:tcW w:type="dxa" w:w="2493"/>
+          </w:tcPr>
+          <w:p>
+            <w:r>
+              <w:rPr>
+                <w:sz w:val="23"/>
+              </w:rPr>
+              <w:t>Contado $4.544.000</w:t>
+            </w:r>
+          </w:p>
+          <w:p>
+            <w:r>
+              <w:rPr>
+                <w:sz w:val="23"/>
+              </w:rPr>
+              <w:t>Cuotas $5.183.000</w:t>
+            </w:r>
+          </w:p>
+        </w:tc>
+        <w:tc>
+          <w:tcPr>
+            <w:tcW w:type="dxa" w:w="2493"/>
+          </w:tcPr>
+          <w:p>
+            <w:r>
+              <w:rPr>
+                <w:sz w:val="23"/>
+              </w:rPr>
+              <w:t>Contado $5.282.400</w:t>
+            </w:r>
+          </w:p>
+          <w:p>
+            <w:r>
+              <w:rPr>
+                <w:sz w:val="23"/>
+              </w:rPr>
+              <w:t>Cuotas $5.736.800</w:t>
+            </w:r>
+          </w:p>
+        </w:tc>
+        <w:tc>
+          <w:tcPr>
+            <w:tcW w:type="dxa" w:w="2493"/>
+          </w:tcPr>
+          <w:p>
+            <w:r>
+              <w:rPr>
+                <w:sz w:val="23"/>
+              </w:rPr>
+              <w:t>Contado $6.248.000</w:t>
+            </w:r>
+          </w:p>
+          <w:p>
+            <w:r>
+              <w:rPr>
+                <w:sz w:val="23"/>
+              </w:rPr>
+              <w:t>Cuotas $6.461.000</w:t>
+            </w:r>
+          </w:p>
+        </w:tc>
+      </w:tr>
+      <w:tr>
+        <w:tc>
+          <w:tcPr>
+            <w:tcW w:type="dxa" w:w="2493"/>
+          </w:tcPr>
+          <w:p>
+            <w:r>
+              <w:rPr>
+                <w:sz w:val="23"/>
+              </w:rPr>
+              <w:t>B1 a B2</w:t>
+            </w:r>
+          </w:p>
+          <w:p>
+            <w:r>
+              <w:rPr>
+                <w:sz w:val="23"/>
+              </w:rPr>
+              <w:t>full $5.185.000</w:t>
+            </w:r>
+          </w:p>
+        </w:tc>
+        <w:tc>
+          <w:tcPr>
+            <w:tcW w:type="dxa" w:w="2493"/>
+          </w:tcPr>
+          <w:p>
+            <w:r>
+              <w:rPr>
+                <w:sz w:val="23"/>
+              </w:rPr>
+              <w:t>Contado $3.899.120</w:t>
+            </w:r>
+          </w:p>
+          <w:p>
+            <w:r>
+              <w:rPr>
+                <w:sz w:val="23"/>
+              </w:rPr>
+              <w:t>Cuotas $4.365.770</w:t>
+            </w:r>
+          </w:p>
+        </w:tc>
+        <w:tc>
+          <w:tcPr>
+            <w:tcW w:type="dxa" w:w="2493"/>
+          </w:tcPr>
+          <w:p>
+            <w:r>
+              <w:rPr>
+                <w:sz w:val="23"/>
+              </w:rPr>
+              <w:t>Contado $4.272.440</w:t>
+            </w:r>
+          </w:p>
+          <w:p>
+            <w:r>
+              <w:rPr>
+                <w:sz w:val="23"/>
+              </w:rPr>
+              <w:t>Cuotas $4.604.280</w:t>
+            </w:r>
+          </w:p>
+        </w:tc>
+        <w:tc>
+          <w:tcPr>
+            <w:tcW w:type="dxa" w:w="2493"/>
+          </w:tcPr>
+          <w:p>
+            <w:r>
+              <w:rPr>
+                <w:sz w:val="23"/>
+              </w:rPr>
+              <w:t>Contado $4.754.645</w:t>
+            </w:r>
+          </w:p>
+          <w:p>
+            <w:r>
+              <w:rPr>
+                <w:sz w:val="23"/>
+              </w:rPr>
+              <w:t>Cuotas $4.910.195</w:t>
+            </w:r>
+          </w:p>
+        </w:tc>
+      </w:tr>
+      <w:tr>
+        <w:tc>
+          <w:tcPr>
+            <w:tcW w:type="dxa" w:w="2493"/>
+          </w:tcPr>
+          <w:p>
+            <w:r>
+              <w:rPr>
+                <w:sz w:val="23"/>
+              </w:rPr>
+              <w:t>Solo B2</w:t>
+            </w:r>
+          </w:p>
+          <w:p>
+            <w:r>
+              <w:rPr>
+                <w:sz w:val="23"/>
+              </w:rPr>
+              <w:t>full $2.343.000</w:t>
+            </w:r>
+          </w:p>
+        </w:tc>
+        <w:tc>
+          <w:tcPr>
+            <w:tcW w:type="dxa" w:w="2493"/>
+          </w:tcPr>
+          <w:p>
+            <w:r>
+              <w:rPr>
+                <w:sz w:val="23"/>
+              </w:rPr>
+              <w:t>Contado $1.867.371</w:t>
+            </w:r>
+          </w:p>
+          <w:p>
+            <w:r>
+              <w:rPr>
+                <w:sz w:val="23"/>
+              </w:rPr>
+              <w:t>Cuotas $2.078.241</w:t>
+            </w:r>
+          </w:p>
+        </w:tc>
+        <w:tc>
+          <w:tcPr>
+            <w:tcW w:type="dxa" w:w="2493"/>
+          </w:tcPr>
+          <w:p>
+            <w:r>
+              <w:rPr>
+                <w:sz w:val="23"/>
+              </w:rPr>
+              <w:t>Contado $2.005.608</w:t>
+            </w:r>
+          </w:p>
+          <w:p>
+            <w:r>
+              <w:rPr>
+                <w:sz w:val="23"/>
+              </w:rPr>
+              <w:t>Cuotas $2.155.560</w:t>
+            </w:r>
+          </w:p>
+        </w:tc>
+        <w:tc>
+          <w:tcPr>
+            <w:tcW w:type="dxa" w:w="2493"/>
+          </w:tcPr>
+          <w:p>
+            <w:r>
+              <w:rPr>
+                <w:sz w:val="23"/>
+              </w:rPr>
+              <w:t>Contado $2.183.676</w:t>
+            </w:r>
+          </w:p>
+          <w:p>
+            <w:r>
+              <w:rPr>
+                <w:sz w:val="23"/>
+              </w:rPr>
+              <w:t>Cuotas $2.253.966</w:t>
+            </w:r>
+          </w:p>
+        </w:tc>
+      </w:tr>
+    </w:tbl>
+    <w:p>
+      <w:pPr>
+        <w:spacing w:after="0"/>
+      </w:pPr>
+      <w:r>
+        <w:rPr>
+          <w:sz w:val="8"/>
+        </w:rPr>
+      </w:r>
+    </w:p>
+    <w:p>
+      <w:pPr>
+        <w:spacing w:after="60"/>
+      </w:pPr>
+      <w:r>
+        <w:rPr>
+          <w:b w:val="0"/>
+          <w:sz w:val="24"/>
+        </w:rPr>
+        <w:t>El precio full NUNCA cambia — la beca lo baja según la celda. "Cuotas" es el precio BASE si paga a cuotas; los intereses del crédito directo van aparte (abajo).</w:t>
+      </w:r>
+    </w:p>
+    <w:p>
+      <w:pPr>
+        <w:spacing w:before="140" w:after="60"/>
+      </w:pPr>
+      <w:r>
+        <w:rPr>
+          <w:b/>
+          <w:color w:val="222222"/>
+          <w:sz w:val="27"/>
+        </w:rPr>
+        <w:t>Cómo se paga (ofrecer EN ESTE ORDEN — Heiiu evita financiar directo)</w:t>
+      </w:r>
+    </w:p>
+    <w:p>
+      <w:pPr>
+        <w:spacing w:after="60"/>
+      </w:pPr>
+      <w:r>
+        <w:rPr>
+          <w:b w:val="0"/>
+          <w:sz w:val="24"/>
+        </w:rPr>
+        <w:t>1. CONTADO (la mejor beca): transferencia, efectivo o tarjeta débito.</w:t>
+      </w:r>
+    </w:p>
+    <w:p>
+      <w:pPr>
+        <w:spacing w:after="60"/>
+      </w:pPr>
+      <w:r>
+        <w:rPr>
+          <w:b w:val="0"/>
+          <w:sz w:val="24"/>
+        </w:rPr>
+        <w:t>2. CAJASAN (si es afiliado): libranza por nómina, cuotas desde $160.000 — financia Cajasan, NO Heiiu. Única academia de inglés en Bucaramanga con este convenio.</w:t>
+      </w:r>
+    </w:p>
+    <w:p>
+      <w:pPr>
+        <w:spacing w:after="60"/>
+      </w:pPr>
+      <w:r>
+        <w:rPr>
+          <w:b w:val="0"/>
+          <w:sz w:val="24"/>
+        </w:rPr>
+        <w:t>3. TARJETA DE CRÉDITO del cliente: para Heiiu es pago de contado (aplica la beca de contado) y él difiere con su banco.</w:t>
+      </w:r>
+    </w:p>
+    <w:p>
+      <w:pPr>
+        <w:spacing w:after="60"/>
+      </w:pPr>
+      <w:r>
+        <w:rPr>
+          <w:b/>
+          <w:sz w:val="24"/>
+        </w:rPr>
+        <w:t>4. CRÉDITO DIRECTO HEIIU — ÚLTIMO recurso, solo si nada de lo anterior aplica: beca de cuotas + interés del 1,9% mensual sobre saldo. Reserva de $100.000-$150.000 el día 1 → cuota inicial (mínimo 20%) máximo a 3 días → cuotas mensuales desde el día 30. SIEMPRE con pagaré + carta de instrucciones + anexo plan de pagos firmados — sin firmas no hay crédito.</w:t>
+      </w:r>
+    </w:p>
+    <w:p>
+      <w:pPr>
+        <w:spacing w:before="140" w:after="60"/>
+      </w:pPr>
+      <w:r>
+        <w:rPr>
+          <w:b/>
+          <w:color w:val="222222"/>
+          <w:sz w:val="27"/>
+        </w:rPr>
+        <w:t>Si toca crédito directo: la cuota tipo (inicial 20% + el máximo de cuotas)</w:t>
+      </w:r>
+    </w:p>
+    <w:tbl>
+      <w:tblPr>
+        <w:tblStyle w:val="TableGrid"/>
+        <w:tblW w:type="auto" w:w="0"/>
+        <w:tblLook w:firstColumn="1" w:firstRow="1" w:lastColumn="0" w:lastRow="0" w:noHBand="0" w:noVBand="1" w:val="04A0"/>
+      </w:tblPr>
+      <w:tblGrid>
+        <w:gridCol w:w="2493"/>
+        <w:gridCol w:w="2493"/>
+        <w:gridCol w:w="2493"/>
+        <w:gridCol w:w="2493"/>
+      </w:tblGrid>
+      <w:tr>
+        <w:tc>
+          <w:tcPr>
+            <w:tcW w:type="dxa" w:w="2493"/>
+            <w:shd w:val="clear" w:fill="E54C09"/>
+          </w:tcPr>
+          <w:p>
+            <w:r>
+              <w:rPr>
+                <w:b/>
+                <w:color w:val="FFFFFF"/>
+                <w:sz w:val="23"/>
+              </w:rPr>
+              <w:t>Compra</w:t>
+            </w:r>
+          </w:p>
+        </w:tc>
+        <w:tc>
+          <w:tcPr>
+            <w:tcW w:type="dxa" w:w="2493"/>
+            <w:shd w:val="clear" w:fill="E54C09"/>
+          </w:tcPr>
+          <w:p>
+            <w:r>
+              <w:rPr>
+                <w:b/>
+                <w:color w:val="FFFFFF"/>
+                <w:sz w:val="23"/>
+              </w:rPr>
+              <w:t>TRANSFORMACIÓN</w:t>
+            </w:r>
+          </w:p>
+        </w:tc>
+        <w:tc>
+          <w:tcPr>
+            <w:tcW w:type="dxa" w:w="2493"/>
+            <w:shd w:val="clear" w:fill="E54C09"/>
+          </w:tcPr>
+          <w:p>
+            <w:r>
+              <w:rPr>
+                <w:b/>
+                <w:color w:val="FFFFFF"/>
+                <w:sz w:val="23"/>
+              </w:rPr>
+              <w:t>GENERAL</w:t>
+            </w:r>
+          </w:p>
+        </w:tc>
+        <w:tc>
+          <w:tcPr>
+            <w:tcW w:type="dxa" w:w="2493"/>
+            <w:shd w:val="clear" w:fill="E54C09"/>
+          </w:tcPr>
+          <w:p>
+            <w:r>
+              <w:rPr>
+                <w:b/>
+                <w:color w:val="FFFFFF"/>
+                <w:sz w:val="23"/>
+              </w:rPr>
+              <w:t>EJECUTIVO</w:t>
+            </w:r>
+          </w:p>
+        </w:tc>
+      </w:tr>
+      <w:tr>
+        <w:tc>
+          <w:tcPr>
+            <w:tcW w:type="dxa" w:w="2493"/>
+          </w:tcPr>
+          <w:p>
+            <w:r>
+              <w:rPr>
+                <w:sz w:val="23"/>
+              </w:rPr>
+              <w:t>A1 a B2 completo</w:t>
+            </w:r>
+          </w:p>
+          <w:p>
+            <w:r>
+              <w:rPr>
+                <w:sz w:val="23"/>
+              </w:rPr>
+              <w:t>(11 cuotas máx)</w:t>
+            </w:r>
+          </w:p>
+        </w:tc>
+        <w:tc>
+          <w:tcPr>
+            <w:tcW w:type="dxa" w:w="2493"/>
+          </w:tcPr>
+          <w:p>
+            <w:r>
+              <w:rPr>
+                <w:sz w:val="23"/>
+              </w:rPr>
+              <w:t>Inicial $1.113.088</w:t>
+            </w:r>
+          </w:p>
+          <w:p>
+            <w:r>
+              <w:rPr>
+                <w:sz w:val="23"/>
+              </w:rPr>
+              <w:t>+ 11 de $452.348</w:t>
+            </w:r>
+          </w:p>
+        </w:tc>
+        <w:tc>
+          <w:tcPr>
+            <w:tcW w:type="dxa" w:w="2493"/>
+          </w:tcPr>
+          <w:p>
+            <w:r>
+              <w:rPr>
+                <w:sz w:val="23"/>
+              </w:rPr>
+              <w:t>Inicial $1.293.965</w:t>
+            </w:r>
+          </w:p>
+          <w:p>
+            <w:r>
+              <w:rPr>
+                <w:sz w:val="23"/>
+              </w:rPr>
+              <w:t>+ 11 de $525.855</w:t>
+            </w:r>
+          </w:p>
+        </w:tc>
+        <w:tc>
+          <w:tcPr>
+            <w:tcW w:type="dxa" w:w="2493"/>
+          </w:tcPr>
+          <w:p>
+            <w:r>
+              <w:rPr>
+                <w:sz w:val="23"/>
+              </w:rPr>
+              <w:t>Inicial $1.530.496</w:t>
+            </w:r>
+          </w:p>
+          <w:p>
+            <w:r>
+              <w:rPr>
+                <w:sz w:val="23"/>
+              </w:rPr>
+              <w:t>+ 11 de $621.979</w:t>
+            </w:r>
+          </w:p>
+        </w:tc>
+      </w:tr>
+      <w:tr>
+        <w:tc>
+          <w:tcPr>
+            <w:tcW w:type="dxa" w:w="2493"/>
+          </w:tcPr>
+          <w:p>
+            <w:r>
+              <w:rPr>
+                <w:sz w:val="23"/>
+              </w:rPr>
+              <w:t>A2 a B2</w:t>
+            </w:r>
+          </w:p>
+          <w:p>
+            <w:r>
+              <w:rPr>
+                <w:sz w:val="23"/>
+              </w:rPr>
+              <w:t>(11 cuotas máx)</w:t>
+            </w:r>
+          </w:p>
+        </w:tc>
+        <w:tc>
+          <w:tcPr>
+            <w:tcW w:type="dxa" w:w="2493"/>
+          </w:tcPr>
+          <w:p>
+            <w:r>
+              <w:rPr>
+                <w:sz w:val="23"/>
+              </w:rPr>
+              <w:t>Inicial $1.036.600</w:t>
+            </w:r>
+          </w:p>
+          <w:p>
+            <w:r>
+              <w:rPr>
+                <w:sz w:val="23"/>
+              </w:rPr>
+              <w:t>+ 11 de $421.264</w:t>
+            </w:r>
+          </w:p>
+        </w:tc>
+        <w:tc>
+          <w:tcPr>
+            <w:tcW w:type="dxa" w:w="2493"/>
+          </w:tcPr>
+          <w:p>
+            <w:r>
+              <w:rPr>
+                <w:sz w:val="23"/>
+              </w:rPr>
+              <w:t>Inicial $1.147.360</w:t>
+            </w:r>
+          </w:p>
+          <w:p>
+            <w:r>
+              <w:rPr>
+                <w:sz w:val="23"/>
+              </w:rPr>
+              <w:t>+ 11 de $466.276</w:t>
+            </w:r>
+          </w:p>
+        </w:tc>
+        <w:tc>
+          <w:tcPr>
+            <w:tcW w:type="dxa" w:w="2493"/>
+          </w:tcPr>
+          <w:p>
+            <w:r>
+              <w:rPr>
+                <w:sz w:val="23"/>
+              </w:rPr>
+              <w:t>Inicial $1.292.200</w:t>
+            </w:r>
+          </w:p>
+          <w:p>
+            <w:r>
+              <w:rPr>
+                <w:sz w:val="23"/>
+              </w:rPr>
+              <w:t>+ 11 de $525.138</w:t>
+            </w:r>
+          </w:p>
+        </w:tc>
+      </w:tr>
+      <w:tr>
+        <w:tc>
+          <w:tcPr>
+            <w:tcW w:type="dxa" w:w="2493"/>
+          </w:tcPr>
+          <w:p>
+            <w:r>
+              <w:rPr>
+                <w:sz w:val="23"/>
+              </w:rPr>
+              <w:t>B1 a B2</w:t>
+            </w:r>
+          </w:p>
+          <w:p>
+            <w:r>
+              <w:rPr>
+                <w:sz w:val="23"/>
+              </w:rPr>
+              <w:t>(8 cuotas máx)</w:t>
+            </w:r>
+          </w:p>
+        </w:tc>
+        <w:tc>
+          <w:tcPr>
+            <w:tcW w:type="dxa" w:w="2493"/>
+          </w:tcPr>
+          <w:p>
+            <w:r>
+              <w:rPr>
+                <w:sz w:val="23"/>
+              </w:rPr>
+              <w:t>Inicial $873.154</w:t>
+            </w:r>
+          </w:p>
+          <w:p>
+            <w:r>
+              <w:rPr>
+                <w:sz w:val="23"/>
+              </w:rPr>
+              <w:t>+ 8 de $474.724</w:t>
+            </w:r>
+          </w:p>
+        </w:tc>
+        <w:tc>
+          <w:tcPr>
+            <w:tcW w:type="dxa" w:w="2493"/>
+          </w:tcPr>
+          <w:p>
+            <w:r>
+              <w:rPr>
+                <w:sz w:val="23"/>
+              </w:rPr>
+              <w:t>Inicial $920.856</w:t>
+            </w:r>
+          </w:p>
+          <w:p>
+            <w:r>
+              <w:rPr>
+                <w:sz w:val="23"/>
+              </w:rPr>
+              <w:t>+ 8 de $500.659</w:t>
+            </w:r>
+          </w:p>
+        </w:tc>
+        <w:tc>
+          <w:tcPr>
+            <w:tcW w:type="dxa" w:w="2493"/>
+          </w:tcPr>
+          <w:p>
+            <w:r>
+              <w:rPr>
+                <w:sz w:val="23"/>
+              </w:rPr>
+              <w:t>Inicial $982.039</w:t>
+            </w:r>
+          </w:p>
+          <w:p>
+            <w:r>
+              <w:rPr>
+                <w:sz w:val="23"/>
+              </w:rPr>
+              <w:t>+ 8 de $533.923</w:t>
+            </w:r>
+          </w:p>
+        </w:tc>
+      </w:tr>
+      <w:tr>
+        <w:tc>
+          <w:tcPr>
+            <w:tcW w:type="dxa" w:w="2493"/>
+          </w:tcPr>
+          <w:p>
+            <w:r>
+              <w:rPr>
+                <w:sz w:val="23"/>
+              </w:rPr>
+              <w:t>Solo B2</w:t>
+            </w:r>
+          </w:p>
+          <w:p>
+            <w:r>
+              <w:rPr>
+                <w:sz w:val="23"/>
+              </w:rPr>
+              <w:t>(4 cuotas máx)</w:t>
+            </w:r>
+          </w:p>
+        </w:tc>
+        <w:tc>
+          <w:tcPr>
+            <w:tcW w:type="dxa" w:w="2493"/>
+          </w:tcPr>
+          <w:p>
+            <w:r>
+              <w:rPr>
+                <w:sz w:val="23"/>
+              </w:rPr>
+              <w:t>Inicial $415.648</w:t>
+            </w:r>
+          </w:p>
+          <w:p>
+            <w:r>
+              <w:rPr>
+                <w:sz w:val="23"/>
+              </w:rPr>
+              <w:t>+ 4 de $435.577</w:t>
+            </w:r>
+          </w:p>
+        </w:tc>
+        <w:tc>
+          <w:tcPr>
+            <w:tcW w:type="dxa" w:w="2493"/>
+          </w:tcPr>
+          <w:p>
+            <w:r>
+              <w:rPr>
+                <w:sz w:val="23"/>
+              </w:rPr>
+              <w:t>Inicial $431.112</w:t>
+            </w:r>
+          </w:p>
+          <w:p>
+            <w:r>
+              <w:rPr>
+                <w:sz w:val="23"/>
+              </w:rPr>
+              <w:t>+ 4 de $451.783</w:t>
+            </w:r>
+          </w:p>
+        </w:tc>
+        <w:tc>
+          <w:tcPr>
+            <w:tcW w:type="dxa" w:w="2493"/>
+          </w:tcPr>
+          <w:p>
+            <w:r>
+              <w:rPr>
+                <w:sz w:val="23"/>
+              </w:rPr>
+              <w:t>Inicial $450.793</w:t>
+            </w:r>
+          </w:p>
+          <w:p>
+            <w:r>
+              <w:rPr>
+                <w:sz w:val="23"/>
+              </w:rPr>
+              <w:t>+ 4 de $472.407</w:t>
+            </w:r>
+          </w:p>
+        </w:tc>
+      </w:tr>
+    </w:tbl>
+    <w:p>
+      <w:pPr>
+        <w:spacing w:after="0"/>
+      </w:pPr>
+      <w:r>
+        <w:rPr>
+          <w:sz w:val="8"/>
+        </w:rPr>
+      </w:r>
+    </w:p>
+    <w:p>
+      <w:pPr>
+        <w:spacing w:after="60"/>
+      </w:pPr>
+      <w:r>
+        <w:rPr>
+          <w:b w:val="0"/>
+          <w:sz w:val="24"/>
+        </w:rPr>
+        <w:t>Cuotas máximas del INTENSIVO (10h/semana). El super intensivo dura menos y permite menos cuotas; para otra cuota inicial u otro número de cuotas: tabla interna de cuotas (Excel) — nunca calcular a mano frente al cliente.</w:t>
+      </w:r>
+    </w:p>
+    <w:p>
+      <w:pPr>
+        <w:spacing w:before="140" w:after="60"/>
+      </w:pPr>
+      <w:r>
+        <w:rPr>
+          <w:b/>
+          <w:color w:val="222222"/>
+          <w:sz w:val="27"/>
+        </w:rPr>
+        <w:t>Vigencia de la oferta (el "voy a buscar la plata")</w:t>
+      </w:r>
+    </w:p>
+    <w:p>
+      <w:pPr>
+        <w:spacing w:after="60"/>
+      </w:pPr>
+      <w:r>
+        <w:rPr>
+          <w:b w:val="0"/>
+          <w:sz w:val="24"/>
+        </w:rPr>
+        <w:t>· Toda beca aprobada sale POR ESCRITO (WhatsApp) con vencimiento: 72 HORAS. "Tu beca quedó aprobada por el Fondo hasta el [día] a las 6 PM."</w:t>
+      </w:r>
+    </w:p>
+    <w:p>
+      <w:pPr>
+        <w:spacing w:after="60"/>
+      </w:pPr>
+      <w:r>
+        <w:rPr>
+          <w:b w:val="0"/>
+          <w:sz w:val="24"/>
+        </w:rPr>
+        <w:t>· Con abono de separación ($300.000): cupo + precio CONGELADOS 7 días calendario. El abono es lo que compra tiempo.</w:t>
+      </w:r>
+    </w:p>
+    <w:p>
+      <w:pPr>
+        <w:spacing w:after="60"/>
+      </w:pPr>
+      <w:r>
+        <w:rPr>
+          <w:b w:val="0"/>
+          <w:sz w:val="24"/>
+        </w:rPr>
+        <w:t>· Sin abono, a las 72 horas la beca VENCE y vuelve al Fondo. Se puede volver a presentar la solicitud, pero sin garantizar el mismo porcentaje ni el cupo.</w:t>
+      </w:r>
+    </w:p>
+    <w:p>
+      <w:pPr>
+        <w:spacing w:after="60"/>
+      </w:pPr>
+      <w:r>
+        <w:rPr>
+          <w:b w:val="0"/>
+          <w:sz w:val="24"/>
+        </w:rPr>
+        <w:t>· Seguimiento pautado (no esperar a ver si vuelve): mismo día resumen escrito con número y vencimiento → +24h mensaje → +48h llamada → día 3: "vence hoy".</w:t>
+      </w:r>
+    </w:p>
+    <w:tbl>
+      <w:tblPr>
+        <w:tblStyle w:val="TableGrid"/>
+        <w:tblW w:type="auto" w:w="0"/>
+        <w:tblLook w:firstColumn="1" w:firstRow="1" w:lastColumn="0" w:lastRow="0" w:noHBand="0" w:noVBand="1" w:val="04A0"/>
+      </w:tblPr>
+      <w:tblGrid>
+        <w:gridCol w:w="9972"/>
+      </w:tblGrid>
+      <w:tr>
+        <w:tc>
+          <w:tcPr>
+            <w:tcW w:type="dxa" w:w="9972"/>
+            <w:shd w:val="clear" w:fill="FFF8E7"/>
+          </w:tcPr>
+          <w:p>
+            <w:r>
+              <w:rPr>
+                <w:i/>
+                <w:sz w:val="25"/>
+              </w:rPr>
+              <w:t>El escudo de la asesora: "Yo no puedo extenderla — el Fondo audita las fechas."</w:t>
+            </w:r>
+          </w:p>
+        </w:tc>
+      </w:tr>
+    </w:tbl>
+    <w:p>
+      <w:pPr>
+        <w:spacing w:after="0" w:before="0"/>
+      </w:pPr>
+      <w:r>
+        <w:rPr>
+          <w:sz w:val="8"/>
+        </w:rPr>
+      </w:r>
+    </w:p>
+    <w:p>
+      <w:pPr>
         <w:spacing w:before="140" w:after="60"/>
       </w:pPr>
       <w:r>

</xml_diff>

<commit_message>
Regla del credito: se termina de pagar ANTES de terminar el programa — max cuotas por modalidad (super intensivo 5/5/3, intensivo 11/11/8/4) en kit + tarjeta; motor v2 con dos bloques por hoja (pendiente reemplazar xlsx abierto)
Co-Authored-By: Claude Fable 5 <noreply@anthropic.com>
Claude-Session: https://claude.ai/code/session_018H7C5dx3NvDfXiv3CfhPMa
</commit_message>
<xml_diff>
--- a/recursos/comercial/INDUCCION_COMERCIAL/KIT_DE_VENTA_ASESORAS.docx
+++ b/recursos/comercial/INDUCCION_COMERCIAL/KIT_DE_VENTA_ASESORAS.docx
@@ -3179,10 +3179,46 @@
       </w:pPr>
       <w:r>
         <w:rPr>
+          <w:b/>
+          <w:sz w:val="24"/>
+        </w:rPr>
+        <w:t>REGLA DEL CRÉDITO: el estudiante termina de PAGAR antes de terminar el programa — por eso el máximo de cuotas depende de la modalidad.</w:t>
+      </w:r>
+    </w:p>
+    <w:p>
+      <w:pPr>
+        <w:spacing w:after="60"/>
+      </w:pPr>
+      <w:r>
+        <w:rPr>
           <w:b w:val="0"/>
           <w:sz w:val="24"/>
         </w:rPr>
-        <w:t>Cuotas máximas del INTENSIVO (10h/semana). El super intensivo dura menos y permite menos cuotas; para otra cuota inicial u otro número de cuotas: tabla interna de cuotas (Excel) — nunca calcular a mano frente al cliente.</w:t>
+        <w:t>· La tabla de arriba usa los máximos del INTENSIVO (10h/semana): completo ~14 meses, A2→B2 ~12, B1→B2 ~9, Solo B2 ~5.</w:t>
+      </w:r>
+    </w:p>
+    <w:p>
+      <w:pPr>
+        <w:spacing w:after="60"/>
+      </w:pPr>
+      <w:r>
+        <w:rPr>
+          <w:b w:val="0"/>
+          <w:sz w:val="24"/>
+        </w:rPr>
+        <w:t>· En SUPER INTENSIVO (20h/semana) el programa dura la mitad y las cuotas bajan: completo y A2→B2 máximo 5 cuotas · B1→B2 máximo 3 · Solo B2 prácticamente de contado.</w:t>
+      </w:r>
+    </w:p>
+    <w:p>
+      <w:pPr>
+        <w:spacing w:after="60"/>
+      </w:pPr>
+      <w:r>
+        <w:rPr>
+          <w:b w:val="0"/>
+          <w:sz w:val="24"/>
+        </w:rPr>
+        <w:t>Para otra cuota inicial u otro número de cuotas: MOTOR_CUOTAS_FONDO_2026.xlsx (interno) — nunca calcular a mano frente al cliente.</w:t>
       </w:r>
     </w:p>
     <w:p>

</xml_diff>

<commit_message>
Kit: objecion "es muy caro / Smart" con la cuenta por hora (~\$10.000/h el completo) — respuesta hablada, solo si el cliente saca el precio
Co-Authored-By: Claude Fable 5 <noreply@anthropic.com>
Claude-Session: https://claude.ai/code/session_018H7C5dx3NvDfXiv3CfhPMa
</commit_message>
<xml_diff>
--- a/recursos/comercial/INDUCCION_COMERCIAL/KIT_DE_VENTA_ASESORAS.docx
+++ b/recursos/comercial/INDUCCION_COMERCIAL/KIT_DE_VENTA_ASESORAS.docx
@@ -885,6 +885,34 @@
                 <w:sz w:val="23"/>
               </w:rPr>
               <w:t>"¿Descuento sobre qué precio? Pregunta el precio FINAL: con matrícula, con libros, con todo. El nuestro es uno solo y está completo — y con garantía firmada."</w:t>
+            </w:r>
+          </w:p>
+        </w:tc>
+      </w:tr>
+      <w:tr>
+        <w:tc>
+          <w:tcPr>
+            <w:tcW w:type="dxa" w:w="4986"/>
+          </w:tcPr>
+          <w:p>
+            <w:r>
+              <w:rPr>
+                <w:sz w:val="23"/>
+              </w:rPr>
+              <w:t>"Es muy caro" / "En Smart es más barato"</w:t>
+            </w:r>
+          </w:p>
+        </w:tc>
+        <w:tc>
+          <w:tcPr>
+            <w:tcW w:type="dxa" w:w="4986"/>
+          </w:tcPr>
+          <w:p>
+            <w:r>
+              <w:rPr>
+                <w:sz w:val="23"/>
+              </w:rPr>
+              <w:t>"Hagamos la cuenta real: el programa completo son 575 horas presenciales — te sale a poco más de $10.000 la hora de clase real, con libros, certificado y garantía firmada incluidos. Pídele a cualquier otra academia el precio FINAL y divídelo por las horas que de verdad te dan. Ahí comparamos." (Solo si el cliente saca el precio — nunca abrir con esto.)</w:t>
             </w:r>
           </w:p>
         </w:tc>

</xml_diff>

<commit_message>
Pago del Arranque definido: misma escalera, sin becas; credito directo super intensivo max 2 cuotas / intensivo max 4 (inicial 20pct = 598k -> 4 de 626.672); kit actualizado + hoja ARRANQUE en motor (xlsx pendiente de reemplazo, abierto)
Co-Authored-By: Claude Fable 5 <noreply@anthropic.com>
Claude-Session: https://claude.ai/code/session_018H7C5dx3NvDfXiv3CfhPMa
</commit_message>
<xml_diff>
--- a/recursos/comercial/INDUCCION_COMERCIAL/KIT_DE_VENTA_ASESORAS.docx
+++ b/recursos/comercial/INDUCCION_COMERCIAL/KIT_DE_VENTA_ASESORAS.docx
@@ -3259,6 +3259,240 @@
           <w:color w:val="222222"/>
           <w:sz w:val="27"/>
         </w:rPr>
+        <w:t>¿Y el ARRANQUE ($2.990.000)? Sin becas — pero misma escalera de pago</w:t>
+      </w:r>
+    </w:p>
+    <w:p>
+      <w:pPr>
+        <w:spacing w:after="60"/>
+      </w:pPr>
+      <w:r>
+        <w:rPr>
+          <w:b w:val="0"/>
+          <w:sz w:val="24"/>
+        </w:rPr>
+        <w:t>Contado, Cajasan o tarjeta: igual que arriba. Si toca crédito directo (1,9% mensual, reserva → inicial mín 20% a 3 días → cuotas desde día 30), el tope de cuotas sale de la duración (200 horas):</w:t>
+      </w:r>
+    </w:p>
+    <w:tbl>
+      <w:tblPr>
+        <w:tblStyle w:val="TableGrid"/>
+        <w:tblW w:type="auto" w:w="0"/>
+        <w:tblLook w:firstColumn="1" w:firstRow="1" w:lastColumn="0" w:lastRow="0" w:noHBand="0" w:noVBand="1" w:val="04A0"/>
+      </w:tblPr>
+      <w:tblGrid>
+        <w:gridCol w:w="2493"/>
+        <w:gridCol w:w="2493"/>
+        <w:gridCol w:w="2493"/>
+        <w:gridCol w:w="2493"/>
+      </w:tblGrid>
+      <w:tr>
+        <w:tc>
+          <w:tcPr>
+            <w:tcW w:type="dxa" w:w="2493"/>
+            <w:shd w:val="clear" w:fill="E54C09"/>
+          </w:tcPr>
+          <w:p>
+            <w:r>
+              <w:rPr>
+                <w:b/>
+                <w:color w:val="FFFFFF"/>
+                <w:sz w:val="23"/>
+              </w:rPr>
+              <w:t>Modalidad</w:t>
+            </w:r>
+          </w:p>
+        </w:tc>
+        <w:tc>
+          <w:tcPr>
+            <w:tcW w:type="dxa" w:w="2493"/>
+            <w:shd w:val="clear" w:fill="E54C09"/>
+          </w:tcPr>
+          <w:p>
+            <w:r>
+              <w:rPr>
+                <w:b/>
+                <w:color w:val="FFFFFF"/>
+                <w:sz w:val="23"/>
+              </w:rPr>
+              <w:t>Dura</w:t>
+            </w:r>
+          </w:p>
+        </w:tc>
+        <w:tc>
+          <w:tcPr>
+            <w:tcW w:type="dxa" w:w="2493"/>
+            <w:shd w:val="clear" w:fill="E54C09"/>
+          </w:tcPr>
+          <w:p>
+            <w:r>
+              <w:rPr>
+                <w:b/>
+                <w:color w:val="FFFFFF"/>
+                <w:sz w:val="23"/>
+              </w:rPr>
+              <w:t>Máx cuotas</w:t>
+            </w:r>
+          </w:p>
+        </w:tc>
+        <w:tc>
+          <w:tcPr>
+            <w:tcW w:type="dxa" w:w="2493"/>
+            <w:shd w:val="clear" w:fill="E54C09"/>
+          </w:tcPr>
+          <w:p>
+            <w:r>
+              <w:rPr>
+                <w:b/>
+                <w:color w:val="FFFFFF"/>
+                <w:sz w:val="23"/>
+              </w:rPr>
+              <w:t>Cuota tipo (inicial 20% = $598.000)</w:t>
+            </w:r>
+          </w:p>
+        </w:tc>
+      </w:tr>
+      <w:tr>
+        <w:tc>
+          <w:tcPr>
+            <w:tcW w:type="dxa" w:w="2493"/>
+          </w:tcPr>
+          <w:p>
+            <w:r>
+              <w:rPr>
+                <w:sz w:val="23"/>
+              </w:rPr>
+              <w:t>Super intensivo 20h/sem</w:t>
+            </w:r>
+          </w:p>
+        </w:tc>
+        <w:tc>
+          <w:tcPr>
+            <w:tcW w:type="dxa" w:w="2493"/>
+          </w:tcPr>
+          <w:p>
+            <w:r>
+              <w:rPr>
+                <w:sz w:val="23"/>
+              </w:rPr>
+              <w:t>~2,5 meses</w:t>
+            </w:r>
+          </w:p>
+        </w:tc>
+        <w:tc>
+          <w:tcPr>
+            <w:tcW w:type="dxa" w:w="2493"/>
+          </w:tcPr>
+          <w:p>
+            <w:r>
+              <w:rPr>
+                <w:sz w:val="23"/>
+              </w:rPr>
+              <w:t>2</w:t>
+            </w:r>
+          </w:p>
+        </w:tc>
+        <w:tc>
+          <w:tcPr>
+            <w:tcW w:type="dxa" w:w="2493"/>
+          </w:tcPr>
+          <w:p>
+            <w:r>
+              <w:rPr>
+                <w:sz w:val="23"/>
+              </w:rPr>
+              <w:t>2 cuotas de $1.230.193</w:t>
+            </w:r>
+          </w:p>
+        </w:tc>
+      </w:tr>
+      <w:tr>
+        <w:tc>
+          <w:tcPr>
+            <w:tcW w:type="dxa" w:w="2493"/>
+          </w:tcPr>
+          <w:p>
+            <w:r>
+              <w:rPr>
+                <w:sz w:val="23"/>
+              </w:rPr>
+              <w:t>Intensivo 10h/sem</w:t>
+            </w:r>
+          </w:p>
+        </w:tc>
+        <w:tc>
+          <w:tcPr>
+            <w:tcW w:type="dxa" w:w="2493"/>
+          </w:tcPr>
+          <w:p>
+            <w:r>
+              <w:rPr>
+                <w:sz w:val="23"/>
+              </w:rPr>
+              <w:t>~5 meses</w:t>
+            </w:r>
+          </w:p>
+        </w:tc>
+        <w:tc>
+          <w:tcPr>
+            <w:tcW w:type="dxa" w:w="2493"/>
+          </w:tcPr>
+          <w:p>
+            <w:r>
+              <w:rPr>
+                <w:sz w:val="23"/>
+              </w:rPr>
+              <w:t>4</w:t>
+            </w:r>
+          </w:p>
+        </w:tc>
+        <w:tc>
+          <w:tcPr>
+            <w:tcW w:type="dxa" w:w="2493"/>
+          </w:tcPr>
+          <w:p>
+            <w:r>
+              <w:rPr>
+                <w:sz w:val="23"/>
+              </w:rPr>
+              <w:t>4 cuotas de $626.672</w:t>
+            </w:r>
+          </w:p>
+        </w:tc>
+      </w:tr>
+    </w:tbl>
+    <w:p>
+      <w:pPr>
+        <w:spacing w:after="0"/>
+      </w:pPr>
+      <w:r>
+        <w:rPr>
+          <w:sz w:val="8"/>
+        </w:rPr>
+      </w:r>
+    </w:p>
+    <w:p>
+      <w:pPr>
+        <w:spacing w:after="60"/>
+      </w:pPr>
+      <w:r>
+        <w:rPr>
+          <w:b w:val="0"/>
+          <w:sz w:val="24"/>
+        </w:rPr>
+        <w:t>Con inicial del 50% ($1.495.000) el intensivo baja a 4 cuotas de $391.670. Otros escenarios: hoja ARRANQUE del motor de cuotas.</w:t>
+      </w:r>
+    </w:p>
+    <w:p>
+      <w:pPr>
+        <w:spacing w:before="140" w:after="60"/>
+      </w:pPr>
+      <w:r>
+        <w:rPr>
+          <w:b/>
+          <w:color w:val="222222"/>
+          <w:sz w:val="27"/>
+        </w:rPr>
         <w:t>Vigencia de la oferta (el "voy a buscar la plata")</w:t>
       </w:r>
     </w:p>

</xml_diff>

<commit_message>
Cajasan reformulado: pregunta+registro SIEMPRE (reporte sostiene alianza), beneficio afiliado a cuotas = beca de contado, libranza ELIMINADA de la escalera (Cajasan tiene programa propio de ingles - no publicidad gratis)
Co-Authored-By: Claude Fable 5 <noreply@anthropic.com>
Claude-Session: https://claude.ai/code/session_018H7C5dx3NvDfXiv3CfhPMa
</commit_message>
<xml_diff>
--- a/recursos/comercial/INDUCCION_COMERCIAL/KIT_DE_VENTA_ASESORAS.docx
+++ b/recursos/comercial/INDUCCION_COMERCIAL/KIT_DE_VENTA_ASESORAS.docx
@@ -2704,6 +2704,55 @@
           <w:color w:val="222222"/>
           <w:sz w:val="27"/>
         </w:rPr>
+        <w:t>CAJASAN: se pregunta SIEMPRE, se registra SIEMPRE</w:t>
+      </w:r>
+    </w:p>
+    <w:p>
+      <w:pPr>
+        <w:spacing w:after="60"/>
+      </w:pPr>
+      <w:r>
+        <w:rPr>
+          <w:b/>
+          <w:sz w:val="24"/>
+        </w:rPr>
+        <w:t>En TODA cita: "¿Eres afiliado a Cajasan?" — y se anota en su ficha, pague de contado o a cuotas: el reporte de afiliados atendidos es lo que mantiene viva la alianza (única academia de inglés con este convenio).</w:t>
+      </w:r>
+    </w:p>
+    <w:p>
+      <w:pPr>
+        <w:spacing w:after="60"/>
+      </w:pPr>
+      <w:r>
+        <w:rPr>
+          <w:b w:val="0"/>
+          <w:sz w:val="24"/>
+        </w:rPr>
+        <w:t>BENEFICIO DEL CONVENIO: el afiliado que paga a cuotas recibe la beca de CONTADO de su perfil (empleado formal = menos riesgo, el Fondo le sostiene el % pleno). Se verifica con carné o certificado de afiliación.</w:t>
+      </w:r>
+    </w:p>
+    <w:p>
+      <w:pPr>
+        <w:spacing w:after="60"/>
+      </w:pPr>
+      <w:r>
+        <w:rPr>
+          <w:b/>
+          <w:sz w:val="24"/>
+        </w:rPr>
+        <w:t>JAMÁS se le envía a pedir crédito o libranza a Cajasan: tienen su propio programa de inglés — no les hacemos publicidad.</w:t>
+      </w:r>
+    </w:p>
+    <w:p>
+      <w:pPr>
+        <w:spacing w:before="140" w:after="60"/>
+      </w:pPr>
+      <w:r>
+        <w:rPr>
+          <w:b/>
+          <w:color w:val="222222"/>
+          <w:sz w:val="27"/>
+        </w:rPr>
         <w:t>Cómo se paga (ofrecer EN ESTE ORDEN — Heiiu evita financiar directo)</w:t>
       </w:r>
     </w:p>
@@ -2728,19 +2777,7 @@
           <w:b w:val="0"/>
           <w:sz w:val="24"/>
         </w:rPr>
-        <w:t>2. CAJASAN (si es afiliado): libranza por nómina, cuotas desde $160.000 — financia Cajasan, NO Heiiu. Única academia de inglés en Bucaramanga con este convenio.</w:t>
-      </w:r>
-    </w:p>
-    <w:p>
-      <w:pPr>
-        <w:spacing w:after="60"/>
-      </w:pPr>
-      <w:r>
-        <w:rPr>
-          <w:b w:val="0"/>
-          <w:sz w:val="24"/>
-        </w:rPr>
-        <w:t>3. TARJETA DE CRÉDITO del cliente: para Heiiu es pago de contado (aplica la beca de contado) y él difiere con su banco.</w:t>
+        <w:t>2. TARJETA DE CRÉDITO del cliente: para Heiiu es pago de contado (aplica la beca de contado) y él difiere con su banco.</w:t>
       </w:r>
     </w:p>
     <w:p>
@@ -2752,7 +2789,7 @@
           <w:b/>
           <w:sz w:val="24"/>
         </w:rPr>
-        <w:t>4. CRÉDITO DIRECTO HEIIU — ÚLTIMO recurso, solo si nada de lo anterior aplica: beca de cuotas + interés del 1,9% mensual sobre saldo. Reserva de $100.000-$150.000 el día 1 → cuota inicial (mínimo 20%) máximo a 3 días → cuotas mensuales desde el día 30. SIEMPRE con pagaré + carta de instrucciones + anexo plan de pagos firmados — sin firmas no hay crédito.</w:t>
+        <w:t>3. CRÉDITO DIRECTO HEIIU — ÚLTIMO recurso, solo si nada de lo anterior aplica: beca de cuotas (o de contado si es afiliado Cajasan) + interés del 1,9% mensual sobre saldo. Reserva de $100.000-$150.000 el día 1 → cuota inicial (mínimo 20%) máximo a 3 días → cuotas mensuales desde el día 30. SIEMPRE con pagaré + carta de instrucciones + anexo plan de pagos firmados — sin firmas no hay crédito.</w:t>
       </w:r>
     </w:p>
     <w:p>

</xml_diff>

<commit_message>
Cierre de hilos: cohorte 5 oct (8-12 AM super / 6:30-8:30 PM intensivo, 17+, minimo 6, jornada la define el cliente no se empuja), separacion unificada \$300k en kit/tarjeta/guia/motor/bot, vigencia se CUMPLE, bot con datos confirmados, motor v3 con hoja Arranque en repo
Co-Authored-By: Claude Fable 5 <noreply@anthropic.com>
Claude-Session: https://claude.ai/code/session_018H7C5dx3NvDfXiv3CfhPMa
</commit_message>
<xml_diff>
--- a/recursos/comercial/INDUCCION_COMERCIAL/KIT_DE_VENTA_ASESORAS.docx
+++ b/recursos/comercial/INDUCCION_COMERCIAL/KIT_DE_VENTA_ASESORAS.docx
@@ -456,6 +456,55 @@
         <w:rPr>
           <w:sz w:val="8"/>
         </w:rPr>
+      </w:r>
+    </w:p>
+    <w:p>
+      <w:pPr>
+        <w:spacing w:before="140" w:after="60"/>
+      </w:pPr>
+      <w:r>
+        <w:rPr>
+          <w:b/>
+          <w:color w:val="222222"/>
+          <w:sz w:val="27"/>
+        </w:rPr>
+        <w:t>Jornadas del ARRANQUE (cohorte del 5 de octubre · desde 17 años)</w:t>
+      </w:r>
+    </w:p>
+    <w:p>
+      <w:pPr>
+        <w:spacing w:after="60"/>
+      </w:pPr>
+      <w:r>
+        <w:rPr>
+          <w:b w:val="0"/>
+          <w:sz w:val="24"/>
+        </w:rPr>
+        <w:t>· Mañana 8:00 AM-12:00 PM (super intensivo) o Noche 6:30-8:30 PM. 20 cupos en TOTAL.</w:t>
+      </w:r>
+    </w:p>
+    <w:p>
+      <w:pPr>
+        <w:spacing w:after="60"/>
+      </w:pPr>
+      <w:r>
+        <w:rPr>
+          <w:b/>
+          <w:sz w:val="24"/>
+        </w:rPr>
+        <w:t>· La jornada NO se empuja: la definen el horario del cliente y su bolsillo — la mañana es super intensivo (máx 2 cuotas), la noche es intensivo (hasta 4 cuotas). La asesora solo INFORMA cómo van: "el grupo de la mañana ya va en [N]".</w:t>
+      </w:r>
+    </w:p>
+    <w:p>
+      <w:pPr>
+        <w:spacing w:after="60"/>
+      </w:pPr>
+      <w:r>
+        <w:rPr>
+          <w:b w:val="0"/>
+          <w:sz w:val="24"/>
+        </w:rPr>
+        <w:t>· Cada jornada abre con grupo mínimo (6). Se le dice ANTES de firmar: "si tu jornada no completa el mínimo, eliges: te pasas a la otra o esperas la siguiente cohorte con tu cupo y precio congelados". Nunca de sorpresa después. La consolidación de grupos la decide gerencia al cierre de cupos.</w:t>
       </w:r>
     </w:p>
     <w:p>
@@ -2789,7 +2838,7 @@
           <w:b/>
           <w:sz w:val="24"/>
         </w:rPr>
-        <w:t>3. CRÉDITO DIRECTO HEIIU — ÚLTIMO recurso, solo si nada de lo anterior aplica: beca de cuotas (o de contado si es afiliado Cajasan) + interés del 1,9% mensual sobre saldo. Reserva de $100.000-$150.000 el día 1 → cuota inicial (mínimo 20%) máximo a 3 días → cuotas mensuales desde el día 30. SIEMPRE con pagaré + carta de instrucciones + anexo plan de pagos firmados — sin firmas no hay crédito.</w:t>
+        <w:t>3. CRÉDITO DIRECTO HEIIU — ÚLTIMO recurso, solo si nada de lo anterior aplica: beca de cuotas (o de contado si es afiliado Cajasan) + interés del 1,9% mensual sobre saldo. Separación de cupo $300.000 (se cruza con la inicial) → cuota inicial (mínimo 20%) máximo a 3 días → cuotas mensuales desde el día 30. SIEMPRE con pagaré + carta de instrucciones + anexo plan de pagos firmados — sin firmas no hay crédito.</w:t>
       </w:r>
     </w:p>
     <w:p>
@@ -3308,7 +3357,7 @@
           <w:b w:val="0"/>
           <w:sz w:val="24"/>
         </w:rPr>
-        <w:t>Contado, Cajasan o tarjeta: igual que arriba. Si toca crédito directo (1,9% mensual, reserva → inicial mín 20% a 3 días → cuotas desde día 30), el tope de cuotas sale de la duración (200 horas):</w:t>
+        <w:t>Contado o tarjeta: igual que arriba. Si toca crédito directo (1,9% mensual, separación $300.000 → inicial mín 20% a 3 días → cuotas desde día 30), el tope de cuotas sale de la duración (200 horas):</w:t>
       </w:r>
     </w:p>
     <w:tbl>
@@ -3579,6 +3628,18 @@
           <w:sz w:val="24"/>
         </w:rPr>
         <w:t>· Seguimiento pautado (no esperar a ver si vuelve): mismo día resumen escrito con número y vencimiento → +24h mensaje → +48h llamada → día 3: "vence hoy".</w:t>
+      </w:r>
+    </w:p>
+    <w:p>
+      <w:pPr>
+        <w:spacing w:after="60"/>
+      </w:pPr>
+      <w:r>
+        <w:rPr>
+          <w:b/>
+          <w:sz w:val="24"/>
+        </w:rPr>
+        <w:t>LA FECHA SE CUMPLE. Si venció, venció: la re-presentación de la solicitud es real, no teatro. Una sola excepción conocida y el Fondo pierde toda su fuerza — el cliente se da cuenta.</w:t>
       </w:r>
     </w:p>
     <w:tbl>

</xml_diff>

<commit_message>
Kit: objecion Au Pair/ninera — el ingles es el pasaporte + operadores verificados; modulo emprendedor = bono incluido no requisito; precio jamas baja por no usar un componente
Co-Authored-By: Claude Fable 5 <noreply@anthropic.com>
Claude-Session: https://claude.ai/code/session_018H7C5dx3NvDfXiv3CfhPMa
</commit_message>
<xml_diff>
--- a/recursos/comercial/INDUCCION_COMERCIAL/KIT_DE_VENTA_ASESORAS.docx
+++ b/recursos/comercial/INDUCCION_COMERCIAL/KIT_DE_VENTA_ASESORAS.docx
@@ -990,6 +990,34 @@
                 <w:sz w:val="23"/>
               </w:rPr>
               <w:t>"Nuestros profes son certificados y expertos en hispanohablantes: entienden exactamente tus errores. Y tu avance queda medido y garantizado por escrito — no depende de la nacionalidad de nadie."</w:t>
+            </w:r>
+          </w:p>
+        </w:tc>
+      </w:tr>
+      <w:tr>
+        <w:tc>
+          <w:tcPr>
+            <w:tcW w:type="dxa" w:w="4986"/>
+          </w:tcPr>
+          <w:p>
+            <w:r>
+              <w:rPr>
+                <w:sz w:val="23"/>
+              </w:rPr>
+              <w:t>"Me quiero ir de Au Pair / niñera — no me interesa la página web"</w:t>
+            </w:r>
+          </w:p>
+        </w:tc>
+        <w:tc>
+          <w:tcPr>
+            <w:tcW w:type="dxa" w:w="4986"/>
+          </w:tcPr>
+          <w:p>
+            <w:r>
+              <w:rPr>
+                <w:sz w:val="23"/>
+              </w:rPr>
+              <w:t>"¡Perfecto! Para irte el requisito #1 ES el inglés conversacional — este programa es tu pasaporte, y trabajamos solo con operadores VERIFICADOS de Au Pair. El módulo emprendedor viene incluido, no cuesta aparte y no es requisito: la mayoría vuelve al año con dólares ahorrados, y ahí ese módulo vale oro. Lo tienes ganado para cuando quieras." (El precio JAMÁS baja por no usar un componente — paquete no separable.)</w:t>
             </w:r>
           </w:p>
         </w:tc>

</xml_diff>

<commit_message>
Virtudes a la venta: 4a ancla FORMACION en el kit (frase papa + frase adulto que liga virtud-garantia) y Q&A del bot "por que ustedes" (garantia + caracter + modulo a eleccion); se vende resultado, jamas la maquinaria interna
Co-Authored-By: Claude Fable 5 <noreply@anthropic.com>
Claude-Session: https://claude.ai/code/session_018H7C5dx3NvDfXiv3CfhPMa
</commit_message>
<xml_diff>
--- a/recursos/comercial/INDUCCION_COMERCIAL/KIT_DE_VENTA_ASESORAS.docx
+++ b/recursos/comercial/INDUCCION_COMERCIAL/KIT_DE_VENTA_ASESORAS.docx
@@ -604,7 +604,7 @@
           <w:color w:val="222222"/>
           <w:sz w:val="27"/>
         </w:rPr>
-        <w:t>Las 3 anclas (úsalas en TODA cita)</w:t>
+        <w:t>Las 4 anclas (úsalas en TODA cita)</w:t>
       </w:r>
     </w:p>
     <w:p>
@@ -641,6 +641,18 @@
           <w:sz w:val="24"/>
         </w:rPr>
         <w:t>3. CERTIFICACIÓN: "Institución con licencia desde 2012, programas registrados hasta 2032 y certificación de calidad ICONTEC."</w:t>
+      </w:r>
+    </w:p>
+    <w:p>
+      <w:pPr>
+        <w:spacing w:after="60"/>
+      </w:pPr>
+      <w:r>
+        <w:rPr>
+          <w:b w:val="0"/>
+          <w:sz w:val="24"/>
+        </w:rPr>
+        <w:t>4. FORMACIÓN: "Aquí no solo aprendes inglés: cada clase abre trabajando una virtud — disciplina, prudencia, constancia — aterrizada en conductas concretas del aula." · Al papá: "le devolvemos un hijo más responsable — en inglés." · Al adulto: "la garantía existe porque el programa entrena los hábitos que te hacen cumplir."</w:t>
       </w:r>
     </w:p>
     <w:p>

</xml_diff>

<commit_message>
Evidencia = garantia en la venta: kit con frase del expediente al matricular (audio diario y garantia se firman juntos), bot con audio diario dentro del cumplimiento, ANEXO_GARANTIA v2 (medicion sobre expediente completo + verificacion adicional con evaluador externo — protege del examen ansioso Y del deliberadamente malo; PENDIENTE VoBo abogado)
Co-Authored-By: Claude Fable 5 <noreply@anthropic.com>
Claude-Session: https://claude.ai/code/session_018H7C5dx3NvDfXiv3CfhPMa
</commit_message>
<xml_diff>
--- a/recursos/comercial/INDUCCION_COMERCIAL/KIT_DE_VENTA_ASESORAS.docx
+++ b/recursos/comercial/INDUCCION_COMERCIAL/KIT_DE_VENTA_ASESORAS.docx
@@ -653,6 +653,68 @@
           <w:sz w:val="24"/>
         </w:rPr>
         <w:t>4. FORMACIÓN: "Aquí no solo aprendes inglés: cada clase abre trabajando una virtud — disciplina, prudencia, constancia — aterrizada en conductas concretas del aula." · Al papá: "le devolvemos un hijo más responsable — en inglés." · Al adulto: "la garantía existe porque el programa entrena los hábitos que te hacen cumplir."</w:t>
+      </w:r>
+    </w:p>
+    <w:p>
+      <w:pPr>
+        <w:spacing w:before="140" w:after="60"/>
+      </w:pPr>
+      <w:r>
+        <w:rPr>
+          <w:b/>
+          <w:color w:val="222222"/>
+          <w:sz w:val="27"/>
+        </w:rPr>
+        <w:t>Al matricular: la frase del expediente (se dice SIEMPRE, antes de firmar)</w:t>
+      </w:r>
+    </w:p>
+    <w:tbl>
+      <w:tblPr>
+        <w:tblStyle w:val="TableGrid"/>
+        <w:tblW w:type="auto" w:w="0"/>
+        <w:tblLook w:firstColumn="1" w:firstRow="1" w:lastColumn="0" w:lastRow="0" w:noHBand="0" w:noVBand="1" w:val="04A0"/>
+      </w:tblPr>
+      <w:tblGrid>
+        <w:gridCol w:w="9972"/>
+      </w:tblGrid>
+      <w:tr>
+        <w:tc>
+          <w:tcPr>
+            <w:tcW w:type="dxa" w:w="9972"/>
+            <w:shd w:val="clear" w:fill="FFF8E7"/>
+          </w:tcPr>
+          <w:p>
+            <w:r>
+              <w:rPr>
+                <w:i/>
+                <w:sz w:val="25"/>
+              </w:rPr>
+              <w:t>"Tu garantía funciona con tu evidencia: desde el día uno grabas un audio de práctica de 1 a 3 minutos diarios, en tu celular — nadie de tu clase lo escucha. Ese portafolio es tu póliza: es lo que respalda tu garantía, y es donde TÚ mismo vas a oír tu cambio mes a mes. La garantía y el audio diario vienen juntos — se firman juntos."</w:t>
+            </w:r>
+          </w:p>
+        </w:tc>
+      </w:tr>
+    </w:tbl>
+    <w:p>
+      <w:pPr>
+        <w:spacing w:after="0" w:before="0"/>
+      </w:pPr>
+      <w:r>
+        <w:rPr>
+          <w:sz w:val="8"/>
+        </w:rPr>
+      </w:r>
+    </w:p>
+    <w:p>
+      <w:pPr>
+        <w:spacing w:after="60"/>
+      </w:pPr>
+      <w:r>
+        <w:rPr>
+          <w:b/>
+          <w:sz w:val="24"/>
+        </w:rPr>
+        <w:t>Así el audio diario nace como parte del trato ANTES de firmar. El que firma la garantía firma su evidencia — nunca es sorpresa del profesor en la semana 2.</w:t>
       </w:r>
     </w:p>
     <w:p>

</xml_diff>

<commit_message>
Kit definitivo: Modulo Pasaporte integrado a productos (tabla Emprendedor vs Pasaporte + pregunta de la meta + reglas) y seccion 4 nueva = checklist de las 10 cosas obligatorias de toda cita; anexo suelto queda como repuesto
Co-Authored-By: Claude Fable 5 <noreply@anthropic.com>
Claude-Session: https://claude.ai/code/session_018H7C5dx3NvDfXiv3CfhPMa
</commit_message>
<xml_diff>
--- a/recursos/comercial/INDUCCION_COMERCIAL/KIT_DE_VENTA_ASESORAS.docx
+++ b/recursos/comercial/INDUCCION_COMERCIAL/KIT_DE_VENTA_ASESORAS.docx
@@ -429,7 +429,7 @@
               <w:rPr>
                 <w:sz w:val="23"/>
               </w:rPr>
-              <w:t>Incluye: 2 niveles completos (200 horas), libros, certificado por nivel, garantía escrita y Módulo Emprendedor al terminar A2 (su página web + su primer mensaje de venta en inglés).</w:t>
+              <w:t>Incluye: 2 niveles completos (200 horas), libros, certificado por nivel, garantía escrita y Módulo de Graduación al terminar A2 — a ELECCIÓN (ver abajo).</w:t>
             </w:r>
           </w:p>
         </w:tc>
@@ -456,6 +456,151 @@
         <w:rPr>
           <w:sz w:val="8"/>
         </w:rPr>
+      </w:r>
+    </w:p>
+    <w:p>
+      <w:pPr>
+        <w:spacing w:before="140" w:after="60"/>
+      </w:pPr>
+      <w:r>
+        <w:rPr>
+          <w:b/>
+          <w:color w:val="222222"/>
+          <w:sz w:val="27"/>
+        </w:rPr>
+        <w:t>El Módulo de Graduación (incluido — se elige UNO al terminar A2, nunca ambos)</w:t>
+      </w:r>
+    </w:p>
+    <w:tbl>
+      <w:tblPr>
+        <w:tblStyle w:val="TableGrid"/>
+        <w:tblW w:type="auto" w:w="0"/>
+        <w:tblLook w:firstColumn="1" w:firstRow="1" w:lastColumn="0" w:lastRow="0" w:noHBand="0" w:noVBand="1" w:val="04A0"/>
+      </w:tblPr>
+      <w:tblGrid>
+        <w:gridCol w:w="9972"/>
+      </w:tblGrid>
+      <w:tr>
+        <w:tc>
+          <w:tcPr>
+            <w:tcW w:type="dxa" w:w="9972"/>
+            <w:shd w:val="clear" w:fill="FFF8E7"/>
+          </w:tcPr>
+          <w:p>
+            <w:r>
+              <w:rPr>
+                <w:i/>
+                <w:sz w:val="25"/>
+              </w:rPr>
+              <w:t>La pregunta que abre la elección: "¿Tu meta es montar algo tuyo, o irte a trabajar afuera? Tenemos módulo de graduación para cada una — tú eliges al terminar tu A2."</w:t>
+            </w:r>
+          </w:p>
+        </w:tc>
+      </w:tr>
+    </w:tbl>
+    <w:p>
+      <w:pPr>
+        <w:spacing w:after="0" w:before="0"/>
+      </w:pPr>
+      <w:r>
+        <w:rPr>
+          <w:sz w:val="8"/>
+        </w:rPr>
+      </w:r>
+    </w:p>
+    <w:tbl>
+      <w:tblPr>
+        <w:tblStyle w:val="TableGrid"/>
+        <w:tblW w:type="auto" w:w="0"/>
+        <w:tblLook w:firstColumn="1" w:firstRow="1" w:lastColumn="0" w:lastRow="0" w:noHBand="0" w:noVBand="1" w:val="04A0"/>
+      </w:tblPr>
+      <w:tblGrid>
+        <w:gridCol w:w="4986"/>
+        <w:gridCol w:w="4986"/>
+      </w:tblGrid>
+      <w:tr>
+        <w:tc>
+          <w:tcPr>
+            <w:tcW w:type="dxa" w:w="4986"/>
+            <w:shd w:val="clear" w:fill="E54C09"/>
+          </w:tcPr>
+          <w:p>
+            <w:r>
+              <w:rPr>
+                <w:b/>
+                <w:color w:val="FFFFFF"/>
+                <w:sz w:val="23"/>
+              </w:rPr>
+              <w:t>MÓDULO EMPRENDEDOR</w:t>
+            </w:r>
+          </w:p>
+        </w:tc>
+        <w:tc>
+          <w:tcPr>
+            <w:tcW w:type="dxa" w:w="4986"/>
+            <w:shd w:val="clear" w:fill="E54C09"/>
+          </w:tcPr>
+          <w:p>
+            <w:r>
+              <w:rPr>
+                <w:b/>
+                <w:color w:val="FFFFFF"/>
+                <w:sz w:val="23"/>
+              </w:rPr>
+              <w:t>MÓDULO PASAPORTE</w:t>
+            </w:r>
+          </w:p>
+        </w:tc>
+      </w:tr>
+      <w:tr>
+        <w:tc>
+          <w:tcPr>
+            <w:tcW w:type="dxa" w:w="4986"/>
+          </w:tcPr>
+          <w:p>
+            <w:r>
+              <w:rPr>
+                <w:sz w:val="23"/>
+              </w:rPr>
+              <w:t>Para el que quiere facturar: página web publicada con dominio propio · pitch en inglés · perfil para vender afuera · cuenta de pagos internacional · primer mensaje de venta enviado a un cliente real.</w:t>
+            </w:r>
+          </w:p>
+        </w:tc>
+        <w:tc>
+          <w:tcPr>
+            <w:tcW w:type="dxa" w:w="4986"/>
+          </w:tcPr>
+          <w:p>
+            <w:r>
+              <w:rPr>
+                <w:sz w:val="23"/>
+              </w:rPr>
+              <w:t>Para el que quiere irse (Au Pair, Work &amp; Travel, H2B): video de presentación en inglés · hoja de vida + carta de aplicación · entrevista simulada con familia/empleador (grabada, antes y después) · certificado internacional EF SET · kit de llegada (aeropuerto, inmigración, primer día).</w:t>
+            </w:r>
+          </w:p>
+        </w:tc>
+      </w:tr>
+    </w:tbl>
+    <w:p>
+      <w:pPr>
+        <w:spacing w:after="0"/>
+      </w:pPr>
+      <w:r>
+        <w:rPr>
+          <w:sz w:val="8"/>
+        </w:rPr>
+      </w:r>
+    </w:p>
+    <w:p>
+      <w:pPr>
+        <w:spacing w:after="60"/>
+      </w:pPr>
+      <w:r>
+        <w:rPr>
+          <w:b/>
+          <w:sz w:val="24"/>
+        </w:rPr>
+        <w:t>Reglas: el precio es el MISMO elija el que elija — va incluido, no se cobra ni se descuenta. La elección es al terminar A2, no en la cita (en la cita solo se muestran los dos caminos). JAMÁS prometer visa, cupo en programa externo o empleo — el módulo entrega preparación y puertas verificadas. El interesado en irse se registra también para el carril de alianzas.</w:t>
       </w:r>
     </w:p>
     <w:p>
@@ -3917,6 +4062,193 @@
         </w:rPr>
       </w:r>
     </w:p>
+    <w:p>
+      <w:r>
+        <w:br w:type="page"/>
+      </w:r>
+    </w:p>
+    <w:p>
+      <w:pPr>
+        <w:spacing w:before="120" w:after="160"/>
+      </w:pPr>
+      <w:r>
+        <w:rPr>
+          <w:b/>
+          <w:color w:val="E54C09"/>
+          <w:sz w:val="40"/>
+        </w:rPr>
+        <w:t>4.  LO QUE SE DICE SIEMPRE — CHECKLIST DE TODA CITA</w:t>
+      </w:r>
+    </w:p>
+    <w:p>
+      <w:pPr>
+        <w:spacing w:after="60"/>
+      </w:pPr>
+      <w:r>
+        <w:rPr>
+          <w:b/>
+          <w:sz w:val="24"/>
+        </w:rPr>
+        <w:t>Estas 10 cosas son OBLIGATORIAS en toda cita, en este orden natural. Al terminar cada cita, repásalas: si faltó una, se dice en el seguimiento del mismo día.</w:t>
+      </w:r>
+    </w:p>
+    <w:p>
+      <w:pPr>
+        <w:spacing w:after="60"/>
+      </w:pPr>
+      <w:r>
+        <w:rPr>
+          <w:b w:val="0"/>
+          <w:sz w:val="24"/>
+        </w:rPr>
+        <w:t>□ 1. LA PREGUNTA DE NIVEL: "¿Has estudiado inglés antes? ¿Puedes tener una conversación básica?" — define todo el camino.</w:t>
+      </w:r>
+    </w:p>
+    <w:p>
+      <w:pPr>
+        <w:spacing w:after="60"/>
+      </w:pPr>
+      <w:r>
+        <w:rPr>
+          <w:b w:val="0"/>
+          <w:sz w:val="24"/>
+        </w:rPr>
+        <w:t>□ 2. LA PREGUNTA CAJASAN: "¿Eres afiliado a Cajasan?" — se pregunta y se ANOTA siempre, pague como pague.</w:t>
+      </w:r>
+    </w:p>
+    <w:p>
+      <w:pPr>
+        <w:spacing w:after="60"/>
+      </w:pPr>
+      <w:r>
+        <w:rPr>
+          <w:b w:val="0"/>
+          <w:sz w:val="24"/>
+        </w:rPr>
+        <w:t>□ 3. LAS 4 ANCLAS: garantía por escrito · avance medido · institución con licencia e ICONTEC · formación del carácter.</w:t>
+      </w:r>
+    </w:p>
+    <w:p>
+      <w:pPr>
+        <w:spacing w:after="60"/>
+      </w:pPr>
+      <w:r>
+        <w:rPr>
+          <w:b w:val="0"/>
+          <w:sz w:val="24"/>
+        </w:rPr>
+        <w:t>□ 4. LA PREGUNTA DE LA META: "¿Tu meta es montar algo tuyo, o irte a trabajar afuera?" — presenta los dos módulos de graduación.</w:t>
+      </w:r>
+    </w:p>
+    <w:p>
+      <w:pPr>
+        <w:spacing w:after="60"/>
+      </w:pPr>
+      <w:r>
+        <w:rPr>
+          <w:b w:val="0"/>
+          <w:sz w:val="24"/>
+        </w:rPr>
+        <w:t>□ 5. EL CIERRE DOBLE: los dos caminos (Arranque $2.990.000 o completo con beca) — las dos respuestas son SÍ.</w:t>
+      </w:r>
+    </w:p>
+    <w:p>
+      <w:pPr>
+        <w:spacing w:after="60"/>
+      </w:pPr>
+      <w:r>
+        <w:rPr>
+          <w:b w:val="0"/>
+          <w:sz w:val="24"/>
+        </w:rPr>
+        <w:t>□ 6. SI "YA SABE ALGO": sesión de ubicación agendada con FECHA Y HORA antes de que se vaya — jamás se va sin agenda.</w:t>
+      </w:r>
+    </w:p>
+    <w:p>
+      <w:pPr>
+        <w:spacing w:after="60"/>
+      </w:pPr>
+      <w:r>
+        <w:rPr>
+          <w:b w:val="0"/>
+          <w:sz w:val="24"/>
+        </w:rPr>
+        <w:t>□ 7. SI ES ARRANQUE: las dos jornadas + la regla del grupo mínimo, ANTES de firmar — nunca de sorpresa.</w:t>
+      </w:r>
+    </w:p>
+    <w:p>
+      <w:pPr>
+        <w:spacing w:after="60"/>
+      </w:pPr>
+      <w:r>
+        <w:rPr>
+          <w:b w:val="0"/>
+          <w:sz w:val="24"/>
+        </w:rPr>
+        <w:t>□ 8. LA FRASE DEL EXPEDIENTE (antes de firmar): la garantía y el audio diario vienen juntos — se firman juntos.</w:t>
+      </w:r>
+    </w:p>
+    <w:p>
+      <w:pPr>
+        <w:spacing w:after="60"/>
+      </w:pPr>
+      <w:r>
+        <w:rPr>
+          <w:b w:val="0"/>
+          <w:sz w:val="24"/>
+        </w:rPr>
+        <w:t>□ 9. UNA frase de cierre + SILENCIO. El primero que habla, concede.</w:t>
+      </w:r>
+    </w:p>
+    <w:p>
+      <w:pPr>
+        <w:spacing w:after="60"/>
+      </w:pPr>
+      <w:r>
+        <w:rPr>
+          <w:b w:val="0"/>
+          <w:sz w:val="24"/>
+        </w:rPr>
+        <w:t>□ 10. SI NO CIERRA HOY: la oferta POR ESCRITO con vencimiento (72 horas) + el abono de separación ofrecido + el motivo real anotado para rescate.</w:t>
+      </w:r>
+    </w:p>
+    <w:tbl>
+      <w:tblPr>
+        <w:tblStyle w:val="TableGrid"/>
+        <w:tblW w:type="auto" w:w="0"/>
+        <w:tblLook w:firstColumn="1" w:firstRow="1" w:lastColumn="0" w:lastRow="0" w:noHBand="0" w:noVBand="1" w:val="04A0"/>
+      </w:tblPr>
+      <w:tblGrid>
+        <w:gridCol w:w="9972"/>
+      </w:tblGrid>
+      <w:tr>
+        <w:tc>
+          <w:tcPr>
+            <w:tcW w:type="dxa" w:w="9972"/>
+            <w:shd w:val="clear" w:fill="FFF8E7"/>
+          </w:tcPr>
+          <w:p>
+            <w:r>
+              <w:rPr>
+                <w:i/>
+                <w:sz w:val="25"/>
+              </w:rPr>
+              <w:t>Cita perfecta = las 10 marcadas. Cita sin cierre pero con las 10 = trabajo bien hecho, el seguimiento la remata. Cita con cierre pero sin la 2, la 7 o la 8 = problema futuro: complétalas en la firma.</w:t>
+            </w:r>
+          </w:p>
+        </w:tc>
+      </w:tr>
+    </w:tbl>
+    <w:p>
+      <w:pPr>
+        <w:spacing w:after="0" w:before="0"/>
+      </w:pPr>
+      <w:r>
+        <w:rPr>
+          <w:sz w:val="8"/>
+        </w:rPr>
+      </w:r>
+    </w:p>
     <w:p/>
     <w:p>
       <w:pPr>

</xml_diff>

<commit_message>
Escalera de cierre tambien en el Kit de Venta (seccion 1, tras el cierre doble) — los dos kits quedan con la misma tabla de 5 escalones
Co-Authored-By: Claude Fable 5 <noreply@anthropic.com>
Claude-Session: https://claude.ai/code/session_018H7C5dx3NvDfXiv3CfhPMa
</commit_message>
<xml_diff>
--- a/recursos/comercial/INDUCCION_COMERCIAL/KIT_DE_VENTA_ASESORAS.docx
+++ b/recursos/comercial/INDUCCION_COMERCIAL/KIT_DE_VENTA_ASESORAS.docx
@@ -737,6 +737,320 @@
         <w:rPr>
           <w:sz w:val="8"/>
         </w:rPr>
+      </w:r>
+    </w:p>
+    <w:p>
+      <w:pPr>
+        <w:spacing w:before="140" w:after="60"/>
+      </w:pPr>
+      <w:r>
+        <w:rPr>
+          <w:b/>
+          <w:color w:val="222222"/>
+          <w:sz w:val="27"/>
+        </w:rPr>
+        <w:t>La escalera de cierre — nadie sale sin que se le ofrezca el escalón siguiente</w:t>
+      </w:r>
+    </w:p>
+    <w:p>
+      <w:pPr>
+        <w:spacing w:after="60"/>
+      </w:pPr>
+      <w:r>
+        <w:rPr>
+          <w:b/>
+          <w:sz w:val="24"/>
+        </w:rPr>
+        <w:t>SIEMPRE se empieza ARRIBA. Solo se baja un escalón con un NO real YA TRABAJADO (objeción respondida y aun así no). Bajar sin ese no = regalar plata. Saltar escalones = perder ventas.</w:t>
+      </w:r>
+    </w:p>
+    <w:tbl>
+      <w:tblPr>
+        <w:tblStyle w:val="TableGrid"/>
+        <w:tblW w:type="auto" w:w="0"/>
+        <w:tblLook w:firstColumn="1" w:firstRow="1" w:lastColumn="0" w:lastRow="0" w:noHBand="0" w:noVBand="1" w:val="04A0"/>
+      </w:tblPr>
+      <w:tblGrid>
+        <w:gridCol w:w="3324"/>
+        <w:gridCol w:w="3324"/>
+        <w:gridCol w:w="3324"/>
+      </w:tblGrid>
+      <w:tr>
+        <w:tc>
+          <w:tcPr>
+            <w:tcW w:type="dxa" w:w="3324"/>
+            <w:shd w:val="clear" w:fill="E54C09"/>
+          </w:tcPr>
+          <w:p>
+            <w:r>
+              <w:rPr>
+                <w:b/>
+                <w:color w:val="FFFFFF"/>
+                <w:sz w:val="21"/>
+              </w:rPr>
+              <w:t>Escalón</w:t>
+            </w:r>
+          </w:p>
+        </w:tc>
+        <w:tc>
+          <w:tcPr>
+            <w:tcW w:type="dxa" w:w="3324"/>
+            <w:shd w:val="clear" w:fill="E54C09"/>
+          </w:tcPr>
+          <w:p>
+            <w:r>
+              <w:rPr>
+                <w:b/>
+                <w:color w:val="FFFFFF"/>
+                <w:sz w:val="21"/>
+              </w:rPr>
+              <w:t>Qué se ofrece</w:t>
+            </w:r>
+          </w:p>
+        </w:tc>
+        <w:tc>
+          <w:tcPr>
+            <w:tcW w:type="dxa" w:w="3324"/>
+            <w:shd w:val="clear" w:fill="E54C09"/>
+          </w:tcPr>
+          <w:p>
+            <w:r>
+              <w:rPr>
+                <w:b/>
+                <w:color w:val="FFFFFF"/>
+                <w:sz w:val="21"/>
+              </w:rPr>
+              <w:t>Se baja cuando…</w:t>
+            </w:r>
+          </w:p>
+        </w:tc>
+      </w:tr>
+      <w:tr>
+        <w:tc>
+          <w:tcPr>
+            <w:tcW w:type="dxa" w:w="3324"/>
+          </w:tcPr>
+          <w:p>
+            <w:r>
+              <w:rPr>
+                <w:sz w:val="21"/>
+              </w:rPr>
+              <w:t>1</w:t>
+            </w:r>
+          </w:p>
+        </w:tc>
+        <w:tc>
+          <w:tcPr>
+            <w:tcW w:type="dxa" w:w="3324"/>
+          </w:tcPr>
+          <w:p>
+            <w:r>
+              <w:rPr>
+                <w:sz w:val="21"/>
+              </w:rPr>
+              <w:t>PROGRAMA COMPLETO con su beca del Fondo (número exacto: tabla en pesos, sección 3)</w:t>
+            </w:r>
+          </w:p>
+        </w:tc>
+        <w:tc>
+          <w:tcPr>
+            <w:tcW w:type="dxa" w:w="3324"/>
+          </w:tcPr>
+          <w:p>
+            <w:r>
+              <w:rPr>
+                <w:sz w:val="21"/>
+              </w:rPr>
+              <w:t>No real, ya respondido con plan de pagos y Fondo</w:t>
+            </w:r>
+          </w:p>
+        </w:tc>
+      </w:tr>
+      <w:tr>
+        <w:tc>
+          <w:tcPr>
+            <w:tcW w:type="dxa" w:w="3324"/>
+          </w:tcPr>
+          <w:p>
+            <w:r>
+              <w:rPr>
+                <w:sz w:val="21"/>
+              </w:rPr>
+              <w:t>2</w:t>
+            </w:r>
+          </w:p>
+        </w:tc>
+        <w:tc>
+          <w:tcPr>
+            <w:tcW w:type="dxa" w:w="3324"/>
+          </w:tcPr>
+          <w:p>
+            <w:r>
+              <w:rPr>
+                <w:sz w:val="21"/>
+              </w:rPr>
+              <w:t>ARRANQUE A1+A2 — $2.990.000 (si empieza de cero) o el paquete menor hacia B2 (si ya tiene nivel)</w:t>
+            </w:r>
+          </w:p>
+        </w:tc>
+        <w:tc>
+          <w:tcPr>
+            <w:tcW w:type="dxa" w:w="3324"/>
+          </w:tcPr>
+          <w:p>
+            <w:r>
+              <w:rPr>
+                <w:sz w:val="21"/>
+              </w:rPr>
+              <w:t>No real trabajado</w:t>
+            </w:r>
+          </w:p>
+        </w:tc>
+      </w:tr>
+      <w:tr>
+        <w:tc>
+          <w:tcPr>
+            <w:tcW w:type="dxa" w:w="3324"/>
+          </w:tcPr>
+          <w:p>
+            <w:r>
+              <w:rPr>
+                <w:sz w:val="21"/>
+              </w:rPr>
+              <w:t>3</w:t>
+            </w:r>
+          </w:p>
+        </w:tc>
+        <w:tc>
+          <w:tcPr>
+            <w:tcW w:type="dxa" w:w="3324"/>
+          </w:tcPr>
+          <w:p>
+            <w:r>
+              <w:rPr>
+                <w:sz w:val="21"/>
+              </w:rPr>
+              <w:t>NIVEL SUELTO (ej. solo A1: $1.596.000). Aquí — y SOLO aquí — tu única carta: hasta 20% de descuento por pago de contado, SOLO en cita presencial, JAMÁS por teléfono o WhatsApp</w:t>
+            </w:r>
+          </w:p>
+        </w:tc>
+        <w:tc>
+          <w:tcPr>
+            <w:tcW w:type="dxa" w:w="3324"/>
+          </w:tcPr>
+          <w:p>
+            <w:r>
+              <w:rPr>
+                <w:sz w:val="21"/>
+              </w:rPr>
+              <w:t>No real trabajado</w:t>
+            </w:r>
+          </w:p>
+        </w:tc>
+      </w:tr>
+      <w:tr>
+        <w:tc>
+          <w:tcPr>
+            <w:tcW w:type="dxa" w:w="3324"/>
+          </w:tcPr>
+          <w:p>
+            <w:r>
+              <w:rPr>
+                <w:sz w:val="21"/>
+              </w:rPr>
+              <w:t>4</w:t>
+            </w:r>
+          </w:p>
+        </w:tc>
+        <w:tc>
+          <w:tcPr>
+            <w:tcW w:type="dxa" w:w="3324"/>
+          </w:tcPr>
+          <w:p>
+            <w:r>
+              <w:rPr>
+                <w:sz w:val="21"/>
+              </w:rPr>
+              <w:t>SABATINO — la entrada más económica (4h/semana, por nivel, sin beca)</w:t>
+            </w:r>
+          </w:p>
+        </w:tc>
+        <w:tc>
+          <w:tcPr>
+            <w:tcW w:type="dxa" w:w="3324"/>
+          </w:tcPr>
+          <w:p>
+            <w:r>
+              <w:rPr>
+                <w:sz w:val="21"/>
+              </w:rPr>
+              <w:t>No real trabajado</w:t>
+            </w:r>
+          </w:p>
+        </w:tc>
+      </w:tr>
+      <w:tr>
+        <w:tc>
+          <w:tcPr>
+            <w:tcW w:type="dxa" w:w="3324"/>
+          </w:tcPr>
+          <w:p>
+            <w:r>
+              <w:rPr>
+                <w:sz w:val="21"/>
+              </w:rPr>
+              <w:t>5</w:t>
+            </w:r>
+          </w:p>
+        </w:tc>
+        <w:tc>
+          <w:tcPr>
+            <w:tcW w:type="dxa" w:w="3324"/>
+          </w:tcPr>
+          <w:p>
+            <w:r>
+              <w:rPr>
+                <w:sz w:val="21"/>
+              </w:rPr>
+              <w:t>NO es una venta, es una SIEMBRA: motivo REAL del no + teléfono, a la base de rescate — la tanda de rescate llama con el motivo en la mano</w:t>
+            </w:r>
+          </w:p>
+        </w:tc>
+        <w:tc>
+          <w:tcPr>
+            <w:tcW w:type="dxa" w:w="3324"/>
+          </w:tcPr>
+          <w:p>
+            <w:r>
+              <w:rPr>
+                <w:sz w:val="21"/>
+              </w:rPr>
+              <w:t>—</w:t>
+            </w:r>
+          </w:p>
+        </w:tc>
+      </w:tr>
+    </w:tbl>
+    <w:p>
+      <w:pPr>
+        <w:spacing w:after="0"/>
+      </w:pPr>
+      <w:r>
+        <w:rPr>
+          <w:sz w:val="8"/>
+        </w:rPr>
+      </w:r>
+    </w:p>
+    <w:p>
+      <w:pPr>
+        <w:spacing w:after="60"/>
+      </w:pPr>
+      <w:r>
+        <w:rPr>
+          <w:b/>
+          <w:sz w:val="24"/>
+        </w:rPr>
+        <w:t>Las dos trampas: (1) jamás ARRANCAR abajo — quien abre ofreciendo sabatino nunca vende un completo; (2) jamás bajar rápido — le enseñas al cliente que esperando consigue menos precio.</w:t>
       </w:r>
     </w:p>
     <w:p>

</xml_diff>

<commit_message>
Regla de oro: lista de espera = obstaculo real CON FECHA + recontacto agendado (test: puedo escribir una fecha al lado del nombre?); "lo pienso" sin fecha = NO con motivo
Co-Authored-By: Claude Fable 5 <noreply@anthropic.com>
Claude-Session: https://claude.ai/code/session_018H7C5dx3NvDfXiv3CfhPMa
</commit_message>
<xml_diff>
--- a/recursos/comercial/INDUCCION_COMERCIAL/KIT_DE_VENTA_ASESORAS.docx
+++ b/recursos/comercial/INDUCCION_COMERCIAL/KIT_DE_VENTA_ASESORAS.docx
@@ -134,6 +134,18 @@
           <w:sz w:val="24"/>
         </w:rPr>
         <w:t>3. Un NO claro — con el motivo anotado para rescate.</w:t>
+      </w:r>
+    </w:p>
+    <w:p>
+      <w:pPr>
+        <w:spacing w:after="60"/>
+      </w:pPr>
+      <w:r>
+        <w:rPr>
+          <w:b/>
+          <w:sz w:val="24"/>
+        </w:rPr>
+        <w:t>OJO: lista de espera exige un obstáculo REAL con FECHA ("me pagan la prima en diciembre", "mi grupo abre en enero") + recontacto agendado. El test: ¿puedo escribir una fecha al lado de este nombre? Sí = lista de espera. No = es un "lo voy a pensar" → se trabaja la objeción, y si no cierra, es la salida 3.</w:t>
       </w:r>
     </w:p>
     <w:tbl>

</xml_diff>

<commit_message>
Jornadas reescritas como SEGURIDAD: pregunta de flexibilidad como servicio, al de horario fijo "cupo asegurado + plata protegida + jamas te movemos sin tu si", grupo minimo = dato INTERNO de gerencia (nunca se le dice al cliente que su grupo podria no abrir); + cierre doble volteado y linea de reconciliacion con la escalera
Co-Authored-By: Claude Fable 5 <noreply@anthropic.com>
Claude-Session: https://claude.ai/code/session_018H7C5dx3NvDfXiv3CfhPMa
</commit_message>
<xml_diff>
--- a/recursos/comercial/INDUCCION_COMERCIAL/KIT_DE_VENTA_ASESORAS.docx
+++ b/recursos/comercial/INDUCCION_COMERCIAL/KIT_DE_VENTA_ASESORAS.docx
@@ -661,7 +661,43 @@
           <w:b w:val="0"/>
           <w:sz w:val="24"/>
         </w:rPr>
-        <w:t>· Cada jornada abre con grupo mínimo (6). Se le dice ANTES de firmar: "si tu jornada no completa el mínimo, eliges: te pasas a la otra o esperas la siguiente cohorte con tu cupo y precio congelados". Nunca de sorpresa después. La consolidación de grupos la decide gerencia al cierre de cupos.</w:t>
+        <w:t>· PREGUNTA OBLIGADA al registrar preferencia (suena a servicio, no a alarma): "¿Tu horario es fijo o tienes flexibilidad entre mañana y noche?" — se anota FLEXIBLE o SOLO MAÑANA / SOLO NOCHE. JAMÁS se le dice al cliente que su grupo "podría no abrir".</w:t>
+      </w:r>
+    </w:p>
+    <w:p>
+      <w:pPr>
+        <w:spacing w:after="60"/>
+      </w:pPr>
+      <w:r>
+        <w:rPr>
+          <w:b w:val="0"/>
+          <w:sz w:val="24"/>
+        </w:rPr>
+        <w:t>· Al de horario fijo se le vende SEGURIDAD, no riesgo (al firmar): "Tu cupo queda asegurado en TU jornada. Y tu plata está protegida siempre: si algo cambiara en la programación, tu precio queda congelado o te devolvemos tu abono completo — jamás te movemos de horario sin tu sí."</w:t>
+      </w:r>
+    </w:p>
+    <w:p>
+      <w:pPr>
+        <w:spacing w:after="60"/>
+      </w:pPr>
+      <w:r>
+        <w:rPr>
+          <w:b w:val="0"/>
+          <w:sz w:val="24"/>
+        </w:rPr>
+        <w:t>· Cada jornada abre con grupo mínimo (6) — ese dato es INTERNO: la consolidación la decide gerencia al cierre de cupos, viendo el tablero de flexibles. La asesora nunca gestiona eso en la cita.</w:t>
+      </w:r>
+    </w:p>
+    <w:p>
+      <w:pPr>
+        <w:spacing w:after="60"/>
+      </w:pPr>
+      <w:r>
+        <w:rPr>
+          <w:b/>
+          <w:sz w:val="24"/>
+        </w:rPr>
+        <w:t>· Y para ti: tu comisión se causa cuando el grupo ABRE y la plata entra — grupo que no abre = comisiones que no llegan. Tu juego es completar UN grupo rápido; el contador es tu cierre: "a la noche le faltan 2 para abrir — tu abono de hoy es el que la abre".</w:t>
       </w:r>
     </w:p>
     <w:p>
@@ -675,6 +711,18 @@
           <w:sz w:val="27"/>
         </w:rPr>
         <w:t>El cierre doble (tu mejor jugada — las dos respuestas son SÍ)</w:t>
+      </w:r>
+    </w:p>
+    <w:p>
+      <w:pPr>
+        <w:spacing w:after="60"/>
+      </w:pPr>
+      <w:r>
+        <w:rPr>
+          <w:b/>
+          <w:sz w:val="24"/>
+        </w:rPr>
+        <w:t>SIEMPRE se presenta PRIMERO el programa completo (el ancla alta) y el Arranque de segundo (la red). El cierre doble ES la escalera: son los escalones 1 y 2 ofrecidos juntos — la escalera sigue aplicando si hay un NO a ambos.</w:t>
       </w:r>
     </w:p>
     <w:tbl>
@@ -698,7 +746,7 @@
                 <w:i/>
                 <w:sz w:val="25"/>
               </w:rPr>
-              <w:t>"Tienes dos caminos: arrancas con A1+A2 por $2.990.000 y decides después — o te comprometes hoy con el programa completo: con tu beca queda en [tarjeta], sales con B2 y te ahorras más de un millón. ¿Cuál te hago?"</w:t>
+              <w:t>"Tienes dos caminos: te comprometes hoy con el programa completo — con tu beca queda en [tarjeta], sales con B2 y te ahorras más de un millón — o arrancas con A1+A2 por $2.990.000 y decides después. ¿Cuál te hago?"</w:t>
             </w:r>
           </w:p>
         </w:tc>

</xml_diff>

<commit_message>
Kit de Venta v2 consolidado: escalera de pago con cesantias y credito de terceros como contado y tarjeta de credito con recargo del 5 pct; seccion 5 nueva con las 9 dudas resueltas incorporadas al kit
Co-Authored-By: Claude Opus 5 (1M context) <noreply@anthropic.com>
</commit_message>
<xml_diff>
--- a/recursos/comercial/INDUCCION_COMERCIAL/KIT_DE_VENTA_ASESORAS.docx
+++ b/recursos/comercial/INDUCCION_COMERCIAL/KIT_DE_VENTA_ASESORAS.docx
@@ -42,7 +42,7 @@
           <w:color w:val="222222"/>
           <w:sz w:val="26"/>
         </w:rPr>
-        <w:t>Manual de la Asesora Comercial · Septiembre 2026</w:t>
+        <w:t>Manual de la Asesora Comercial · v2 consolidada, septiembre 2026</w:t>
       </w:r>
     </w:p>
     <w:p>
@@ -54,7 +54,7 @@
           <w:color w:val="222222"/>
           <w:sz w:val="26"/>
         </w:rPr>
-        <w:t>Todo lo que necesitas para una cita completa está en este documento.</w:t>
+        <w:t>Todo lo que necesitas para una cita completa está en este documento, incluidas las dudas resueltas del equipo.</w:t>
       </w:r>
     </w:p>
     <w:p>
@@ -3435,7 +3435,7 @@
           <w:b w:val="0"/>
           <w:sz w:val="24"/>
         </w:rPr>
-        <w:t>1. CONTADO (la mejor beca): transferencia, efectivo o tarjeta débito.</w:t>
+        <w:t>1. CONTADO (la mejor beca): transferencia, tarjeta débito, o efectivo ÚNICAMENTE en la sede con recibo.</w:t>
       </w:r>
     </w:p>
     <w:p>
@@ -3447,7 +3447,19 @@
           <w:b w:val="0"/>
           <w:sz w:val="24"/>
         </w:rPr>
-        <w:t>2. TARJETA DE CRÉDITO del cliente: para Heiiu es pago de contado (aplica la beca de contado) y él difiere con su banco.</w:t>
+        <w:t>2. CESANTÍAS: el cheque de cesantías cuenta como pago de CONTADO (aplica la beca de contado). Abono de separación de $300.000 hoy congela cupo y precio; el cheque debe entregarse dentro de los 10 días hábiles siguientes y siempre antes del inicio de clases.</w:t>
+      </w:r>
+    </w:p>
+    <w:p>
+      <w:pPr>
+        <w:spacing w:after="60"/>
+      </w:pPr>
+      <w:r>
+        <w:rPr>
+          <w:b w:val="0"/>
+          <w:sz w:val="24"/>
+        </w:rPr>
+        <w:t>3. CRÉDITO DE UN TERCERO (Comultrasan, banco, financiera): también cuenta como CONTADO — a la academia le entra el 100% y el cliente le debe a la entidad. Misma regla: abono de $300.000 hoy, desembolso completo en máximo 10 días hábiles. Si el crédito es negado o no llega a tiempo, el cliente paga por otro medio a la tarifa que corresponda, o su abono queda como saldo a favor (nunca devolución en efectivo).</w:t>
       </w:r>
     </w:p>
     <w:p>
@@ -3459,7 +3471,19 @@
           <w:b/>
           <w:sz w:val="24"/>
         </w:rPr>
-        <w:t>3. CRÉDITO DIRECTO HEIIU — ÚLTIMO recurso, solo si nada de lo anterior aplica: beca de cuotas (o de contado si es afiliado Cajasan) + interés del 1,9% mensual sobre saldo. Separación de cupo $300.000 (se cruza con la inicial) → cuota inicial (mínimo 20%) máximo a 3 días → cuotas mensuales desde el día 30. SIEMPRE con pagaré + carta de instrucciones + anexo plan de pagos firmados — sin firmas no hay crédito.</w:t>
+        <w:t>4. TARJETA DE CRÉDITO del cliente: cuenta como pago de contado y él difiere con su banco, PERO el valor a pagar aumenta 5% por el costo del uso de la tarjeta. Se dice antes de pasarla, siempre: "por tarjeta de crédito el valor sube un 5% por el costo de la transacción — por transferencia o débito no tiene ese recargo."</w:t>
+      </w:r>
+    </w:p>
+    <w:p>
+      <w:pPr>
+        <w:spacing w:after="60"/>
+      </w:pPr>
+      <w:r>
+        <w:rPr>
+          <w:b/>
+          <w:sz w:val="24"/>
+        </w:rPr>
+        <w:t>5. CRÉDITO DIRECTO HEIIU — ÚLTIMO recurso, solo si nada de lo anterior aplica: beca de cuotas (o de contado si es afiliado Cajasan) + interés del 1,9% mensual sobre saldo. Separación de cupo $300.000 (se cruza con la inicial) → cuota inicial (mínimo 20%) máximo a 3 días → cuotas mensuales desde el día 30. SIEMPRE con pagaré + carta de instrucciones + anexo plan de pagos firmados — sin firmas no hay crédito.</w:t>
       </w:r>
     </w:p>
     <w:p>
@@ -4623,6 +4647,456 @@
         </w:rPr>
       </w:r>
     </w:p>
+    <w:p>
+      <w:r>
+        <w:br w:type="page"/>
+      </w:r>
+    </w:p>
+    <w:p>
+      <w:pPr>
+        <w:spacing w:before="120" w:after="160"/>
+      </w:pPr>
+      <w:r>
+        <w:rPr>
+          <w:b/>
+          <w:color w:val="E54C09"/>
+          <w:sz w:val="40"/>
+        </w:rPr>
+        <w:t>5.  DUDAS RESUELTAS — DOCTRINA OFICIAL</w:t>
+      </w:r>
+    </w:p>
+    <w:p>
+      <w:pPr>
+        <w:spacing w:after="60"/>
+      </w:pPr>
+      <w:r>
+        <w:rPr>
+          <w:b/>
+          <w:sz w:val="24"/>
+        </w:rPr>
+        <w:t>Estas son las dudas que ya preguntó el equipo y su respuesta oficial. Si tu duda no está aquí, se pregunta a gerencia y la respuesta entra a este kit.</w:t>
+      </w:r>
+    </w:p>
+    <w:p>
+      <w:pPr>
+        <w:spacing w:before="140" w:after="60"/>
+      </w:pPr>
+      <w:r>
+        <w:rPr>
+          <w:b/>
+          <w:color w:val="222222"/>
+          <w:sz w:val="27"/>
+        </w:rPr>
+        <w:t>1. ¿Cuándo es GENERAL y cuándo EJECUTIVO?</w:t>
+      </w:r>
+    </w:p>
+    <w:p>
+      <w:pPr>
+        <w:spacing w:after="60"/>
+      </w:pPr>
+      <w:r>
+        <w:rPr>
+          <w:b w:val="0"/>
+          <w:sz w:val="24"/>
+        </w:rPr>
+        <w:t>El test es uno solo: ¿QUIÉN PAGA LA FACTURA? Paga una empresa, o pide factura a nombre de empresa o reembolso corporativo → EJECUTIVO (techo 15%). Persona natural que paga de su bolsillo → GENERAL (techo 32%), sin importar su cargo, su ropa o su carro. Estrato 1-2 o SISBÉN con soporte → TRANSFORMACIÓN (techo 45%).</w:t>
+      </w:r>
+    </w:p>
+    <w:p>
+      <w:pPr>
+        <w:spacing w:after="60"/>
+      </w:pPr>
+      <w:r>
+        <w:rPr>
+          <w:b/>
+          <w:sz w:val="24"/>
+        </w:rPr>
+        <w:t>Nunca se clasifica por pinta ni por cargo: se clasifica por la factura. Y al Ejecutivo no se le vende beca — se le vende conveniencia: certificación, garantía firmada, factura para su empresa, avance medido. Su 15% es un gesto, no el argumento.</w:t>
+      </w:r>
+    </w:p>
+    <w:p>
+      <w:pPr>
+        <w:spacing w:before="140" w:after="60"/>
+      </w:pPr>
+      <w:r>
+        <w:rPr>
+          <w:b/>
+          <w:color w:val="222222"/>
+          <w:sz w:val="27"/>
+        </w:rPr>
+        <w:t>2. Empleado de empresa aliada (Go Above and Beyond): ¿qué beca le aplica?</w:t>
+      </w:r>
+    </w:p>
+    <w:p>
+      <w:pPr>
+        <w:spacing w:after="60"/>
+      </w:pPr>
+      <w:r>
+        <w:rPr>
+          <w:b w:val="0"/>
+          <w:sz w:val="24"/>
+        </w:rPr>
+        <w:t>Mismo test, más un dato: ¿cuánto gana? · La empresa paga la factura → EJECUTIVO 15%. · El empleado paga de su bolsillo Y gana hasta 1.5 SMMLV → con carta de su empresa aliada + desprendible de nómina → TRANSFORMACIÓN 45%, dentro de los cupos del Fondo. · Gana más de 1.5 SMMLV y paga de su bolsillo → GENERAL 32% + beneficio de convenio (paga a cuotas con el porcentaje de contado).</w:t>
+      </w:r>
+    </w:p>
+    <w:p>
+      <w:pPr>
+        <w:spacing w:after="60"/>
+      </w:pPr>
+      <w:r>
+        <w:rPr>
+          <w:b/>
+          <w:sz w:val="24"/>
+        </w:rPr>
+        <w:t>El ARRANQUE no tiene becas: precio único $2.990.000 para todos, aliados incluidos. Los beneficios nunca se acumulan: se aplica el mejor.</w:t>
+      </w:r>
+    </w:p>
+    <w:p>
+      <w:pPr>
+        <w:spacing w:before="140" w:after="60"/>
+      </w:pPr>
+      <w:r>
+        <w:rPr>
+          <w:b/>
+          <w:color w:val="222222"/>
+          <w:sz w:val="27"/>
+        </w:rPr>
+        <w:t>3. ¿La comisión aplica a ventas corporativas?</w:t>
+      </w:r>
+    </w:p>
+    <w:p>
+      <w:pPr>
+        <w:spacing w:after="60"/>
+      </w:pPr>
+      <w:r>
+        <w:rPr>
+          <w:b w:val="0"/>
+          <w:sz w:val="24"/>
+        </w:rPr>
+        <w:t>Sí. La venta es la venta, venga de donde venga: mismo esquema para una matrícula individual, un Arranque, un becado de empresa aliada o un contrato corporativo. Sin recaudo no hay comisión — cobrar también es vender.</w:t>
+      </w:r>
+    </w:p>
+    <w:p>
+      <w:pPr>
+        <w:spacing w:before="140" w:after="60"/>
+      </w:pPr>
+      <w:r>
+        <w:rPr>
+          <w:b/>
+          <w:color w:val="222222"/>
+          <w:sz w:val="27"/>
+        </w:rPr>
+        <w:t>4. ¿Qué se dice del contador cuando no se ha vendido nada?</w:t>
+      </w:r>
+    </w:p>
+    <w:p>
+      <w:pPr>
+        <w:spacing w:after="60"/>
+      </w:pPr>
+      <w:r>
+        <w:rPr>
+          <w:b w:val="0"/>
+          <w:sz w:val="24"/>
+        </w:rPr>
+        <w:t>Jamás "quedan 20 de 20": eso anuncia que nadie ha comprado. El contador tiene tres etapas y las tres son verdad: · 0 vendidos → "Acaban de abrirse los 20 cupos del lanzamiento." · 1 a 4 → "Los cupos ya se están asignando." · 5 o más → el número real: "Vamos 8 de 20."</w:t>
+      </w:r>
+    </w:p>
+    <w:p>
+      <w:pPr>
+        <w:spacing w:after="60"/>
+      </w:pPr>
+      <w:r>
+        <w:rPr>
+          <w:b/>
+          <w:sz w:val="24"/>
+        </w:rPr>
+        <w:t>La regla que no cambia: jamás inventar el número.</w:t>
+      </w:r>
+    </w:p>
+    <w:p>
+      <w:pPr>
+        <w:spacing w:before="140" w:after="60"/>
+      </w:pPr>
+      <w:r>
+        <w:rPr>
+          <w:b/>
+          <w:color w:val="222222"/>
+          <w:sz w:val="27"/>
+        </w:rPr>
+        <w:t>5. EL PACTO: la verdad que se dice ANTES de firmar</w:t>
+      </w:r>
+    </w:p>
+    <w:p>
+      <w:pPr>
+        <w:spacing w:after="60"/>
+      </w:pPr>
+      <w:r>
+        <w:rPr>
+          <w:b/>
+          <w:sz w:val="24"/>
+        </w:rPr>
+        <w:t>Para TODOS: jamás prometer fácil, rápido ni divertido. Se promete el método, el respaldo y la garantía — a cambio del trabajo del estudiante.</w:t>
+      </w:r>
+    </w:p>
+    <w:p>
+      <w:pPr>
+        <w:spacing w:after="60"/>
+      </w:pPr>
+      <w:r>
+        <w:rPr>
+          <w:b w:val="0"/>
+          <w:sz w:val="24"/>
+        </w:rPr>
+        <w:t>La charla completa es solo para el cliente QUEMADO, el que ya intentó y fracasó (se detecta con "¿has estudiado inglés antes? ¿cómo te fue?"). Al que llega limpio no se le receta un trauma que no tiene.</w:t>
+      </w:r>
+    </w:p>
+    <w:tbl>
+      <w:tblPr>
+        <w:tblStyle w:val="TableGrid"/>
+        <w:tblW w:type="auto" w:w="0"/>
+        <w:tblLook w:firstColumn="1" w:firstRow="1" w:lastColumn="0" w:lastRow="0" w:noHBand="0" w:noVBand="1" w:val="04A0"/>
+      </w:tblPr>
+      <w:tblGrid>
+        <w:gridCol w:w="9972"/>
+      </w:tblGrid>
+      <w:tr>
+        <w:tc>
+          <w:tcPr>
+            <w:tcW w:type="dxa" w:w="9972"/>
+            <w:shd w:val="clear" w:fill="FFF8E7"/>
+          </w:tcPr>
+          <w:p>
+            <w:r>
+              <w:rPr>
+                <w:i/>
+                <w:sz w:val="25"/>
+              </w:rPr>
+              <w:t>"Te voy a ser honesta: esto NO es fácil. Vas a tener días de no querer venir, tareas que fastidian, audios que te van a dar pena grabar. El inglés no se aprende suave: se entrena, como un deporte. Y si llevas años intentándolo y no has podido, el problema nunca fuiste tú — fue el método. Aquí es al revés: de pie, hablando desde el día uno. Por eso somos los únicos que firmamos garantía: si TÚ pones el trabajo, y no avanzas, te devolvemos la plata. Ese es el trato."</w:t>
+            </w:r>
+          </w:p>
+        </w:tc>
+      </w:tr>
+    </w:tbl>
+    <w:p>
+      <w:pPr>
+        <w:spacing w:after="0" w:before="0"/>
+      </w:pPr>
+      <w:r>
+        <w:rPr>
+          <w:sz w:val="8"/>
+        </w:rPr>
+      </w:r>
+    </w:p>
+    <w:p>
+      <w:pPr>
+        <w:spacing w:after="60"/>
+      </w:pPr>
+      <w:r>
+        <w:rPr>
+          <w:b w:val="0"/>
+          <w:sz w:val="24"/>
+        </w:rPr>
+        <w:t>Por qué así: el que firma advertido no deserta en la semana 3 ni pide devolución; la dureza honesta hace creíble la garantía; y filtra al comprador correcto.</w:t>
+      </w:r>
+    </w:p>
+    <w:p>
+      <w:pPr>
+        <w:spacing w:before="140" w:after="60"/>
+      </w:pPr>
+      <w:r>
+        <w:rPr>
+          <w:b/>
+          <w:color w:val="222222"/>
+          <w:sz w:val="27"/>
+        </w:rPr>
+        <w:t>6. ¿El afiliado a Cajasan recibe el 45%?</w:t>
+      </w:r>
+    </w:p>
+    <w:p>
+      <w:pPr>
+        <w:spacing w:after="60"/>
+      </w:pPr>
+      <w:r>
+        <w:rPr>
+          <w:b w:val="0"/>
+          <w:sz w:val="24"/>
+        </w:rPr>
+        <w:t>No por ser de Cajasan. El 45% lo da el PERFIL (Transformación, con soporte). Cajasan mejora la FORMA DE PAGO: el afiliado que paga a cuotas recibe el porcentaje de contado de su propio perfil.</w:t>
+      </w:r>
+    </w:p>
+    <w:tbl>
+      <w:tblPr>
+        <w:tblStyle w:val="TableGrid"/>
+        <w:tblW w:type="auto" w:w="0"/>
+        <w:tblLook w:firstColumn="1" w:firstRow="1" w:lastColumn="0" w:lastRow="0" w:noHBand="0" w:noVBand="1" w:val="04A0"/>
+      </w:tblPr>
+      <w:tblGrid>
+        <w:gridCol w:w="9972"/>
+      </w:tblGrid>
+      <w:tr>
+        <w:tc>
+          <w:tcPr>
+            <w:tcW w:type="dxa" w:w="9972"/>
+            <w:shd w:val="clear" w:fill="FFF8E7"/>
+          </w:tcPr>
+          <w:p>
+            <w:r>
+              <w:rPr>
+                <w:i/>
+                <w:sz w:val="25"/>
+              </w:rPr>
+              <w:t>"Cajasan no cambia quién eres — cambia cómo pagas: siempre al precio de contado de tu perfil."</w:t>
+            </w:r>
+          </w:p>
+        </w:tc>
+      </w:tr>
+    </w:tbl>
+    <w:p>
+      <w:pPr>
+        <w:spacing w:after="0" w:before="0"/>
+      </w:pPr>
+      <w:r>
+        <w:rPr>
+          <w:sz w:val="8"/>
+        </w:rPr>
+      </w:r>
+    </w:p>
+    <w:p>
+      <w:pPr>
+        <w:spacing w:before="140" w:after="60"/>
+      </w:pPr>
+      <w:r>
+        <w:rPr>
+          <w:b/>
+          <w:color w:val="222222"/>
+          <w:sz w:val="27"/>
+        </w:rPr>
+        <w:t>7. "Te doy un abono, pero necesito el crédito de la cooperativa"</w:t>
+      </w:r>
+    </w:p>
+    <w:p>
+      <w:pPr>
+        <w:spacing w:after="60"/>
+      </w:pPr>
+      <w:r>
+        <w:rPr>
+          <w:b w:val="0"/>
+          <w:sz w:val="24"/>
+        </w:rPr>
+        <w:t>El crédito de un tercero y el cheque de cesantías cuentan como contado (sección 3, escalera de pago): abono de $300.000 hoy congela cupo y precio, desembolso completo en máximo 10 días hábiles y siempre antes del inicio de clases. Si no llega a tiempo o es negado: paga por otro medio a la tarifa que corresponda, o su abono queda como saldo a favor para cualquier programa. Nunca devolución en efectivo.</w:t>
+      </w:r>
+    </w:p>
+    <w:p>
+      <w:pPr>
+        <w:spacing w:before="140" w:after="60"/>
+      </w:pPr>
+      <w:r>
+        <w:rPr>
+          <w:b/>
+          <w:color w:val="222222"/>
+          <w:sz w:val="27"/>
+        </w:rPr>
+        <w:t>8. ¿Se puede matricular a alguien sin que venga a la sede?</w:t>
+      </w:r>
+    </w:p>
+    <w:p>
+      <w:pPr>
+        <w:spacing w:after="60"/>
+      </w:pPr>
+      <w:r>
+        <w:rPr>
+          <w:b w:val="0"/>
+          <w:sz w:val="24"/>
+        </w:rPr>
+        <w:t>La matrícula tiene DOS momentos, y solo el primero es digital:</w:t>
+      </w:r>
+    </w:p>
+    <w:p>
+      <w:pPr>
+        <w:spacing w:after="60"/>
+      </w:pPr>
+      <w:r>
+        <w:rPr>
+          <w:b w:val="0"/>
+          <w:sz w:val="24"/>
+        </w:rPr>
+        <w:t>· SEPARACIÓN (100% digital): abono a las cuentas de la academia + el cliente acepta por escrito el recibo de separación ("ACEPTO las condiciones del recibo No. X", con foto de su cédula) + se agenda en el mismo acto su sesión de ubicación. Eso congela cupo y precio, y tiene plena validez legal.</w:t>
+      </w:r>
+    </w:p>
+    <w:p>
+      <w:pPr>
+        <w:spacing w:after="60"/>
+      </w:pPr>
+      <w:r>
+        <w:rPr>
+          <w:b w:val="0"/>
+          <w:sz w:val="24"/>
+        </w:rPr>
+        <w:t>· FORMALIZACIÓN (siempre en la sede): contrato de matrícula firmado en físico, a más tardar el día de la sesión de ubicación. El efectivo solo se recibe en la sede, con recibo.</w:t>
+      </w:r>
+    </w:p>
+    <w:tbl>
+      <w:tblPr>
+        <w:tblStyle w:val="TableGrid"/>
+        <w:tblW w:type="auto" w:w="0"/>
+        <w:tblLook w:firstColumn="1" w:firstRow="1" w:lastColumn="0" w:lastRow="0" w:noHBand="0" w:noVBand="1" w:val="04A0"/>
+      </w:tblPr>
+      <w:tblGrid>
+        <w:gridCol w:w="9972"/>
+      </w:tblGrid>
+      <w:tr>
+        <w:tc>
+          <w:tcPr>
+            <w:tcW w:type="dxa" w:w="9972"/>
+            <w:shd w:val="clear" w:fill="FFF8E7"/>
+          </w:tcPr>
+          <w:p>
+            <w:r>
+              <w:rPr>
+                <w:i/>
+                <w:sz w:val="25"/>
+              </w:rPr>
+              <w:t>El chat asegura el cupo; la sede firma el contrato.</w:t>
+            </w:r>
+          </w:p>
+        </w:tc>
+      </w:tr>
+    </w:tbl>
+    <w:p>
+      <w:pPr>
+        <w:spacing w:after="0" w:before="0"/>
+      </w:pPr>
+      <w:r>
+        <w:rPr>
+          <w:sz w:val="8"/>
+        </w:rPr>
+      </w:r>
+    </w:p>
+    <w:p>
+      <w:pPr>
+        <w:spacing w:before="140" w:after="60"/>
+      </w:pPr>
+      <w:r>
+        <w:rPr>
+          <w:b/>
+          <w:color w:val="222222"/>
+          <w:sz w:val="27"/>
+        </w:rPr>
+        <w:t>9. La planilla: si no aparecen las listas desplegables</w:t>
+      </w:r>
+    </w:p>
+    <w:p>
+      <w:pPr>
+        <w:spacing w:after="60"/>
+      </w:pPr>
+      <w:r>
+        <w:rPr>
+          <w:b w:val="0"/>
+          <w:sz w:val="24"/>
+        </w:rPr>
+        <w:t>La flecha solo aparece al hacer clic EN la celda. Y si el archivo llegó por WhatsApp o descarga, Excel lo abre en "Vista protegida": hay que darle a "Habilitar edición" para que las listas funcionen.</w:t>
+      </w:r>
+    </w:p>
     <w:p/>
     <w:p>
       <w:pPr>

</xml_diff>

<commit_message>
Kit v2: camino de 3 pasos al inicio de becas (sabatino/nivel suelto -> quien -> que y como -> modalidad solo define max cuotas; menos cuotas siempre se puede), 'descuento' reemplazado en niveles sueltos, aclarado que la tabla en pesos va sin interes
Co-Authored-By: Claude Fable 5.1 <noreply@anthropic.com>
</commit_message>
<xml_diff>
--- a/recursos/comercial/INDUCCION_COMERCIAL/KIT_DE_VENTA_ASESORAS.docx
+++ b/recursos/comercial/INDUCCION_COMERCIAL/KIT_DE_VENTA_ASESORAS.docx
@@ -2430,6 +2430,67 @@
         <w:rPr>
           <w:sz w:val="8"/>
         </w:rPr>
+      </w:r>
+    </w:p>
+    <w:p>
+      <w:pPr>
+        <w:spacing w:before="140" w:after="60"/>
+      </w:pPr>
+      <w:r>
+        <w:rPr>
+          <w:b/>
+          <w:color w:val="222222"/>
+          <w:sz w:val="27"/>
+        </w:rPr>
+        <w:t>EL CAMINO EN 3 PASOS (antes de mirar cualquier tabla)</w:t>
+      </w:r>
+    </w:p>
+    <w:p>
+      <w:pPr>
+        <w:spacing w:after="60"/>
+      </w:pPr>
+      <w:r>
+        <w:rPr>
+          <w:b/>
+          <w:sz w:val="24"/>
+        </w:rPr>
+        <w:t>1. ¿Es sabatino o nivel suelto? → precio del nivel, sin beca del Fondo. Fin del camino.</w:t>
+      </w:r>
+    </w:p>
+    <w:p>
+      <w:pPr>
+        <w:spacing w:after="60"/>
+      </w:pPr>
+      <w:r>
+        <w:rPr>
+          <w:b/>
+          <w:sz w:val="24"/>
+        </w:rPr>
+        <w:t>2. Si es paquete: ¿QUIÉN es? → su columna. ¿QUÉ paquete y contado o cuotas? → su fila. Esa celda es su beca.</w:t>
+      </w:r>
+    </w:p>
+    <w:p>
+      <w:pPr>
+        <w:spacing w:after="60"/>
+      </w:pPr>
+      <w:r>
+        <w:rPr>
+          <w:b/>
+          <w:sz w:val="24"/>
+        </w:rPr>
+        <w:t>3. Si paga a cuotas: ¿intensivo o súper intensivo? → eso da el MÁXIMO de cuotas. La cuota exacta la saca el motor de cuotas, nunca de memoria.</w:t>
+      </w:r>
+    </w:p>
+    <w:p>
+      <w:pPr>
+        <w:spacing w:after="60"/>
+      </w:pPr>
+      <w:r>
+        <w:rPr>
+          <w:b w:val="0"/>
+          <w:sz w:val="24"/>
+        </w:rPr>
+        <w:t>La modalidad NO cambia la beca: solo cambia cuántas cuotas caben, porque el estudiante termina de pagar antes de terminar el programa. Menos cuotas que el máximo siempre se puede — y paga menos interés. Más cuotas que el máximo, nunca.</w:t>
       </w:r>
     </w:p>
     <w:p>
@@ -2898,7 +2959,7 @@
           <w:b w:val="0"/>
           <w:sz w:val="24"/>
         </w:rPr>
-        <w:t>Niveles sueltos: SIN beca del Fondo — aplican descuento por forma de pago (contado 20% · cuotas 10% + interés · Cajasan 30%). El sabatino solo se vende por nivel suelto.</w:t>
+        <w:t>Niveles sueltos: SIN beca del Fondo — el precio depende de la forma de pago (contado 20% menos · cuotas 10% menos + interés · afiliado Cajasan 30% menos). Se dice "precio de contado", nunca "descuento". El sabatino solo se vende por nivel suelto.</w:t>
       </w:r>
     </w:p>
     <w:p>
@@ -3361,7 +3422,7 @@
           <w:b w:val="0"/>
           <w:sz w:val="24"/>
         </w:rPr>
-        <w:t>El precio full NUNCA cambia — la beca lo baja según la celda. "Cuotas" es el precio BASE si paga a cuotas; los intereses del crédito directo van aparte (abajo).</w:t>
+        <w:t>El precio full NUNCA cambia — la beca lo baja según la celda. "Cuotas" es el precio BASE si paga a cuotas, SIN interés; el interés del crédito directo se suma en la tabla de cuota tipo (abajo). Al cliente se le da el plan completo: inicial + número de cuotas + valor de cada cuota.</w:t>
       </w:r>
     </w:p>
     <w:p>

</xml_diff>

<commit_message>
Sin recargo por tarjeta de credito en ningun documento (la ley no lo permite): tarjeta = contado con beca de contado. Kit, aclaracion, hoja de llamadas, respuesta a Paula (generador) y contrato v2
Co-Authored-By: Claude Fable 5.1 <noreply@anthropic.com>
</commit_message>
<xml_diff>
--- a/recursos/comercial/INDUCCION_COMERCIAL/KIT_DE_VENTA_ASESORAS.docx
+++ b/recursos/comercial/INDUCCION_COMERCIAL/KIT_DE_VENTA_ASESORAS.docx
@@ -3541,10 +3541,10 @@
       </w:pPr>
       <w:r>
         <w:rPr>
-          <w:b/>
+          <w:b w:val="0"/>
           <w:sz w:val="24"/>
         </w:rPr>
-        <w:t>4. TARJETA DE CRÉDITO del cliente: cuenta como pago de contado y él difiere con su banco, PERO el valor a pagar aumenta 5% por el costo del uso de la tarjeta. Se dice antes de pasarla, siempre: "por tarjeta de crédito el valor sube un 5% por el costo de la transacción — por transferencia o débito no tiene ese recargo."</w:t>
+        <w:t>4. TARJETA DE CRÉDITO del cliente: cuenta como pago de contado (aplica la beca de contado) y él difiere con su banco. No se cobra ningún recargo por pagar con tarjeta: la ley no lo permite.</w:t>
       </w:r>
     </w:p>
     <w:p>

</xml_diff>

<commit_message>
Regla #10: libros (A1, A2, B1) incluidos solo si separa el cupo el mismo dia de la asesoria; aplica a Arranque, completo y nivel individual. En kit, hoja de llamadas, dudas, base LaHaus (cambio 28) y hoja del cliente
Co-Authored-By: Claude Fable 5.1 <noreply@anthropic.com>
</commit_message>
<xml_diff>
--- a/recursos/comercial/INDUCCION_COMERCIAL/KIT_DE_VENTA_ASESORAS.docx
+++ b/recursos/comercial/INDUCCION_COMERCIAL/KIT_DE_VENTA_ASESORAS.docx
@@ -441,7 +441,7 @@
               <w:rPr>
                 <w:sz w:val="23"/>
               </w:rPr>
-              <w:t>Incluye: 2 niveles completos (200 horas), libros, certificado por nivel, garantía escrita y Módulo de Graduación al terminar A2 — a ELECCIÓN (ver abajo).</w:t>
+              <w:t>Incluye: 2 niveles completos (200 horas), certificado por nivel, garantía escrita y Módulo de Graduación al terminar A2 — a ELECCIÓN (ver abajo). LIBROS INCLUIDOS solo si separa el cupo el MISMO DÍA de la asesoría (gancho de cierre, ver abajo).</w:t>
             </w:r>
           </w:p>
         </w:tc>
@@ -698,6 +698,31 @@
           <w:sz w:val="24"/>
         </w:rPr>
         <w:t>· Y para ti: la comisión sigue a la plata. Si un grupo no abre y un abono se devuelve, esa comisión se descuenta como cualquier devolución. Por eso tu juego es completar UN grupo rápido: es la forma de que la plata se quede. El contador es tu cierre: "a la noche le faltan 2 para abrir — tu abono de hoy es el que la abre".</w:t>
+      </w:r>
+    </w:p>
+    <w:p>
+      <w:pPr>
+        <w:spacing w:before="140" w:after="60"/>
+      </w:pPr>
+      <w:r>
+        <w:rPr>
+          <w:b/>
+          <w:color w:val="222222"/>
+          <w:sz w:val="27"/>
+        </w:rPr>
+        <w:t>EL GANCHO DE CIERRE: los libros (regla desde 25/09/2026)</w:t>
+      </w:r>
+    </w:p>
+    <w:p>
+      <w:pPr>
+        <w:spacing w:after="60"/>
+      </w:pPr>
+      <w:r>
+        <w:rPr>
+          <w:b/>
+          <w:sz w:val="24"/>
+        </w:rPr>
+        <w:t>Los libros de A1, A2 y B1 van INCLUIDOS únicamente si el cliente separa su cupo ($300.000) el MISMO DÍA de la asesoría. Aplica igual al Arranque, al programa completo y al nivel individual. Si separa después, los libros se compran aparte al precio vigente. Se dice al cerrar, nunca al abrir: "Si aseguras tu cupo hoy, los libros van incluidos; después se compran aparte."</w:t>
       </w:r>
     </w:p>
     <w:p>

</xml_diff>